<commit_message>
Ibdaa form v12: experimental design (control group + groups A–D), 5-policy independent variable, load notebook, same-circuit computer test, engineering drawing (fig 3)
Co-Authored-By: Claude Fable 5.1 <noreply@anthropic.com>
Claude-Session: https://claude.ai/code/session_013B4LPWZWgdrx1XoL9LPLxx
</commit_message>
<xml_diff>
--- a/docs/qacrs/form_drafts/IBDAA_2027_FORM_ACRS_v12.docx
+++ b/docs/qacrs/form_drafts/IBDAA_2027_FORM_ACRS_v12.docx
@@ -7714,6 +7714,198 @@
               <w:t xml:space="preserve"> أو الموازنة بين الأمن والخدمة أفكار جديدة، ولا أن للحاسوب الكمّي تفوقًا على الحل الكلاسيكي.</w:t>
             </w:r>
           </w:p>
+          <w:p>
+            <w:pPr>
+              <w:keepNext/>
+              <w:spacing w:before="80" w:after="20"/>
+              <w:jc w:val="center"/>
+            </w:pPr>
+            <w:r>
+              <w:drawing>
+                <wp:inline distT="0" distB="0" distL="0" distR="0">
+                  <wp:extent cx="5900000" cy="3003636"/>
+                  <wp:docPr id="9001" name="Figure 1" descr="شكل 3: الرسم الهندسي للنظام — عشرة مكوّنات وواجهاتها، وما يُقاس عند كل واجهة، ومنصّات الاختبار الأربع التي تُختبر عليها «الدائرة» نفسها"/>
+                  <wp:cNvGraphicFramePr>
+                    <a:graphicFrameLocks xmlns:a="http://schemas.openxmlformats.org/drawingml/2006/main" noChangeAspect="1"/>
+                  </wp:cNvGraphicFramePr>
+                  <a:graphic xmlns:a="http://schemas.openxmlformats.org/drawingml/2006/main">
+                    <a:graphicData uri="http://schemas.openxmlformats.org/drawingml/2006/picture">
+                      <pic:pic xmlns:pic="http://schemas.openxmlformats.org/drawingml/2006/picture">
+                        <pic:nvPicPr>
+                          <pic:cNvPr id="9001" name="hassan_fig_c.png"/>
+                          <pic:cNvPicPr/>
+                        </pic:nvPicPr>
+                        <pic:blipFill>
+                          <a:blip r:embed="rIdHassanFig1"/>
+                          <a:stretch>
+                            <a:fillRect/>
+                          </a:stretch>
+                        </pic:blipFill>
+                        <pic:spPr>
+                          <a:xfrm>
+                            <a:off x="0" y="0"/>
+                            <a:ext cx="5900000" cy="3003636"/>
+                          </a:xfrm>
+                          <a:prstGeom prst="rect">
+                            <a:avLst/>
+                          </a:prstGeom>
+                        </pic:spPr>
+                      </pic:pic>
+                    </a:graphicData>
+                  </a:graphic>
+                </wp:inline>
+              </w:drawing>
+            </w:r>
+          </w:p>
+          <w:p>
+            <w:pPr>
+              <w:bidi/>
+              <w:spacing w:after="120" w:line="300" w:lineRule="auto"/>
+              <w:jc w:val="center"/>
+              <w:rPr>
+                <w:rFonts w:ascii="Arial" w:hAnsi="Arial" w:cs="Arial"/>
+                <w:sz w:val="18"/>
+                <w:szCs w:val="18"/>
+                <w:rtl/>
+              </w:rPr>
+            </w:pPr>
+            <w:r>
+              <w:rPr>
+                <w:rFonts w:ascii="Arial" w:hAnsi="Arial" w:cs="Arial"/>
+                <w:color w:val="555555"/>
+                <w:sz w:val="18"/>
+                <w:szCs w:val="18"/>
+                <w:rtl/>
+              </w:rPr>
+              <w:t xml:space="preserve">شكل </w:t>
+            </w:r>
+            <w:r>
+              <w:rPr>
+                <w:rFonts w:ascii="Arial" w:hAnsi="Arial" w:cs="Arial"/>
+                <w:color w:val="555555"/>
+                <w:sz w:val="18"/>
+                <w:szCs w:val="18"/>
+              </w:rPr>
+              <w:t xml:space="preserve">3</w:t>
+            </w:r>
+            <w:r>
+              <w:rPr>
+                <w:rFonts w:ascii="Arial" w:hAnsi="Arial" w:cs="Arial"/>
+                <w:color w:val="555555"/>
+                <w:sz w:val="18"/>
+                <w:szCs w:val="18"/>
+                <w:rtl/>
+              </w:rPr>
+              <w:t xml:space="preserve">: الرسم الهندسي للنظام — عشرة مكوّنات وواجهاتها، وما يُقاس عند كل واجهة، ومنصّات الاختبار الأربع التي تُختبر عليها «الدائرة» نفسها</w:t>
+            </w:r>
+          </w:p>
+          <w:p>
+            <w:pPr>
+              <w:bidi/>
+              <w:spacing w:after="100" w:line="300" w:lineRule="auto"/>
+              <w:jc w:val="both"/>
+              <w:rPr>
+                <w:rFonts w:ascii="Arial" w:hAnsi="Arial" w:cs="Arial"/>
+                <w:sz w:val="22"/>
+                <w:szCs w:val="22"/>
+                <w:rtl/>
+              </w:rPr>
+            </w:pPr>
+            <w:r>
+              <w:rPr>
+                <w:rFonts w:ascii="Arial" w:hAnsi="Arial" w:cs="Arial"/>
+                <w:sz w:val="22"/>
+                <w:szCs w:val="22"/>
+                <w:rtl/>
+              </w:rPr>
+              <w:t xml:space="preserve">الحماية هنا على مستويين: حماية الشبكة التي يقررها النظام (المكوّنات </w:t>
+            </w:r>
+            <w:r>
+              <w:rPr>
+                <w:rFonts w:ascii="Arial" w:hAnsi="Arial" w:cs="Arial"/>
+                <w:sz w:val="22"/>
+                <w:szCs w:val="22"/>
+              </w:rPr>
+              <w:t xml:space="preserve">3–6)</w:t>
+            </w:r>
+            <w:r>
+              <w:rPr>
+                <w:rFonts w:ascii="Arial" w:hAnsi="Arial" w:cs="Arial"/>
+                <w:sz w:val="22"/>
+                <w:szCs w:val="22"/>
+                <w:rtl/>
+              </w:rPr>
+              <w:t xml:space="preserve">، وحماية النظام نفسه من أن يصبح سلاحًا (المكوّنات </w:t>
+            </w:r>
+            <w:r>
+              <w:rPr>
+                <w:rFonts w:ascii="Arial" w:hAnsi="Arial" w:cs="Arial"/>
+                <w:sz w:val="22"/>
+                <w:szCs w:val="22"/>
+              </w:rPr>
+              <w:t xml:space="preserve">5</w:t>
+            </w:r>
+            <w:r>
+              <w:rPr>
+                <w:rFonts w:ascii="Arial" w:hAnsi="Arial" w:cs="Arial"/>
+                <w:sz w:val="22"/>
+                <w:szCs w:val="22"/>
+                <w:rtl/>
+              </w:rPr>
+              <w:t xml:space="preserve"> و</w:t>
+            </w:r>
+            <w:r>
+              <w:rPr>
+                <w:rFonts w:ascii="Arial" w:hAnsi="Arial" w:cs="Arial"/>
+                <w:sz w:val="22"/>
+                <w:szCs w:val="22"/>
+              </w:rPr>
+              <w:t xml:space="preserve">7</w:t>
+            </w:r>
+            <w:r>
+              <w:rPr>
+                <w:rFonts w:ascii="Arial" w:hAnsi="Arial" w:cs="Arial"/>
+                <w:sz w:val="22"/>
+                <w:szCs w:val="22"/>
+                <w:rtl/>
+              </w:rPr>
+              <w:t xml:space="preserve"> و</w:t>
+            </w:r>
+            <w:r>
+              <w:rPr>
+                <w:rFonts w:ascii="Arial" w:hAnsi="Arial" w:cs="Arial"/>
+                <w:sz w:val="22"/>
+                <w:szCs w:val="22"/>
+              </w:rPr>
+              <w:t xml:space="preserve">8</w:t>
+            </w:r>
+            <w:r>
+              <w:rPr>
+                <w:rFonts w:ascii="Arial" w:hAnsi="Arial" w:cs="Arial"/>
+                <w:sz w:val="22"/>
+                <w:szCs w:val="22"/>
+                <w:rtl/>
+              </w:rPr>
+              <w:t xml:space="preserve"> و</w:t>
+            </w:r>
+            <w:r>
+              <w:rPr>
+                <w:rFonts w:ascii="Arial" w:hAnsi="Arial" w:cs="Arial"/>
+                <w:sz w:val="22"/>
+                <w:szCs w:val="22"/>
+              </w:rPr>
+              <w:t xml:space="preserve">9</w:t>
+            </w:r>
+            <w:r>
+              <w:rPr>
+                <w:rFonts w:ascii="Arial" w:hAnsi="Arial" w:cs="Arial"/>
+                <w:sz w:val="22"/>
+                <w:szCs w:val="22"/>
+                <w:rtl/>
+              </w:rPr>
+              <w:t xml:space="preserve">: بوابة لا تتغيّر، توأم يرفض الخطة المعطوبة، شهادة موقّعة بخوارزمية ما بعد الكمّ، وطرفية لا تنفّذ أمرًا يكسر قاعدة).</w:t>
+            </w:r>
+          </w:p>
         </w:tc>
       </w:tr>
     </w:tbl>
@@ -8535,6 +8727,914 @@
                 <w:sz w:val="22"/>
                 <w:szCs w:val="22"/>
               </w:rPr>
+              <w:t xml:space="preserve">1</w:t>
+            </w:r>
+            <w:r>
+              <w:rPr>
+                <w:rFonts w:ascii="Arial" w:hAnsi="Arial" w:cs="Arial"/>
+                <w:b/>
+                <w:bCs/>
+                <w:sz w:val="22"/>
+                <w:szCs w:val="22"/>
+                <w:rtl/>
+              </w:rPr>
+              <w:t xml:space="preserve">-ب. تصميم التجربة: المجموعات.</w:t>
+            </w:r>
+            <w:r>
+              <w:rPr>
+                <w:rFonts w:ascii="Arial" w:hAnsi="Arial" w:cs="Arial"/>
+                <w:sz w:val="22"/>
+                <w:szCs w:val="22"/>
+                <w:rtl/>
+              </w:rPr>
+              <w:t xml:space="preserve"> المجموعة الضابطة لا تخضع لأي حماية: الهجوم نفسه يُشغَّل بلا قرار (ولا تُحسب لها الخدمات المتوقفة بل الخطر المتبقي والمسارات المفتوحة إلى الخوادم الحرجة). وتُقارن بها أربع مجموعات تجريبية على السيناريوهات نفسها:</w:t>
+            </w:r>
+          </w:p>
+          <w:tbl>
+            <w:tblPr>
+              <w:bidiVisual/>
+              <w:tblW w:w="9800" w:type="dxa"/>
+              <w:tblBorders>
+                <w:top w:val="single" w:sz="4" w:space="0" w:color="BFBFBF"/>
+                <w:left w:val="single" w:sz="4" w:space="0" w:color="BFBFBF"/>
+                <w:bottom w:val="single" w:sz="4" w:space="0" w:color="BFBFBF"/>
+                <w:right w:val="single" w:sz="4" w:space="0" w:color="BFBFBF"/>
+                <w:insideH w:val="single" w:sz="4" w:space="0" w:color="BFBFBF"/>
+                <w:insideV w:val="single" w:sz="4" w:space="0" w:color="BFBFBF"/>
+              </w:tblBorders>
+              <w:tblLayout w:type="fixed"/>
+              <w:tblCellMar>
+                <w:top w:w="40" w:type="dxa"/>
+                <w:start w:w="80" w:type="dxa"/>
+                <w:bottom w:w="40" w:type="dxa"/>
+                <w:end w:w="80" w:type="dxa"/>
+              </w:tblCellMar>
+            </w:tblPr>
+            <w:tblGrid>
+              <w:gridCol w:w="1400"/>
+              <w:gridCol w:w="3400"/>
+              <w:gridCol w:w="2200"/>
+              <w:gridCol w:w="2800"/>
+            </w:tblGrid>
+            <w:tr>
+              <w:trPr>
+                <w:tblHeader/>
+                <w:cantSplit/>
+              </w:trPr>
+              <w:tc>
+                <w:tcPr>
+                  <w:tcW w:w="1400" w:type="dxa"/>
+                  <w:shd w:val="clear" w:color="auto" w:fill="E8EEF3"/>
+                </w:tcPr>
+                <w:p>
+                  <w:pPr>
+                    <w:bidi/>
+                    <w:spacing w:after="0" w:line="300" w:lineRule="auto"/>
+                    <w:jc w:val="start"/>
+                    <w:rPr>
+                      <w:rFonts w:ascii="Arial" w:hAnsi="Arial" w:cs="Arial"/>
+                      <w:sz w:val="19"/>
+                      <w:szCs w:val="19"/>
+                      <w:rtl/>
+                    </w:rPr>
+                  </w:pPr>
+                  <w:r>
+                    <w:rPr>
+                      <w:rFonts w:ascii="Arial" w:hAnsi="Arial" w:cs="Arial"/>
+                      <w:b/>
+                      <w:bCs/>
+                      <w:sz w:val="19"/>
+                      <w:szCs w:val="19"/>
+                      <w:rtl/>
+                    </w:rPr>
+                    <w:t xml:space="preserve">المجموعة</w:t>
+                  </w:r>
+                </w:p>
+              </w:tc>
+              <w:tc>
+                <w:tcPr>
+                  <w:tcW w:w="3400" w:type="dxa"/>
+                  <w:shd w:val="clear" w:color="auto" w:fill="E8EEF3"/>
+                </w:tcPr>
+                <w:p>
+                  <w:pPr>
+                    <w:bidi/>
+                    <w:spacing w:after="0" w:line="300" w:lineRule="auto"/>
+                    <w:jc w:val="start"/>
+                    <w:rPr>
+                      <w:rFonts w:ascii="Arial" w:hAnsi="Arial" w:cs="Arial"/>
+                      <w:sz w:val="19"/>
+                      <w:szCs w:val="19"/>
+                      <w:rtl/>
+                    </w:rPr>
+                  </w:pPr>
+                  <w:r>
+                    <w:rPr>
+                      <w:rFonts w:ascii="Arial" w:hAnsi="Arial" w:cs="Arial"/>
+                      <w:b/>
+                      <w:bCs/>
+                      <w:sz w:val="19"/>
+                      <w:szCs w:val="19"/>
+                      <w:rtl/>
+                    </w:rPr>
+                    <w:t xml:space="preserve">ما يُختبر</w:t>
+                  </w:r>
+                </w:p>
+              </w:tc>
+              <w:tc>
+                <w:tcPr>
+                  <w:tcW w:w="2200" w:type="dxa"/>
+                  <w:shd w:val="clear" w:color="auto" w:fill="E8EEF3"/>
+                </w:tcPr>
+                <w:p>
+                  <w:pPr>
+                    <w:bidi/>
+                    <w:spacing w:after="0" w:line="300" w:lineRule="auto"/>
+                    <w:jc w:val="start"/>
+                    <w:rPr>
+                      <w:rFonts w:ascii="Arial" w:hAnsi="Arial" w:cs="Arial"/>
+                      <w:sz w:val="19"/>
+                      <w:szCs w:val="19"/>
+                      <w:rtl/>
+                    </w:rPr>
+                  </w:pPr>
+                  <w:r>
+                    <w:rPr>
+                      <w:rFonts w:ascii="Arial" w:hAnsi="Arial" w:cs="Arial"/>
+                      <w:b/>
+                      <w:bCs/>
+                      <w:sz w:val="19"/>
+                      <w:szCs w:val="19"/>
+                      <w:rtl/>
+                    </w:rPr>
+                    <w:t xml:space="preserve">منصّة الاختبار</w:t>
+                  </w:r>
+                </w:p>
+              </w:tc>
+              <w:tc>
+                <w:tcPr>
+                  <w:tcW w:w="2800" w:type="dxa"/>
+                  <w:shd w:val="clear" w:color="auto" w:fill="E8EEF3"/>
+                </w:tcPr>
+                <w:p>
+                  <w:pPr>
+                    <w:bidi/>
+                    <w:spacing w:after="0" w:line="300" w:lineRule="auto"/>
+                    <w:jc w:val="start"/>
+                    <w:rPr>
+                      <w:rFonts w:ascii="Arial" w:hAnsi="Arial" w:cs="Arial"/>
+                      <w:sz w:val="19"/>
+                      <w:szCs w:val="19"/>
+                      <w:rtl/>
+                    </w:rPr>
+                  </w:pPr>
+                  <w:r>
+                    <w:rPr>
+                      <w:rFonts w:ascii="Arial" w:hAnsi="Arial" w:cs="Arial"/>
+                      <w:b/>
+                      <w:bCs/>
+                      <w:sz w:val="19"/>
+                      <w:szCs w:val="19"/>
+                      <w:rtl/>
+                    </w:rPr>
+                    <w:t xml:space="preserve">ما يُقاس</w:t>
+                  </w:r>
+                </w:p>
+              </w:tc>
+            </w:tr>
+            <w:tr>
+              <w:trPr>
+                <w:cantSplit/>
+              </w:trPr>
+              <w:tc>
+                <w:tcPr>
+                  <w:tcW w:w="1400" w:type="dxa"/>
+                </w:tcPr>
+                <w:p>
+                  <w:pPr>
+                    <w:bidi/>
+                    <w:spacing w:after="0" w:line="300" w:lineRule="auto"/>
+                    <w:jc w:val="start"/>
+                    <w:rPr>
+                      <w:rFonts w:ascii="Arial" w:hAnsi="Arial" w:cs="Arial"/>
+                      <w:sz w:val="19"/>
+                      <w:szCs w:val="19"/>
+                      <w:rtl/>
+                    </w:rPr>
+                  </w:pPr>
+                  <w:r>
+                    <w:rPr>
+                      <w:rFonts w:ascii="Arial" w:hAnsi="Arial" w:cs="Arial"/>
+                      <w:sz w:val="19"/>
+                      <w:szCs w:val="19"/>
+                      <w:rtl/>
+                    </w:rPr>
+                    <w:t xml:space="preserve">الضابطة</w:t>
+                  </w:r>
+                </w:p>
+              </w:tc>
+              <w:tc>
+                <w:tcPr>
+                  <w:tcW w:w="3400" w:type="dxa"/>
+                </w:tcPr>
+                <w:p>
+                  <w:pPr>
+                    <w:bidi/>
+                    <w:spacing w:after="0" w:line="300" w:lineRule="auto"/>
+                    <w:jc w:val="start"/>
+                    <w:rPr>
+                      <w:rFonts w:ascii="Arial" w:hAnsi="Arial" w:cs="Arial"/>
+                      <w:sz w:val="19"/>
+                      <w:szCs w:val="19"/>
+                      <w:rtl/>
+                    </w:rPr>
+                  </w:pPr>
+                  <w:r>
+                    <w:rPr>
+                      <w:rFonts w:ascii="Arial" w:hAnsi="Arial" w:cs="Arial"/>
+                      <w:sz w:val="19"/>
+                      <w:szCs w:val="19"/>
+                      <w:rtl/>
+                    </w:rPr>
+                    <w:t xml:space="preserve">بلا حماية (لا قرار)</w:t>
+                  </w:r>
+                </w:p>
+              </w:tc>
+              <w:tc>
+                <w:tcPr>
+                  <w:tcW w:w="2200" w:type="dxa"/>
+                </w:tcPr>
+                <w:p>
+                  <w:pPr>
+                    <w:bidi/>
+                    <w:spacing w:after="0" w:line="300" w:lineRule="auto"/>
+                    <w:jc w:val="start"/>
+                    <w:rPr>
+                      <w:rFonts w:ascii="Arial" w:hAnsi="Arial" w:cs="Arial"/>
+                      <w:sz w:val="19"/>
+                      <w:szCs w:val="19"/>
+                      <w:rtl/>
+                    </w:rPr>
+                  </w:pPr>
+                  <w:r>
+                    <w:rPr>
+                      <w:rFonts w:ascii="Arial" w:hAnsi="Arial" w:cs="Arial"/>
+                      <w:sz w:val="19"/>
+                      <w:szCs w:val="19"/>
+                      <w:rtl/>
+                    </w:rPr>
+                    <w:t xml:space="preserve">محاكاة</w:t>
+                  </w:r>
+                </w:p>
+              </w:tc>
+              <w:tc>
+                <w:tcPr>
+                  <w:tcW w:w="2800" w:type="dxa"/>
+                </w:tcPr>
+                <w:p>
+                  <w:pPr>
+                    <w:bidi/>
+                    <w:spacing w:after="0" w:line="300" w:lineRule="auto"/>
+                    <w:jc w:val="start"/>
+                    <w:rPr>
+                      <w:rFonts w:ascii="Arial" w:hAnsi="Arial" w:cs="Arial"/>
+                      <w:sz w:val="19"/>
+                      <w:szCs w:val="19"/>
+                      <w:rtl/>
+                    </w:rPr>
+                  </w:pPr>
+                  <w:r>
+                    <w:rPr>
+                      <w:rFonts w:ascii="Arial" w:hAnsi="Arial" w:cs="Arial"/>
+                      <w:sz w:val="19"/>
+                      <w:szCs w:val="19"/>
+                      <w:rtl/>
+                    </w:rPr>
+                    <w:t xml:space="preserve">الخطر المتبقي والمسارات المفتوحة إلى الخوادم الحرجة</w:t>
+                  </w:r>
+                </w:p>
+              </w:tc>
+            </w:tr>
+            <w:tr>
+              <w:trPr>
+                <w:cantSplit/>
+              </w:trPr>
+              <w:tc>
+                <w:tcPr>
+                  <w:tcW w:w="1400" w:type="dxa"/>
+                </w:tcPr>
+                <w:p>
+                  <w:pPr>
+                    <w:bidi/>
+                    <w:spacing w:after="0" w:line="300" w:lineRule="auto"/>
+                    <w:jc w:val="start"/>
+                    <w:rPr>
+                      <w:rFonts w:ascii="Arial" w:hAnsi="Arial" w:cs="Arial"/>
+                      <w:sz w:val="19"/>
+                      <w:szCs w:val="19"/>
+                      <w:rtl/>
+                    </w:rPr>
+                  </w:pPr>
+                  <w:r>
+                    <w:rPr>
+                      <w:rFonts w:ascii="Arial" w:hAnsi="Arial" w:cs="Arial"/>
+                      <w:sz w:val="19"/>
+                      <w:szCs w:val="19"/>
+                      <w:rtl/>
+                    </w:rPr>
+                    <w:t xml:space="preserve">أ</w:t>
+                  </w:r>
+                </w:p>
+              </w:tc>
+              <w:tc>
+                <w:tcPr>
+                  <w:tcW w:w="3400" w:type="dxa"/>
+                </w:tcPr>
+                <w:p>
+                  <w:pPr>
+                    <w:bidi/>
+                    <w:spacing w:after="0" w:line="300" w:lineRule="auto"/>
+                    <w:jc w:val="start"/>
+                    <w:rPr>
+                      <w:rFonts w:ascii="Arial" w:hAnsi="Arial" w:cs="Arial"/>
+                      <w:sz w:val="19"/>
+                      <w:szCs w:val="19"/>
+                      <w:rtl/>
+                    </w:rPr>
+                  </w:pPr>
+                  <w:r>
+                    <w:rPr>
+                      <w:rFonts w:ascii="Arial" w:hAnsi="Arial" w:cs="Arial"/>
+                      <w:sz w:val="19"/>
+                      <w:szCs w:val="19"/>
+                      <w:rtl/>
+                    </w:rPr>
+                    <w:t xml:space="preserve">سياسات القرار الأربع المقارنة: العزل الكامل الآمن، القاعدة البسيطة، عزل كل جهاز مُنبَّه عليه، </w:t>
+                  </w:r>
+                  <w:r>
+                    <w:rPr>
+                      <w:rFonts w:ascii="Arial" w:hAnsi="Arial" w:cs="Arial"/>
+                      <w:sz w:val="19"/>
+                      <w:szCs w:val="19"/>
+                    </w:rPr>
+                    <w:t xml:space="preserve">ACRS</w:t>
+                  </w:r>
+                </w:p>
+              </w:tc>
+              <w:tc>
+                <w:tcPr>
+                  <w:tcW w:w="2200" w:type="dxa"/>
+                </w:tcPr>
+                <w:p>
+                  <w:pPr>
+                    <w:bidi/>
+                    <w:spacing w:after="0" w:line="300" w:lineRule="auto"/>
+                    <w:jc w:val="start"/>
+                    <w:rPr>
+                      <w:rFonts w:ascii="Arial" w:hAnsi="Arial" w:cs="Arial"/>
+                      <w:sz w:val="19"/>
+                      <w:szCs w:val="19"/>
+                      <w:rtl/>
+                    </w:rPr>
+                  </w:pPr>
+                  <w:r>
+                    <w:rPr>
+                      <w:rFonts w:ascii="Arial" w:hAnsi="Arial" w:cs="Arial"/>
+                      <w:sz w:val="19"/>
+                      <w:szCs w:val="19"/>
+                      <w:rtl/>
+                    </w:rPr>
+                    <w:t xml:space="preserve">محاكاة (</w:t>
+                  </w:r>
+                  <w:r>
+                    <w:rPr>
+                      <w:rFonts w:ascii="Arial" w:hAnsi="Arial" w:cs="Arial"/>
+                      <w:sz w:val="19"/>
+                      <w:szCs w:val="19"/>
+                    </w:rPr>
+                    <w:t xml:space="preserve">4,000</w:t>
+                  </w:r>
+                  <w:r>
+                    <w:rPr>
+                      <w:rFonts w:ascii="Arial" w:hAnsi="Arial" w:cs="Arial"/>
+                      <w:sz w:val="19"/>
+                      <w:szCs w:val="19"/>
+                      <w:rtl/>
+                    </w:rPr>
+                    <w:t xml:space="preserve">+ تركيبي، </w:t>
+                  </w:r>
+                  <w:r>
+                    <w:rPr>
+                      <w:rFonts w:ascii="Arial" w:hAnsi="Arial" w:cs="Arial"/>
+                      <w:sz w:val="19"/>
+                      <w:szCs w:val="19"/>
+                    </w:rPr>
+                    <w:t xml:space="preserve">894</w:t>
+                  </w:r>
+                  <w:r>
+                    <w:rPr>
+                      <w:rFonts w:ascii="Arial" w:hAnsi="Arial" w:cs="Arial"/>
+                      <w:sz w:val="19"/>
+                      <w:szCs w:val="19"/>
+                      <w:rtl/>
+                    </w:rPr>
+                    <w:t xml:space="preserve"> واقعي)</w:t>
+                  </w:r>
+                </w:p>
+              </w:tc>
+              <w:tc>
+                <w:tcPr>
+                  <w:tcW w:w="2800" w:type="dxa"/>
+                </w:tcPr>
+                <w:p>
+                  <w:pPr>
+                    <w:bidi/>
+                    <w:spacing w:after="0" w:line="300" w:lineRule="auto"/>
+                    <w:jc w:val="start"/>
+                    <w:rPr>
+                      <w:rFonts w:ascii="Arial" w:hAnsi="Arial" w:cs="Arial"/>
+                      <w:sz w:val="19"/>
+                      <w:szCs w:val="19"/>
+                      <w:rtl/>
+                    </w:rPr>
+                  </w:pPr>
+                  <w:r>
+                    <w:rPr>
+                      <w:rFonts w:ascii="Arial" w:hAnsi="Arial" w:cs="Arial"/>
+                      <w:sz w:val="19"/>
+                      <w:szCs w:val="19"/>
+                      <w:rtl/>
+                    </w:rPr>
+                    <w:t xml:space="preserve">الاحتواء، الخدمات المتوقفة بعد الموافقات، الفشل الصامت، غير الآمن</w:t>
+                  </w:r>
+                </w:p>
+              </w:tc>
+            </w:tr>
+            <w:tr>
+              <w:trPr>
+                <w:cantSplit/>
+              </w:trPr>
+              <w:tc>
+                <w:tcPr>
+                  <w:tcW w:w="1400" w:type="dxa"/>
+                </w:tcPr>
+                <w:p>
+                  <w:pPr>
+                    <w:bidi/>
+                    <w:spacing w:after="0" w:line="300" w:lineRule="auto"/>
+                    <w:jc w:val="start"/>
+                    <w:rPr>
+                      <w:rFonts w:ascii="Arial" w:hAnsi="Arial" w:cs="Arial"/>
+                      <w:sz w:val="19"/>
+                      <w:szCs w:val="19"/>
+                      <w:rtl/>
+                    </w:rPr>
+                  </w:pPr>
+                  <w:r>
+                    <w:rPr>
+                      <w:rFonts w:ascii="Arial" w:hAnsi="Arial" w:cs="Arial"/>
+                      <w:sz w:val="19"/>
+                      <w:szCs w:val="19"/>
+                      <w:rtl/>
+                    </w:rPr>
+                    <w:t xml:space="preserve">ب</w:t>
+                  </w:r>
+                </w:p>
+              </w:tc>
+              <w:tc>
+                <w:tcPr>
+                  <w:tcW w:w="3400" w:type="dxa"/>
+                </w:tcPr>
+                <w:p>
+                  <w:pPr>
+                    <w:bidi/>
+                    <w:spacing w:after="0" w:line="300" w:lineRule="auto"/>
+                    <w:jc w:val="start"/>
+                    <w:rPr>
+                      <w:rFonts w:ascii="Arial" w:hAnsi="Arial" w:cs="Arial"/>
+                      <w:sz w:val="19"/>
+                      <w:szCs w:val="19"/>
+                      <w:rtl/>
+                    </w:rPr>
+                  </w:pPr>
+                  <w:r>
+                    <w:rPr>
+                      <w:rFonts w:ascii="Arial" w:hAnsi="Arial" w:cs="Arial"/>
+                      <w:sz w:val="19"/>
+                      <w:szCs w:val="19"/>
+                      <w:rtl/>
+                    </w:rPr>
+                    <w:t xml:space="preserve">«الدائرة» نفسها تُختبر حاسوبيًا ثم فعليًا: الخطة ← قواعد </w:t>
+                  </w:r>
+                  <w:r>
+                    <w:rPr>
+                      <w:rFonts w:ascii="Arial" w:hAnsi="Arial" w:cs="Arial"/>
+                      <w:sz w:val="19"/>
+                      <w:szCs w:val="19"/>
+                    </w:rPr>
+                    <w:t xml:space="preserve">iptables</w:t>
+                  </w:r>
+                  <w:r>
+                    <w:rPr>
+                      <w:rFonts w:ascii="Arial" w:hAnsi="Arial" w:cs="Arial"/>
+                      <w:sz w:val="19"/>
+                      <w:szCs w:val="19"/>
+                      <w:rtl/>
+                    </w:rPr>
+                    <w:t xml:space="preserve"> ← اتصالات </w:t>
+                  </w:r>
+                  <w:r>
+                    <w:rPr>
+                      <w:rFonts w:ascii="Arial" w:hAnsi="Arial" w:cs="Arial"/>
+                      <w:sz w:val="19"/>
+                      <w:szCs w:val="19"/>
+                    </w:rPr>
+                    <w:t xml:space="preserve">TCP</w:t>
+                  </w:r>
+                  <w:r>
+                    <w:rPr>
+                      <w:rFonts w:ascii="Arial" w:hAnsi="Arial" w:cs="Arial"/>
+                      <w:sz w:val="19"/>
+                      <w:szCs w:val="19"/>
+                      <w:rtl/>
+                    </w:rPr>
+                    <w:t xml:space="preserve"> حقيقية ← مقارنة بالنموذج</w:t>
+                  </w:r>
+                </w:p>
+              </w:tc>
+              <w:tc>
+                <w:tcPr>
+                  <w:tcW w:w="2200" w:type="dxa"/>
+                </w:tcPr>
+                <w:p>
+                  <w:pPr>
+                    <w:bidi/>
+                    <w:spacing w:after="0" w:line="300" w:lineRule="auto"/>
+                    <w:jc w:val="start"/>
+                    <w:rPr>
+                      <w:rFonts w:ascii="Arial" w:hAnsi="Arial" w:cs="Arial"/>
+                      <w:sz w:val="19"/>
+                      <w:szCs w:val="19"/>
+                      <w:rtl/>
+                    </w:rPr>
+                  </w:pPr>
+                  <w:r>
+                    <w:rPr>
+                      <w:rFonts w:ascii="Arial" w:hAnsi="Arial" w:cs="Arial"/>
+                      <w:sz w:val="19"/>
+                      <w:szCs w:val="19"/>
+                      <w:rtl/>
+                    </w:rPr>
+                    <w:t xml:space="preserve">نواة </w:t>
+                  </w:r>
+                  <w:r>
+                    <w:rPr>
+                      <w:rFonts w:ascii="Arial" w:hAnsi="Arial" w:cs="Arial"/>
+                      <w:sz w:val="19"/>
+                      <w:szCs w:val="19"/>
+                    </w:rPr>
+                    <w:t xml:space="preserve">Linux</w:t>
+                  </w:r>
+                  <w:r>
+                    <w:rPr>
+                      <w:rFonts w:ascii="Arial" w:hAnsi="Arial" w:cs="Arial"/>
+                      <w:sz w:val="19"/>
+                      <w:szCs w:val="19"/>
+                      <w:rtl/>
+                    </w:rPr>
+                    <w:t xml:space="preserve"> (بيئة معزولة)</w:t>
+                  </w:r>
+                </w:p>
+              </w:tc>
+              <w:tc>
+                <w:tcPr>
+                  <w:tcW w:w="2800" w:type="dxa"/>
+                </w:tcPr>
+                <w:p>
+                  <w:pPr>
+                    <w:bidi/>
+                    <w:spacing w:after="0" w:line="300" w:lineRule="auto"/>
+                    <w:jc w:val="start"/>
+                    <w:rPr>
+                      <w:rFonts w:ascii="Arial" w:hAnsi="Arial" w:cs="Arial"/>
+                      <w:sz w:val="19"/>
+                      <w:szCs w:val="19"/>
+                      <w:rtl/>
+                    </w:rPr>
+                  </w:pPr>
+                  <w:r>
+                    <w:rPr>
+                      <w:rFonts w:ascii="Arial" w:hAnsi="Arial" w:cs="Arial"/>
+                      <w:sz w:val="19"/>
+                      <w:szCs w:val="19"/>
+                      <w:rtl/>
+                    </w:rPr>
+                    <w:t xml:space="preserve">تطابق النموذج/المقاس، زمن القطع، التسريب، رفض الخطة المعطوبة</w:t>
+                  </w:r>
+                </w:p>
+              </w:tc>
+            </w:tr>
+            <w:tr>
+              <w:trPr>
+                <w:cantSplit/>
+              </w:trPr>
+              <w:tc>
+                <w:tcPr>
+                  <w:tcW w:w="1400" w:type="dxa"/>
+                </w:tcPr>
+                <w:p>
+                  <w:pPr>
+                    <w:bidi/>
+                    <w:spacing w:after="0" w:line="300" w:lineRule="auto"/>
+                    <w:jc w:val="start"/>
+                    <w:rPr>
+                      <w:rFonts w:ascii="Arial" w:hAnsi="Arial" w:cs="Arial"/>
+                      <w:sz w:val="19"/>
+                      <w:szCs w:val="19"/>
+                      <w:rtl/>
+                    </w:rPr>
+                  </w:pPr>
+                  <w:r>
+                    <w:rPr>
+                      <w:rFonts w:ascii="Arial" w:hAnsi="Arial" w:cs="Arial"/>
+                      <w:sz w:val="19"/>
+                      <w:szCs w:val="19"/>
+                      <w:rtl/>
+                    </w:rPr>
+                    <w:t xml:space="preserve">ج</w:t>
+                  </w:r>
+                </w:p>
+              </w:tc>
+              <w:tc>
+                <w:tcPr>
+                  <w:tcW w:w="3400" w:type="dxa"/>
+                </w:tcPr>
+                <w:p>
+                  <w:pPr>
+                    <w:bidi/>
+                    <w:spacing w:after="0" w:line="300" w:lineRule="auto"/>
+                    <w:jc w:val="start"/>
+                    <w:rPr>
+                      <w:rFonts w:ascii="Arial" w:hAnsi="Arial" w:cs="Arial"/>
+                      <w:sz w:val="19"/>
+                      <w:szCs w:val="19"/>
+                      <w:rtl/>
+                    </w:rPr>
+                  </w:pPr>
+                  <w:r>
+                    <w:rPr>
+                      <w:rFonts w:ascii="Arial" w:hAnsi="Arial" w:cs="Arial"/>
+                      <w:sz w:val="19"/>
+                      <w:szCs w:val="19"/>
+                      <w:rtl/>
+                    </w:rPr>
+                    <w:t xml:space="preserve">القرار نفسه على دارة كمّية</w:t>
+                  </w:r>
+                </w:p>
+              </w:tc>
+              <w:tc>
+                <w:tcPr>
+                  <w:tcW w:w="2200" w:type="dxa"/>
+                </w:tcPr>
+                <w:p>
+                  <w:pPr>
+                    <w:bidi/>
+                    <w:spacing w:after="0" w:line="300" w:lineRule="auto"/>
+                    <w:jc w:val="start"/>
+                    <w:rPr>
+                      <w:rFonts w:ascii="Arial" w:hAnsi="Arial" w:cs="Arial"/>
+                      <w:sz w:val="19"/>
+                      <w:szCs w:val="19"/>
+                      <w:rtl/>
+                    </w:rPr>
+                  </w:pPr>
+                  <w:r>
+                    <w:rPr>
+                      <w:rFonts w:ascii="Arial" w:hAnsi="Arial" w:cs="Arial"/>
+                      <w:sz w:val="19"/>
+                      <w:szCs w:val="19"/>
+                    </w:rPr>
+                    <w:t xml:space="preserve">IBM (156</w:t>
+                  </w:r>
+                  <w:r>
+                    <w:rPr>
+                      <w:rFonts w:ascii="Arial" w:hAnsi="Arial" w:cs="Arial"/>
+                      <w:sz w:val="19"/>
+                      <w:szCs w:val="19"/>
+                      <w:rtl/>
+                    </w:rPr>
+                    <w:t xml:space="preserve"> كيوبت)</w:t>
+                  </w:r>
+                </w:p>
+              </w:tc>
+              <w:tc>
+                <w:tcPr>
+                  <w:tcW w:w="2800" w:type="dxa"/>
+                </w:tcPr>
+                <w:p>
+                  <w:pPr>
+                    <w:bidi/>
+                    <w:spacing w:after="0" w:line="300" w:lineRule="auto"/>
+                    <w:jc w:val="start"/>
+                    <w:rPr>
+                      <w:rFonts w:ascii="Arial" w:hAnsi="Arial" w:cs="Arial"/>
+                      <w:sz w:val="19"/>
+                      <w:szCs w:val="19"/>
+                      <w:rtl/>
+                    </w:rPr>
+                  </w:pPr>
+                  <w:r>
+                    <w:rPr>
+                      <w:rFonts w:ascii="Arial" w:hAnsi="Arial" w:cs="Arial"/>
+                      <w:sz w:val="19"/>
+                      <w:szCs w:val="19"/>
+                      <w:rtl/>
+                    </w:rPr>
+                    <w:t xml:space="preserve">احتمال الأمثل، ونسبة المسائل المحلولة</w:t>
+                  </w:r>
+                </w:p>
+              </w:tc>
+            </w:tr>
+            <w:tr>
+              <w:trPr>
+                <w:cantSplit/>
+              </w:trPr>
+              <w:tc>
+                <w:tcPr>
+                  <w:tcW w:w="1400" w:type="dxa"/>
+                </w:tcPr>
+                <w:p>
+                  <w:pPr>
+                    <w:bidi/>
+                    <w:spacing w:after="0" w:line="300" w:lineRule="auto"/>
+                    <w:jc w:val="start"/>
+                    <w:rPr>
+                      <w:rFonts w:ascii="Arial" w:hAnsi="Arial" w:cs="Arial"/>
+                      <w:sz w:val="19"/>
+                      <w:szCs w:val="19"/>
+                      <w:rtl/>
+                    </w:rPr>
+                  </w:pPr>
+                  <w:r>
+                    <w:rPr>
+                      <w:rFonts w:ascii="Arial" w:hAnsi="Arial" w:cs="Arial"/>
+                      <w:sz w:val="19"/>
+                      <w:szCs w:val="19"/>
+                      <w:rtl/>
+                    </w:rPr>
+                    <w:t xml:space="preserve">د (الابتكار)</w:t>
+                  </w:r>
+                </w:p>
+              </w:tc>
+              <w:tc>
+                <w:tcPr>
+                  <w:tcW w:w="3400" w:type="dxa"/>
+                </w:tcPr>
+                <w:p>
+                  <w:pPr>
+                    <w:bidi/>
+                    <w:spacing w:after="0" w:line="300" w:lineRule="auto"/>
+                    <w:jc w:val="start"/>
+                    <w:rPr>
+                      <w:rFonts w:ascii="Arial" w:hAnsi="Arial" w:cs="Arial"/>
+                      <w:sz w:val="19"/>
+                      <w:szCs w:val="19"/>
+                      <w:rtl/>
+                    </w:rPr>
+                  </w:pPr>
+                  <w:r>
+                    <w:rPr>
+                      <w:rFonts w:ascii="Arial" w:hAnsi="Arial" w:cs="Arial"/>
+                      <w:sz w:val="19"/>
+                      <w:szCs w:val="19"/>
+                      <w:rtl/>
+                    </w:rPr>
+                    <w:t xml:space="preserve">النظام الكامل </w:t>
+                  </w:r>
+                  <w:r>
+                    <w:rPr>
+                      <w:rFonts w:ascii="Arial" w:hAnsi="Arial" w:cs="Arial"/>
+                      <w:sz w:val="19"/>
+                      <w:szCs w:val="19"/>
+                    </w:rPr>
+                    <w:t xml:space="preserve">v12/v13</w:t>
+                  </w:r>
+                  <w:r>
+                    <w:rPr>
+                      <w:rFonts w:ascii="Arial" w:hAnsi="Arial" w:cs="Arial"/>
+                      <w:sz w:val="19"/>
+                      <w:szCs w:val="19"/>
+                      <w:rtl/>
+                    </w:rPr>
+                    <w:t xml:space="preserve"> على هجمات حقيقية</w:t>
+                  </w:r>
+                </w:p>
+              </w:tc>
+              <w:tc>
+                <w:tcPr>
+                  <w:tcW w:w="2200" w:type="dxa"/>
+                </w:tcPr>
+                <w:p>
+                  <w:pPr>
+                    <w:bidi/>
+                    <w:spacing w:after="0" w:line="300" w:lineRule="auto"/>
+                    <w:jc w:val="start"/>
+                    <w:rPr>
+                      <w:rFonts w:ascii="Arial" w:hAnsi="Arial" w:cs="Arial"/>
+                      <w:sz w:val="19"/>
+                      <w:szCs w:val="19"/>
+                      <w:rtl/>
+                    </w:rPr>
+                  </w:pPr>
+                  <w:r>
+                    <w:rPr>
+                      <w:rFonts w:ascii="Arial" w:hAnsi="Arial" w:cs="Arial"/>
+                      <w:sz w:val="19"/>
+                      <w:szCs w:val="19"/>
+                    </w:rPr>
+                    <w:t xml:space="preserve">83</w:t>
+                  </w:r>
+                  <w:r>
+                    <w:rPr>
+                      <w:rFonts w:ascii="Arial" w:hAnsi="Arial" w:cs="Arial"/>
+                      <w:sz w:val="19"/>
+                      <w:szCs w:val="19"/>
+                      <w:rtl/>
+                    </w:rPr>
+                    <w:t xml:space="preserve"> حادثة </w:t>
+                  </w:r>
+                  <w:r>
+                    <w:rPr>
+                      <w:rFonts w:ascii="Arial" w:hAnsi="Arial" w:cs="Arial"/>
+                      <w:sz w:val="19"/>
+                      <w:szCs w:val="19"/>
+                    </w:rPr>
+                    <w:t xml:space="preserve">2013–2026</w:t>
+                  </w:r>
+                </w:p>
+              </w:tc>
+              <w:tc>
+                <w:tcPr>
+                  <w:tcW w:w="2800" w:type="dxa"/>
+                </w:tcPr>
+                <w:p>
+                  <w:pPr>
+                    <w:bidi/>
+                    <w:spacing w:after="0" w:line="300" w:lineRule="auto"/>
+                    <w:jc w:val="start"/>
+                    <w:rPr>
+                      <w:rFonts w:ascii="Arial" w:hAnsi="Arial" w:cs="Arial"/>
+                      <w:sz w:val="19"/>
+                      <w:szCs w:val="19"/>
+                      <w:rtl/>
+                    </w:rPr>
+                  </w:pPr>
+                  <w:r>
+                    <w:rPr>
+                      <w:rFonts w:ascii="Arial" w:hAnsi="Arial" w:cs="Arial"/>
+                      <w:sz w:val="19"/>
+                      <w:szCs w:val="19"/>
+                      <w:rtl/>
+                    </w:rPr>
+                    <w:t xml:space="preserve">كل مقاييس (أ) + البقاء بعد الفشل، الإنعاش، المناعة</w:t>
+                  </w:r>
+                </w:p>
+              </w:tc>
+            </w:tr>
+          </w:tbl>
+          <w:p>
+            <w:pPr>
+              <w:bidi/>
+              <w:spacing w:after="60" w:line="300" w:lineRule="auto"/>
+              <w:jc w:val="both"/>
+              <w:rPr>
+                <w:rFonts w:ascii="Arial" w:hAnsi="Arial" w:cs="Arial"/>
+                <w:sz w:val="8"/>
+                <w:szCs w:val="8"/>
+                <w:rtl/>
+              </w:rPr>
+            </w:pPr>
+          </w:p>
+          <w:p>
+            <w:pPr>
+              <w:bidi/>
+              <w:spacing w:after="100" w:line="300" w:lineRule="auto"/>
+              <w:jc w:val="both"/>
+              <w:rPr>
+                <w:rFonts w:ascii="Arial" w:hAnsi="Arial" w:cs="Arial"/>
+                <w:sz w:val="22"/>
+                <w:szCs w:val="22"/>
+                <w:rtl/>
+              </w:rPr>
+            </w:pPr>
+            <w:r>
+              <w:rPr>
+                <w:rFonts w:ascii="Arial" w:hAnsi="Arial" w:cs="Arial"/>
+                <w:b/>
+                <w:bCs/>
+                <w:sz w:val="22"/>
+                <w:szCs w:val="22"/>
+              </w:rPr>
               <w:t xml:space="preserve">2</w:t>
             </w:r>
             <w:r>
@@ -8757,7 +9857,7 @@
                       <w:szCs w:val="19"/>
                       <w:rtl/>
                     </w:rPr>
-                    <w:t xml:space="preserve">مستقل</w:t>
+                    <w:t xml:space="preserve">مستقل (الرئيسي)</w:t>
                   </w:r>
                 </w:p>
               </w:tc>
@@ -8784,15 +9884,32 @@
                       <w:szCs w:val="19"/>
                       <w:rtl/>
                     </w:rPr>
-                    <w:t xml:space="preserve">طريقة القرار: العزل الكامل، العزل الكامل الآمن، قاعدة لكل جهاز، قاعدة التجزئة البسيطة، </w:t>
-                  </w:r>
-                  <w:r>
-                    <w:rPr>
-                      <w:rFonts w:ascii="Arial" w:hAnsi="Arial" w:cs="Arial"/>
-                      <w:sz w:val="19"/>
-                      <w:szCs w:val="19"/>
-                    </w:rPr>
-                    <w:t xml:space="preserve">ACRS v5/v7/v9</w:t>
+                    <w:t xml:space="preserve">سياسة القرار: الضابطة (بلا حماية)، العزل الكامل الآمن، القاعدة البسيطة، عزل كل جهاز مُنبَّه عليه (نمط </w:t>
+                  </w:r>
+                  <w:r>
+                    <w:rPr>
+                      <w:rFonts w:ascii="Arial" w:hAnsi="Arial" w:cs="Arial"/>
+                      <w:sz w:val="19"/>
+                      <w:szCs w:val="19"/>
+                    </w:rPr>
+                    <w:t xml:space="preserve">Wazuh)</w:t>
+                  </w:r>
+                  <w:r>
+                    <w:rPr>
+                      <w:rFonts w:ascii="Arial" w:hAnsi="Arial" w:cs="Arial"/>
+                      <w:sz w:val="19"/>
+                      <w:szCs w:val="19"/>
+                      <w:rtl/>
+                    </w:rPr>
+                    <w:t xml:space="preserve">، </w:t>
+                  </w:r>
+                  <w:r>
+                    <w:rPr>
+                      <w:rFonts w:ascii="Arial" w:hAnsi="Arial" w:cs="Arial"/>
+                      <w:sz w:val="19"/>
+                      <w:szCs w:val="19"/>
+                    </w:rPr>
+                    <w:t xml:space="preserve">ACRS v5/v7/v9/v12</w:t>
                   </w:r>
                 </w:p>
               </w:tc>
@@ -8818,16 +9935,16 @@
                       <w:sz w:val="19"/>
                       <w:szCs w:val="19"/>
                     </w:rPr>
-                    <w:t xml:space="preserve">4–6</w:t>
-                  </w:r>
-                  <w:r>
-                    <w:rPr>
-                      <w:rFonts w:ascii="Arial" w:hAnsi="Arial" w:cs="Arial"/>
-                      <w:sz w:val="19"/>
-                      <w:szCs w:val="19"/>
-                      <w:rtl/>
-                    </w:rPr>
-                    <w:t xml:space="preserve"> طرق على نفس السيناريوهات</w:t>
+                    <w:t xml:space="preserve">5</w:t>
+                  </w:r>
+                  <w:r>
+                    <w:rPr>
+                      <w:rFonts w:ascii="Arial" w:hAnsi="Arial" w:cs="Arial"/>
+                      <w:sz w:val="19"/>
+                      <w:szCs w:val="19"/>
+                      <w:rtl/>
+                    </w:rPr>
+                    <w:t xml:space="preserve"> سياسات على نفس السيناريوهات</w:t>
                   </w:r>
                 </w:p>
               </w:tc>
@@ -8886,7 +10003,7 @@
                       <w:szCs w:val="19"/>
                       <w:rtl/>
                     </w:rPr>
-                    <w:t xml:space="preserve">حجم الشبكة</w:t>
+                    <w:t xml:space="preserve">حجم الشبكة (توزيع الحمل)</w:t>
                   </w:r>
                 </w:p>
               </w:tc>
@@ -8921,109 +10038,7 @@
                       <w:szCs w:val="19"/>
                       <w:rtl/>
                     </w:rPr>
-                    <w:t xml:space="preserve">، </w:t>
-                  </w:r>
-                  <w:r>
-                    <w:rPr>
-                      <w:rFonts w:ascii="Arial" w:hAnsi="Arial" w:cs="Arial"/>
-                      <w:sz w:val="19"/>
-                      <w:szCs w:val="19"/>
-                    </w:rPr>
-                    <w:t xml:space="preserve">22</w:t>
-                  </w:r>
-                  <w:r>
-                    <w:rPr>
-                      <w:rFonts w:ascii="Arial" w:hAnsi="Arial" w:cs="Arial"/>
-                      <w:sz w:val="19"/>
-                      <w:szCs w:val="19"/>
-                      <w:rtl/>
-                    </w:rPr>
-                    <w:t xml:space="preserve">، </w:t>
-                  </w:r>
-                  <w:r>
-                    <w:rPr>
-                      <w:rFonts w:ascii="Arial" w:hAnsi="Arial" w:cs="Arial"/>
-                      <w:sz w:val="19"/>
-                      <w:szCs w:val="19"/>
-                    </w:rPr>
-                    <w:t xml:space="preserve">42</w:t>
-                  </w:r>
-                  <w:r>
-                    <w:rPr>
-                      <w:rFonts w:ascii="Arial" w:hAnsi="Arial" w:cs="Arial"/>
-                      <w:sz w:val="19"/>
-                      <w:szCs w:val="19"/>
-                      <w:rtl/>
-                    </w:rPr>
-                    <w:t xml:space="preserve">، </w:t>
-                  </w:r>
-                  <w:r>
-                    <w:rPr>
-                      <w:rFonts w:ascii="Arial" w:hAnsi="Arial" w:cs="Arial"/>
-                      <w:sz w:val="19"/>
-                      <w:szCs w:val="19"/>
-                    </w:rPr>
-                    <w:t xml:space="preserve">45</w:t>
-                  </w:r>
-                  <w:r>
-                    <w:rPr>
-                      <w:rFonts w:ascii="Arial" w:hAnsi="Arial" w:cs="Arial"/>
-                      <w:sz w:val="19"/>
-                      <w:szCs w:val="19"/>
-                      <w:rtl/>
-                    </w:rPr>
-                    <w:t xml:space="preserve">، </w:t>
-                  </w:r>
-                  <w:r>
-                    <w:rPr>
-                      <w:rFonts w:ascii="Arial" w:hAnsi="Arial" w:cs="Arial"/>
-                      <w:sz w:val="19"/>
-                      <w:szCs w:val="19"/>
-                    </w:rPr>
-                    <w:t xml:space="preserve">48</w:t>
-                  </w:r>
-                  <w:r>
-                    <w:rPr>
-                      <w:rFonts w:ascii="Arial" w:hAnsi="Arial" w:cs="Arial"/>
-                      <w:sz w:val="19"/>
-                      <w:szCs w:val="19"/>
-                      <w:rtl/>
-                    </w:rPr>
-                    <w:t xml:space="preserve">، </w:t>
-                  </w:r>
-                  <w:r>
-                    <w:rPr>
-                      <w:rFonts w:ascii="Arial" w:hAnsi="Arial" w:cs="Arial"/>
-                      <w:sz w:val="19"/>
-                      <w:szCs w:val="19"/>
-                    </w:rPr>
-                    <w:t xml:space="preserve">60</w:t>
-                  </w:r>
-                  <w:r>
-                    <w:rPr>
-                      <w:rFonts w:ascii="Arial" w:hAnsi="Arial" w:cs="Arial"/>
-                      <w:sz w:val="19"/>
-                      <w:szCs w:val="19"/>
-                      <w:rtl/>
-                    </w:rPr>
-                    <w:t xml:space="preserve">، </w:t>
-                  </w:r>
-                  <w:r>
-                    <w:rPr>
-                      <w:rFonts w:ascii="Arial" w:hAnsi="Arial" w:cs="Arial"/>
-                      <w:sz w:val="19"/>
-                      <w:szCs w:val="19"/>
-                    </w:rPr>
-                    <w:t xml:space="preserve">202</w:t>
-                  </w:r>
-                  <w:r>
-                    <w:rPr>
-                      <w:rFonts w:ascii="Arial" w:hAnsi="Arial" w:cs="Arial"/>
-                      <w:sz w:val="19"/>
-                      <w:szCs w:val="19"/>
-                      <w:rtl/>
-                    </w:rPr>
-                    <w:t xml:space="preserve">، </w:t>
+                    <w:t xml:space="preserve"> إلى </w:t>
                   </w:r>
                   <w:r>
                     <w:rPr>
@@ -9040,7 +10055,41 @@
                       <w:szCs w:val="19"/>
                       <w:rtl/>
                     </w:rPr>
-                    <w:t xml:space="preserve"> جهازًا</w:t>
+                    <w:t xml:space="preserve"> جهازًا، ثم </w:t>
+                  </w:r>
+                  <w:r>
+                    <w:rPr>
+                      <w:rFonts w:ascii="Arial" w:hAnsi="Arial" w:cs="Arial"/>
+                      <w:sz w:val="19"/>
+                      <w:szCs w:val="19"/>
+                    </w:rPr>
+                    <w:t xml:space="preserve">100 / 300 / 1,000</w:t>
+                  </w:r>
+                  <w:r>
+                    <w:rPr>
+                      <w:rFonts w:ascii="Arial" w:hAnsi="Arial" w:cs="Arial"/>
+                      <w:sz w:val="19"/>
+                      <w:szCs w:val="19"/>
+                      <w:rtl/>
+                    </w:rPr>
+                    <w:t xml:space="preserve"> جهاز لقياس الزمن، وفيضان </w:t>
+                  </w:r>
+                  <w:r>
+                    <w:rPr>
+                      <w:rFonts w:ascii="Arial" w:hAnsi="Arial" w:cs="Arial"/>
+                      <w:sz w:val="19"/>
+                      <w:szCs w:val="19"/>
+                    </w:rPr>
+                    <w:t xml:space="preserve">1,000</w:t>
+                  </w:r>
+                  <w:r>
+                    <w:rPr>
+                      <w:rFonts w:ascii="Arial" w:hAnsi="Arial" w:cs="Arial"/>
+                      <w:sz w:val="19"/>
+                      <w:szCs w:val="19"/>
+                      <w:rtl/>
+                    </w:rPr>
+                    <w:t xml:space="preserve"> تنبيه/ثانية</w:t>
                   </w:r>
                 </w:p>
               </w:tc>
@@ -9099,7 +10148,7 @@
                       <w:szCs w:val="19"/>
                       <w:rtl/>
                     </w:rPr>
-                    <w:t xml:space="preserve">نوع الهجوم</w:t>
+                    <w:t xml:space="preserve">نوع الهجوم ولحظة الاكتشاف</w:t>
                   </w:r>
                 </w:p>
               </w:tc>
@@ -9126,7 +10175,24 @@
                       <w:szCs w:val="19"/>
                       <w:rtl/>
                     </w:rPr>
-                    <w:t xml:space="preserve">عشوائي، سلاسل تنقّل جانبي، تنبيهات مزوّرة، انتشار فدية</w:t>
+                    <w:t xml:space="preserve">عشوائي، سلاسل تنقّل جانبي، تنبيهات مزوّرة، انتشار فدية؛ وفي الحوادث الحقيقية حتى </w:t>
+                  </w:r>
+                  <w:r>
+                    <w:rPr>
+                      <w:rFonts w:ascii="Arial" w:hAnsi="Arial" w:cs="Arial"/>
+                      <w:sz w:val="19"/>
+                      <w:szCs w:val="19"/>
+                    </w:rPr>
+                    <w:t xml:space="preserve">5</w:t>
+                  </w:r>
+                  <w:r>
+                    <w:rPr>
+                      <w:rFonts w:ascii="Arial" w:hAnsi="Arial" w:cs="Arial"/>
+                      <w:sz w:val="19"/>
+                      <w:szCs w:val="19"/>
+                      <w:rtl/>
+                    </w:rPr>
+                    <w:t xml:space="preserve"> لحظات اكتشاف للهجوم الواحد</w:t>
                   </w:r>
                 </w:p>
               </w:tc>
@@ -10607,16 +11673,16 @@
                 <w:szCs w:val="22"/>
                 <w:rtl/>
               </w:rPr>
-              <w:t xml:space="preserve">. التحقق في العالم الحقيقي.</w:t>
-            </w:r>
-            <w:r>
-              <w:rPr>
-                <w:rFonts w:ascii="Arial" w:hAnsi="Arial" w:cs="Arial"/>
-                <w:sz w:val="22"/>
-                <w:szCs w:val="22"/>
-                <w:rtl/>
-              </w:rPr>
-              <w:t xml:space="preserve"> نفّذنا القرارات بـ </w:t>
+              <w:t xml:space="preserve">. التحقق في العالم الحقيقي (اختبار «الدائرة» نفسها حاسوبيًا ثم فعليًا).</w:t>
+            </w:r>
+            <w:r>
+              <w:rPr>
+                <w:rFonts w:ascii="Arial" w:hAnsi="Arial" w:cs="Arial"/>
+                <w:sz w:val="22"/>
+                <w:szCs w:val="22"/>
+                <w:rtl/>
+              </w:rPr>
+              <w:t xml:space="preserve"> قبل التنفيذ يبني التوأم الرقمي القواعد في سلسلة اختبار ويقارنها بالخطة وبالسلوك المقاس، فإن اختلفت رُفضت الخطة؛ ثم نفّذنا القرارات بـ </w:t>
             </w:r>
             <w:r>
               <w:rPr>
@@ -10667,7 +11733,160 @@
                 <w:szCs w:val="22"/>
                 <w:rtl/>
               </w:rPr>
-              <w:t xml:space="preserve"> حقيقية في بيئة معزولة، وقارنّا ما توقعه النموذج بما حدث في كل اتصال. وعلى ثلاثة حواسيب </w:t>
+              <w:t xml:space="preserve"> حقيقية في بيئة معزولة، وقارنّا ما توقعه النموذج بما حدث في كل اتصال (</w:t>
+            </w:r>
+            <w:r>
+              <w:rPr>
+                <w:rFonts w:ascii="Arial" w:hAnsi="Arial" w:cs="Arial"/>
+                <w:sz w:val="22"/>
+                <w:szCs w:val="22"/>
+              </w:rPr>
+              <w:t xml:space="preserve">1,693</w:t>
+            </w:r>
+            <w:r>
+              <w:rPr>
+                <w:rFonts w:ascii="Arial" w:hAnsi="Arial" w:cs="Arial"/>
+                <w:sz w:val="22"/>
+                <w:szCs w:val="22"/>
+                <w:rtl/>
+              </w:rPr>
+              <w:t xml:space="preserve"> فحصًا في </w:t>
+            </w:r>
+            <w:r>
+              <w:rPr>
+                <w:rFonts w:ascii="Arial" w:hAnsi="Arial" w:cs="Arial"/>
+                <w:sz w:val="22"/>
+                <w:szCs w:val="22"/>
+              </w:rPr>
+              <w:t xml:space="preserve">v12)</w:t>
+            </w:r>
+            <w:r>
+              <w:rPr>
+                <w:rFonts w:ascii="Arial" w:hAnsi="Arial" w:cs="Arial"/>
+                <w:sz w:val="22"/>
+                <w:szCs w:val="22"/>
+                <w:rtl/>
+              </w:rPr>
+              <w:t xml:space="preserve">. والنوتة الحسابية للحمل: زمن القرار الوسيط </w:t>
+            </w:r>
+            <w:r>
+              <w:rPr>
+                <w:rFonts w:ascii="Arial" w:hAnsi="Arial" w:cs="Arial"/>
+                <w:sz w:val="22"/>
+                <w:szCs w:val="22"/>
+              </w:rPr>
+              <w:t xml:space="preserve">2.2</w:t>
+            </w:r>
+            <w:r>
+              <w:rPr>
+                <w:rFonts w:ascii="Arial" w:hAnsi="Arial" w:cs="Arial"/>
+                <w:sz w:val="22"/>
+                <w:szCs w:val="22"/>
+                <w:rtl/>
+              </w:rPr>
+              <w:t xml:space="preserve"> مللي ثانية عند </w:t>
+            </w:r>
+            <w:r>
+              <w:rPr>
+                <w:rFonts w:ascii="Arial" w:hAnsi="Arial" w:cs="Arial"/>
+                <w:sz w:val="22"/>
+                <w:szCs w:val="22"/>
+              </w:rPr>
+              <w:t xml:space="preserve">1,000</w:t>
+            </w:r>
+            <w:r>
+              <w:rPr>
+                <w:rFonts w:ascii="Arial" w:hAnsi="Arial" w:cs="Arial"/>
+                <w:sz w:val="22"/>
+                <w:szCs w:val="22"/>
+                <w:rtl/>
+              </w:rPr>
+              <w:t xml:space="preserve"> جهاز (</w:t>
+            </w:r>
+            <w:r>
+              <w:rPr>
+                <w:rFonts w:ascii="Arial" w:hAnsi="Arial" w:cs="Arial"/>
+                <w:sz w:val="22"/>
+                <w:szCs w:val="22"/>
+              </w:rPr>
+              <w:t xml:space="preserve">p95 = 9.2)</w:t>
+            </w:r>
+            <w:r>
+              <w:rPr>
+                <w:rFonts w:ascii="Arial" w:hAnsi="Arial" w:cs="Arial"/>
+                <w:sz w:val="22"/>
+                <w:szCs w:val="22"/>
+                <w:rtl/>
+              </w:rPr>
+              <w:t xml:space="preserve">، و</w:t>
+            </w:r>
+            <w:r>
+              <w:rPr>
+                <w:rFonts w:ascii="Arial" w:hAnsi="Arial" w:cs="Arial"/>
+                <w:sz w:val="22"/>
+                <w:szCs w:val="22"/>
+              </w:rPr>
+              <w:t xml:space="preserve">0.7</w:t>
+            </w:r>
+            <w:r>
+              <w:rPr>
+                <w:rFonts w:ascii="Arial" w:hAnsi="Arial" w:cs="Arial"/>
+                <w:sz w:val="22"/>
+                <w:szCs w:val="22"/>
+                <w:rtl/>
+              </w:rPr>
+              <w:t xml:space="preserve"> ثانية لمعالجة </w:t>
+            </w:r>
+            <w:r>
+              <w:rPr>
+                <w:rFonts w:ascii="Arial" w:hAnsi="Arial" w:cs="Arial"/>
+                <w:sz w:val="22"/>
+                <w:szCs w:val="22"/>
+              </w:rPr>
+              <w:t xml:space="preserve">1,000</w:t>
+            </w:r>
+            <w:r>
+              <w:rPr>
+                <w:rFonts w:ascii="Arial" w:hAnsi="Arial" w:cs="Arial"/>
+                <w:sz w:val="22"/>
+                <w:szCs w:val="22"/>
+                <w:rtl/>
+              </w:rPr>
+              <w:t xml:space="preserve"> تنبيه دفعة واحدة، ومتغيرات </w:t>
+            </w:r>
+            <w:r>
+              <w:rPr>
+                <w:rFonts w:ascii="Arial" w:hAnsi="Arial" w:cs="Arial"/>
+                <w:sz w:val="22"/>
+                <w:szCs w:val="22"/>
+              </w:rPr>
+              <w:t xml:space="preserve">QUBO</w:t>
+            </w:r>
+            <w:r>
+              <w:rPr>
+                <w:rFonts w:ascii="Arial" w:hAnsi="Arial" w:cs="Arial"/>
+                <w:sz w:val="22"/>
+                <w:szCs w:val="22"/>
+                <w:rtl/>
+              </w:rPr>
+              <w:t xml:space="preserve"> ≤ </w:t>
+            </w:r>
+            <w:r>
+              <w:rPr>
+                <w:rFonts w:ascii="Arial" w:hAnsi="Arial" w:cs="Arial"/>
+                <w:sz w:val="22"/>
+                <w:szCs w:val="22"/>
+              </w:rPr>
+              <w:t xml:space="preserve">20</w:t>
+            </w:r>
+            <w:r>
+              <w:rPr>
+                <w:rFonts w:ascii="Arial" w:hAnsi="Arial" w:cs="Arial"/>
+                <w:sz w:val="22"/>
+                <w:szCs w:val="22"/>
+                <w:rtl/>
+              </w:rPr>
+              <w:t xml:space="preserve"> تُحل بالتعداد الكامل وما فوقها بالتلدين. وعلى ثلاثة حواسيب </w:t>
             </w:r>
             <w:r>
               <w:rPr>
@@ -13369,7 +14588,7 @@
               <w:drawing>
                 <wp:inline distT="0" distB="0" distL="0" distR="0">
                   <wp:extent cx="5900000" cy="1984545"/>
-                  <wp:docPr id="9001" name="Figure 1" descr="شكل 1: الاحتواء والخدمات المتوقفة لأربع طرق قرار على نفس 259 سلسلة هجوم"/>
+                  <wp:docPr id="9002" name="Figure 2" descr="شكل 1: الاحتواء والخدمات المتوقفة لأربع طرق قرار على نفس 259 سلسلة هجوم"/>
                   <wp:cNvGraphicFramePr>
                     <a:graphicFrameLocks xmlns:a="http://schemas.openxmlformats.org/drawingml/2006/main" noChangeAspect="1"/>
                   </wp:cNvGraphicFramePr>
@@ -13377,11 +14596,11 @@
                     <a:graphicData uri="http://schemas.openxmlformats.org/drawingml/2006/picture">
                       <pic:pic xmlns:pic="http://schemas.openxmlformats.org/drawingml/2006/picture">
                         <pic:nvPicPr>
-                          <pic:cNvPr id="9001" name="hassan_fig_a.png"/>
+                          <pic:cNvPr id="9002" name="hassan_fig_a.png"/>
                           <pic:cNvPicPr/>
                         </pic:nvPicPr>
                         <pic:blipFill>
-                          <a:blip r:embed="rIdHassanFig1"/>
+                          <a:blip r:embed="rIdHassanFig2"/>
                           <a:stretch>
                             <a:fillRect/>
                           </a:stretch>
@@ -19435,7 +20654,7 @@
               <w:drawing>
                 <wp:inline distT="0" distB="0" distL="0" distR="0">
                   <wp:extent cx="5900000" cy="2520909"/>
-                  <wp:docPr id="9002" name="Figure 2" descr="شكل 2: الأهداف الأربعة التي فشلت في v8 وقيمها بعد الإصلاح في v9 على بيانات جديدة"/>
+                  <wp:docPr id="9003" name="Figure 3" descr="شكل 2: الأهداف الأربعة التي فشلت في v8 وقيمها بعد الإصلاح في v9 على بيانات جديدة"/>
                   <wp:cNvGraphicFramePr>
                     <a:graphicFrameLocks xmlns:a="http://schemas.openxmlformats.org/drawingml/2006/main" noChangeAspect="1"/>
                   </wp:cNvGraphicFramePr>
@@ -19443,11 +20662,11 @@
                     <a:graphicData uri="http://schemas.openxmlformats.org/drawingml/2006/picture">
                       <pic:pic xmlns:pic="http://schemas.openxmlformats.org/drawingml/2006/picture">
                         <pic:nvPicPr>
-                          <pic:cNvPr id="9002" name="hassan_fig_b.png"/>
+                          <pic:cNvPr id="9003" name="hassan_fig_b.png"/>
                           <pic:cNvPicPr/>
                         </pic:nvPicPr>
                         <pic:blipFill>
-                          <a:blip r:embed="rIdHassanFig2"/>
+                          <a:blip r:embed="rIdHassanFig3"/>
                           <a:stretch>
                             <a:fillRect/>
                           </a:stretch>

</xml_diff>

<commit_message>
Ibdaa form v12: nested tables capped to the answer-cell width (9300 dxa) so nothing renders outside the answer boxes
Co-Authored-By: Claude Fable 5.1 <noreply@anthropic.com>
Claude-Session: https://claude.ai/code/session_013B4LPWZWgdrx1XoL9LPLxx
</commit_message>
<xml_diff>
--- a/docs/qacrs/form_drafts/IBDAA_2027_FORM_ACRS_v12.docx
+++ b/docs/qacrs/form_drafts/IBDAA_2027_FORM_ACRS_v12.docx
@@ -8753,7 +8753,7 @@
           <w:tbl>
             <w:tblPr>
               <w:bidiVisual/>
-              <w:tblW w:w="9800" w:type="dxa"/>
+              <w:tblW w:w="9298" w:type="dxa"/>
               <w:tblBorders>
                 <w:top w:val="single" w:sz="4" w:space="0" w:color="BFBFBF"/>
                 <w:left w:val="single" w:sz="4" w:space="0" w:color="BFBFBF"/>
@@ -8771,10 +8771,10 @@
               </w:tblCellMar>
             </w:tblPr>
             <w:tblGrid>
-              <w:gridCol w:w="1400"/>
-              <w:gridCol w:w="3400"/>
-              <w:gridCol w:w="2200"/>
-              <w:gridCol w:w="2800"/>
+              <w:gridCol w:w="1328"/>
+              <w:gridCol w:w="3226"/>
+              <w:gridCol w:w="2087"/>
+              <w:gridCol w:w="2657"/>
             </w:tblGrid>
             <w:tr>
               <w:trPr>
@@ -8783,7 +8783,7 @@
               </w:trPr>
               <w:tc>
                 <w:tcPr>
-                  <w:tcW w:w="1400" w:type="dxa"/>
+                  <w:tcW w:w="1328" w:type="dxa"/>
                   <w:shd w:val="clear" w:color="auto" w:fill="E8EEF3"/>
                 </w:tcPr>
                 <w:p>
@@ -8813,7 +8813,7 @@
               </w:tc>
               <w:tc>
                 <w:tcPr>
-                  <w:tcW w:w="3400" w:type="dxa"/>
+                  <w:tcW w:w="3226" w:type="dxa"/>
                   <w:shd w:val="clear" w:color="auto" w:fill="E8EEF3"/>
                 </w:tcPr>
                 <w:p>
@@ -8843,7 +8843,7 @@
               </w:tc>
               <w:tc>
                 <w:tcPr>
-                  <w:tcW w:w="2200" w:type="dxa"/>
+                  <w:tcW w:w="2087" w:type="dxa"/>
                   <w:shd w:val="clear" w:color="auto" w:fill="E8EEF3"/>
                 </w:tcPr>
                 <w:p>
@@ -8873,7 +8873,7 @@
               </w:tc>
               <w:tc>
                 <w:tcPr>
-                  <w:tcW w:w="2800" w:type="dxa"/>
+                  <w:tcW w:w="2657" w:type="dxa"/>
                   <w:shd w:val="clear" w:color="auto" w:fill="E8EEF3"/>
                 </w:tcPr>
                 <w:p>
@@ -8908,7 +8908,7 @@
               </w:trPr>
               <w:tc>
                 <w:tcPr>
-                  <w:tcW w:w="1400" w:type="dxa"/>
+                  <w:tcW w:w="1328" w:type="dxa"/>
                 </w:tcPr>
                 <w:p>
                   <w:pPr>
@@ -8935,7 +8935,7 @@
               </w:tc>
               <w:tc>
                 <w:tcPr>
-                  <w:tcW w:w="3400" w:type="dxa"/>
+                  <w:tcW w:w="3226" w:type="dxa"/>
                 </w:tcPr>
                 <w:p>
                   <w:pPr>
@@ -8962,7 +8962,7 @@
               </w:tc>
               <w:tc>
                 <w:tcPr>
-                  <w:tcW w:w="2200" w:type="dxa"/>
+                  <w:tcW w:w="2087" w:type="dxa"/>
                 </w:tcPr>
                 <w:p>
                   <w:pPr>
@@ -8989,7 +8989,7 @@
               </w:tc>
               <w:tc>
                 <w:tcPr>
-                  <w:tcW w:w="2800" w:type="dxa"/>
+                  <w:tcW w:w="2657" w:type="dxa"/>
                 </w:tcPr>
                 <w:p>
                   <w:pPr>
@@ -9021,7 +9021,7 @@
               </w:trPr>
               <w:tc>
                 <w:tcPr>
-                  <w:tcW w:w="1400" w:type="dxa"/>
+                  <w:tcW w:w="1328" w:type="dxa"/>
                 </w:tcPr>
                 <w:p>
                   <w:pPr>
@@ -9048,7 +9048,7 @@
               </w:tc>
               <w:tc>
                 <w:tcPr>
-                  <w:tcW w:w="3400" w:type="dxa"/>
+                  <w:tcW w:w="3226" w:type="dxa"/>
                 </w:tcPr>
                 <w:p>
                   <w:pPr>
@@ -9083,7 +9083,7 @@
               </w:tc>
               <w:tc>
                 <w:tcPr>
-                  <w:tcW w:w="2200" w:type="dxa"/>
+                  <w:tcW w:w="2087" w:type="dxa"/>
                 </w:tcPr>
                 <w:p>
                   <w:pPr>
@@ -9144,7 +9144,7 @@
               </w:tc>
               <w:tc>
                 <w:tcPr>
-                  <w:tcW w:w="2800" w:type="dxa"/>
+                  <w:tcW w:w="2657" w:type="dxa"/>
                 </w:tcPr>
                 <w:p>
                   <w:pPr>
@@ -9176,7 +9176,7 @@
               </w:trPr>
               <w:tc>
                 <w:tcPr>
-                  <w:tcW w:w="1400" w:type="dxa"/>
+                  <w:tcW w:w="1328" w:type="dxa"/>
                 </w:tcPr>
                 <w:p>
                   <w:pPr>
@@ -9203,7 +9203,7 @@
               </w:tc>
               <w:tc>
                 <w:tcPr>
-                  <w:tcW w:w="3400" w:type="dxa"/>
+                  <w:tcW w:w="3226" w:type="dxa"/>
                 </w:tcPr>
                 <w:p>
                   <w:pPr>
@@ -9264,7 +9264,7 @@
               </w:tc>
               <w:tc>
                 <w:tcPr>
-                  <w:tcW w:w="2200" w:type="dxa"/>
+                  <w:tcW w:w="2087" w:type="dxa"/>
                 </w:tcPr>
                 <w:p>
                   <w:pPr>
@@ -9308,7 +9308,7 @@
               </w:tc>
               <w:tc>
                 <w:tcPr>
-                  <w:tcW w:w="2800" w:type="dxa"/>
+                  <w:tcW w:w="2657" w:type="dxa"/>
                 </w:tcPr>
                 <w:p>
                   <w:pPr>
@@ -9340,7 +9340,7 @@
               </w:trPr>
               <w:tc>
                 <w:tcPr>
-                  <w:tcW w:w="1400" w:type="dxa"/>
+                  <w:tcW w:w="1328" w:type="dxa"/>
                 </w:tcPr>
                 <w:p>
                   <w:pPr>
@@ -9367,7 +9367,7 @@
               </w:tc>
               <w:tc>
                 <w:tcPr>
-                  <w:tcW w:w="3400" w:type="dxa"/>
+                  <w:tcW w:w="3226" w:type="dxa"/>
                 </w:tcPr>
                 <w:p>
                   <w:pPr>
@@ -9394,7 +9394,7 @@
               </w:tc>
               <w:tc>
                 <w:tcPr>
-                  <w:tcW w:w="2200" w:type="dxa"/>
+                  <w:tcW w:w="2087" w:type="dxa"/>
                 </w:tcPr>
                 <w:p>
                   <w:pPr>
@@ -9429,7 +9429,7 @@
               </w:tc>
               <w:tc>
                 <w:tcPr>
-                  <w:tcW w:w="2800" w:type="dxa"/>
+                  <w:tcW w:w="2657" w:type="dxa"/>
                 </w:tcPr>
                 <w:p>
                   <w:pPr>
@@ -9461,7 +9461,7 @@
               </w:trPr>
               <w:tc>
                 <w:tcPr>
-                  <w:tcW w:w="1400" w:type="dxa"/>
+                  <w:tcW w:w="1328" w:type="dxa"/>
                 </w:tcPr>
                 <w:p>
                   <w:pPr>
@@ -9488,7 +9488,7 @@
               </w:tc>
               <w:tc>
                 <w:tcPr>
-                  <w:tcW w:w="3400" w:type="dxa"/>
+                  <w:tcW w:w="3226" w:type="dxa"/>
                 </w:tcPr>
                 <w:p>
                   <w:pPr>
@@ -9532,7 +9532,7 @@
               </w:tc>
               <w:tc>
                 <w:tcPr>
-                  <w:tcW w:w="2200" w:type="dxa"/>
+                  <w:tcW w:w="2087" w:type="dxa"/>
                 </w:tcPr>
                 <w:p>
                   <w:pPr>
@@ -9575,7 +9575,7 @@
               </w:tc>
               <w:tc>
                 <w:tcPr>
-                  <w:tcW w:w="2800" w:type="dxa"/>
+                  <w:tcW w:w="2657" w:type="dxa"/>
                 </w:tcPr>
                 <w:p>
                   <w:pPr>
@@ -9712,7 +9712,7 @@
           <w:tbl>
             <w:tblPr>
               <w:bidiVisual/>
-              <w:tblW w:w="9500" w:type="dxa"/>
+              <w:tblW w:w="9298" w:type="dxa"/>
               <w:tblBorders>
                 <w:top w:val="single" w:sz="4" w:space="0" w:color="BFBFBF"/>
                 <w:left w:val="single" w:sz="4" w:space="0" w:color="BFBFBF"/>
@@ -9730,9 +9730,9 @@
               </w:tblCellMar>
             </w:tblPr>
             <w:tblGrid>
-              <w:gridCol w:w="1500"/>
-              <w:gridCol w:w="4800"/>
-              <w:gridCol w:w="3200"/>
+              <w:gridCol w:w="1468"/>
+              <w:gridCol w:w="4698"/>
+              <w:gridCol w:w="3132"/>
             </w:tblGrid>
             <w:tr>
               <w:trPr>
@@ -9741,7 +9741,7 @@
               </w:trPr>
               <w:tc>
                 <w:tcPr>
-                  <w:tcW w:w="1500" w:type="dxa"/>
+                  <w:tcW w:w="1468" w:type="dxa"/>
                   <w:shd w:val="clear" w:color="auto" w:fill="E8EEF3"/>
                 </w:tcPr>
                 <w:p>
@@ -9771,7 +9771,7 @@
               </w:tc>
               <w:tc>
                 <w:tcPr>
-                  <w:tcW w:w="4800" w:type="dxa"/>
+                  <w:tcW w:w="4698" w:type="dxa"/>
                   <w:shd w:val="clear" w:color="auto" w:fill="E8EEF3"/>
                 </w:tcPr>
                 <w:p>
@@ -9801,7 +9801,7 @@
               </w:tc>
               <w:tc>
                 <w:tcPr>
-                  <w:tcW w:w="3200" w:type="dxa"/>
+                  <w:tcW w:w="3132" w:type="dxa"/>
                   <w:shd w:val="clear" w:color="auto" w:fill="E8EEF3"/>
                 </w:tcPr>
                 <w:p>
@@ -9836,7 +9836,7 @@
               </w:trPr>
               <w:tc>
                 <w:tcPr>
-                  <w:tcW w:w="1500" w:type="dxa"/>
+                  <w:tcW w:w="1468" w:type="dxa"/>
                 </w:tcPr>
                 <w:p>
                   <w:pPr>
@@ -9863,7 +9863,7 @@
               </w:tc>
               <w:tc>
                 <w:tcPr>
-                  <w:tcW w:w="4800" w:type="dxa"/>
+                  <w:tcW w:w="4698" w:type="dxa"/>
                 </w:tcPr>
                 <w:p>
                   <w:pPr>
@@ -9915,7 +9915,7 @@
               </w:tc>
               <w:tc>
                 <w:tcPr>
-                  <w:tcW w:w="3200" w:type="dxa"/>
+                  <w:tcW w:w="3132" w:type="dxa"/>
                 </w:tcPr>
                 <w:p>
                   <w:pPr>
@@ -9955,7 +9955,7 @@
               </w:trPr>
               <w:tc>
                 <w:tcPr>
-                  <w:tcW w:w="1500" w:type="dxa"/>
+                  <w:tcW w:w="1468" w:type="dxa"/>
                 </w:tcPr>
                 <w:p>
                   <w:pPr>
@@ -9982,7 +9982,7 @@
               </w:tc>
               <w:tc>
                 <w:tcPr>
-                  <w:tcW w:w="4800" w:type="dxa"/>
+                  <w:tcW w:w="4698" w:type="dxa"/>
                 </w:tcPr>
                 <w:p>
                   <w:pPr>
@@ -10009,7 +10009,7 @@
               </w:tc>
               <w:tc>
                 <w:tcPr>
-                  <w:tcW w:w="3200" w:type="dxa"/>
+                  <w:tcW w:w="3132" w:type="dxa"/>
                 </w:tcPr>
                 <w:p>
                   <w:pPr>
@@ -10100,7 +10100,7 @@
               </w:trPr>
               <w:tc>
                 <w:tcPr>
-                  <w:tcW w:w="1500" w:type="dxa"/>
+                  <w:tcW w:w="1468" w:type="dxa"/>
                 </w:tcPr>
                 <w:p>
                   <w:pPr>
@@ -10127,7 +10127,7 @@
               </w:tc>
               <w:tc>
                 <w:tcPr>
-                  <w:tcW w:w="4800" w:type="dxa"/>
+                  <w:tcW w:w="4698" w:type="dxa"/>
                 </w:tcPr>
                 <w:p>
                   <w:pPr>
@@ -10154,7 +10154,7 @@
               </w:tc>
               <w:tc>
                 <w:tcPr>
-                  <w:tcW w:w="3200" w:type="dxa"/>
+                  <w:tcW w:w="3132" w:type="dxa"/>
                 </w:tcPr>
                 <w:p>
                   <w:pPr>
@@ -10203,7 +10203,7 @@
               </w:trPr>
               <w:tc>
                 <w:tcPr>
-                  <w:tcW w:w="1500" w:type="dxa"/>
+                  <w:tcW w:w="1468" w:type="dxa"/>
                 </w:tcPr>
                 <w:p>
                   <w:pPr>
@@ -10230,7 +10230,7 @@
               </w:tc>
               <w:tc>
                 <w:tcPr>
-                  <w:tcW w:w="4800" w:type="dxa"/>
+                  <w:tcW w:w="4698" w:type="dxa"/>
                 </w:tcPr>
                 <w:p>
                   <w:pPr>
@@ -10257,7 +10257,7 @@
               </w:tc>
               <w:tc>
                 <w:tcPr>
-                  <w:tcW w:w="3200" w:type="dxa"/>
+                  <w:tcW w:w="3132" w:type="dxa"/>
                 </w:tcPr>
                 <w:p>
                   <w:pPr>
@@ -10297,7 +10297,7 @@
               </w:trPr>
               <w:tc>
                 <w:tcPr>
-                  <w:tcW w:w="1500" w:type="dxa"/>
+                  <w:tcW w:w="1468" w:type="dxa"/>
                 </w:tcPr>
                 <w:p>
                   <w:pPr>
@@ -10324,7 +10324,7 @@
               </w:tc>
               <w:tc>
                 <w:tcPr>
-                  <w:tcW w:w="4800" w:type="dxa"/>
+                  <w:tcW w:w="4698" w:type="dxa"/>
                 </w:tcPr>
                 <w:p>
                   <w:pPr>
@@ -10385,7 +10385,7 @@
               </w:tc>
               <w:tc>
                 <w:tcPr>
-                  <w:tcW w:w="3200" w:type="dxa"/>
+                  <w:tcW w:w="3132" w:type="dxa"/>
                 </w:tcPr>
                 <w:p>
                   <w:pPr>
@@ -10433,7 +10433,7 @@
               </w:trPr>
               <w:tc>
                 <w:tcPr>
-                  <w:tcW w:w="1500" w:type="dxa"/>
+                  <w:tcW w:w="1468" w:type="dxa"/>
                 </w:tcPr>
                 <w:p>
                   <w:pPr>
@@ -10460,7 +10460,7 @@
               </w:tc>
               <w:tc>
                 <w:tcPr>
-                  <w:tcW w:w="4800" w:type="dxa"/>
+                  <w:tcW w:w="4698" w:type="dxa"/>
                 </w:tcPr>
                 <w:p>
                   <w:pPr>
@@ -10521,7 +10521,7 @@
               </w:tc>
               <w:tc>
                 <w:tcPr>
-                  <w:tcW w:w="3200" w:type="dxa"/>
+                  <w:tcW w:w="3132" w:type="dxa"/>
                 </w:tcPr>
                 <w:p>
                   <w:pPr>
@@ -10553,7 +10553,7 @@
               </w:trPr>
               <w:tc>
                 <w:tcPr>
-                  <w:tcW w:w="1500" w:type="dxa"/>
+                  <w:tcW w:w="1468" w:type="dxa"/>
                 </w:tcPr>
                 <w:p>
                   <w:pPr>
@@ -10580,7 +10580,7 @@
               </w:tc>
               <w:tc>
                 <w:tcPr>
-                  <w:tcW w:w="4800" w:type="dxa"/>
+                  <w:tcW w:w="4698" w:type="dxa"/>
                 </w:tcPr>
                 <w:p>
                   <w:pPr>
@@ -10607,7 +10607,7 @@
               </w:tc>
               <w:tc>
                 <w:tcPr>
-                  <w:tcW w:w="3200" w:type="dxa"/>
+                  <w:tcW w:w="3132" w:type="dxa"/>
                 </w:tcPr>
                 <w:p>
                   <w:pPr>
@@ -10647,7 +10647,7 @@
               </w:trPr>
               <w:tc>
                 <w:tcPr>
-                  <w:tcW w:w="1500" w:type="dxa"/>
+                  <w:tcW w:w="1468" w:type="dxa"/>
                 </w:tcPr>
                 <w:p>
                   <w:pPr>
@@ -10674,7 +10674,7 @@
               </w:tc>
               <w:tc>
                 <w:tcPr>
-                  <w:tcW w:w="4800" w:type="dxa"/>
+                  <w:tcW w:w="4698" w:type="dxa"/>
                 </w:tcPr>
                 <w:p>
                   <w:pPr>
@@ -10701,7 +10701,7 @@
               </w:tc>
               <w:tc>
                 <w:tcPr>
-                  <w:tcW w:w="3200" w:type="dxa"/>
+                  <w:tcW w:w="3132" w:type="dxa"/>
                 </w:tcPr>
                 <w:p>
                   <w:pPr>
@@ -10733,7 +10733,7 @@
               </w:trPr>
               <w:tc>
                 <w:tcPr>
-                  <w:tcW w:w="1500" w:type="dxa"/>
+                  <w:tcW w:w="1468" w:type="dxa"/>
                 </w:tcPr>
                 <w:p>
                   <w:pPr>
@@ -10760,7 +10760,7 @@
               </w:tc>
               <w:tc>
                 <w:tcPr>
-                  <w:tcW w:w="4800" w:type="dxa"/>
+                  <w:tcW w:w="4698" w:type="dxa"/>
                 </w:tcPr>
                 <w:p>
                   <w:pPr>
@@ -10838,7 +10838,7 @@
               </w:tc>
               <w:tc>
                 <w:tcPr>
-                  <w:tcW w:w="3200" w:type="dxa"/>
+                  <w:tcW w:w="3132" w:type="dxa"/>
                 </w:tcPr>
                 <w:p>
                   <w:pPr>
@@ -12190,7 +12190,7 @@
           <w:tbl>
             <w:tblPr>
               <w:bidiVisual/>
-              <w:tblW w:w="9500" w:type="dxa"/>
+              <w:tblW w:w="9299" w:type="dxa"/>
               <w:tblBorders>
                 <w:top w:val="single" w:sz="4" w:space="0" w:color="BFBFBF"/>
                 <w:left w:val="single" w:sz="4" w:space="0" w:color="BFBFBF"/>
@@ -12208,8 +12208,8 @@
               </w:tblCellMar>
             </w:tblPr>
             <w:tblGrid>
-              <w:gridCol w:w="4300"/>
-              <w:gridCol w:w="5200"/>
+              <w:gridCol w:w="4209"/>
+              <w:gridCol w:w="5090"/>
             </w:tblGrid>
             <w:tr>
               <w:trPr>
@@ -12218,7 +12218,7 @@
               </w:trPr>
               <w:tc>
                 <w:tcPr>
-                  <w:tcW w:w="4300" w:type="dxa"/>
+                  <w:tcW w:w="4209" w:type="dxa"/>
                   <w:shd w:val="clear" w:color="auto" w:fill="E8EEF3"/>
                 </w:tcPr>
                 <w:p>
@@ -12248,7 +12248,7 @@
               </w:tc>
               <w:tc>
                 <w:tcPr>
-                  <w:tcW w:w="5200" w:type="dxa"/>
+                  <w:tcW w:w="5090" w:type="dxa"/>
                   <w:shd w:val="clear" w:color="auto" w:fill="E8EEF3"/>
                 </w:tcPr>
                 <w:p>
@@ -12283,7 +12283,7 @@
               </w:trPr>
               <w:tc>
                 <w:tcPr>
-                  <w:tcW w:w="4300" w:type="dxa"/>
+                  <w:tcW w:w="4209" w:type="dxa"/>
                 </w:tcPr>
                 <w:p>
                   <w:pPr>
@@ -12360,7 +12360,7 @@
               </w:tc>
               <w:tc>
                 <w:tcPr>
-                  <w:tcW w:w="5200" w:type="dxa"/>
+                  <w:tcW w:w="5090" w:type="dxa"/>
                 </w:tcPr>
                 <w:p>
                   <w:pPr>
@@ -12392,7 +12392,7 @@
               </w:trPr>
               <w:tc>
                 <w:tcPr>
-                  <w:tcW w:w="4300" w:type="dxa"/>
+                  <w:tcW w:w="4209" w:type="dxa"/>
                 </w:tcPr>
                 <w:p>
                   <w:pPr>
@@ -12461,7 +12461,7 @@
               </w:tc>
               <w:tc>
                 <w:tcPr>
-                  <w:tcW w:w="5200" w:type="dxa"/>
+                  <w:tcW w:w="5090" w:type="dxa"/>
                 </w:tcPr>
                 <w:p>
                   <w:pPr>
@@ -12493,7 +12493,7 @@
               </w:trPr>
               <w:tc>
                 <w:tcPr>
-                  <w:tcW w:w="4300" w:type="dxa"/>
+                  <w:tcW w:w="4209" w:type="dxa"/>
                 </w:tcPr>
                 <w:p>
                   <w:pPr>
@@ -12519,7 +12519,7 @@
               </w:tc>
               <w:tc>
                 <w:tcPr>
-                  <w:tcW w:w="5200" w:type="dxa"/>
+                  <w:tcW w:w="5090" w:type="dxa"/>
                 </w:tcPr>
                 <w:p>
                   <w:pPr>
@@ -12551,7 +12551,7 @@
               </w:trPr>
               <w:tc>
                 <w:tcPr>
-                  <w:tcW w:w="4300" w:type="dxa"/>
+                  <w:tcW w:w="4209" w:type="dxa"/>
                 </w:tcPr>
                 <w:p>
                   <w:pPr>
@@ -12577,7 +12577,7 @@
               </w:tc>
               <w:tc>
                 <w:tcPr>
-                  <w:tcW w:w="5200" w:type="dxa"/>
+                  <w:tcW w:w="5090" w:type="dxa"/>
                 </w:tcPr>
                 <w:p>
                   <w:pPr>
@@ -12626,7 +12626,7 @@
               </w:trPr>
               <w:tc>
                 <w:tcPr>
-                  <w:tcW w:w="4300" w:type="dxa"/>
+                  <w:tcW w:w="4209" w:type="dxa"/>
                 </w:tcPr>
                 <w:p>
                   <w:pPr>
@@ -12653,7 +12653,7 @@
               </w:tc>
               <w:tc>
                 <w:tcPr>
-                  <w:tcW w:w="5200" w:type="dxa"/>
+                  <w:tcW w:w="5090" w:type="dxa"/>
                 </w:tcPr>
                 <w:p>
                   <w:pPr>
@@ -13698,7 +13698,7 @@
           <w:tbl>
             <w:tblPr>
               <w:bidiVisual/>
-              <w:tblW w:w="9500" w:type="dxa"/>
+              <w:tblW w:w="9297" w:type="dxa"/>
               <w:tblBorders>
                 <w:top w:val="single" w:sz="4" w:space="0" w:color="BFBFBF"/>
                 <w:left w:val="single" w:sz="4" w:space="0" w:color="BFBFBF"/>
@@ -13716,12 +13716,12 @@
               </w:tblCellMar>
             </w:tblPr>
             <w:tblGrid>
-              <w:gridCol w:w="2700"/>
-              <w:gridCol w:w="1200"/>
-              <w:gridCol w:w="1700"/>
-              <w:gridCol w:w="1300"/>
-              <w:gridCol w:w="1300"/>
-              <w:gridCol w:w="1300"/>
+              <w:gridCol w:w="2643"/>
+              <w:gridCol w:w="1174"/>
+              <w:gridCol w:w="1664"/>
+              <w:gridCol w:w="1272"/>
+              <w:gridCol w:w="1272"/>
+              <w:gridCol w:w="1272"/>
             </w:tblGrid>
             <w:tr>
               <w:trPr>
@@ -13730,7 +13730,7 @@
               </w:trPr>
               <w:tc>
                 <w:tcPr>
-                  <w:tcW w:w="2700" w:type="dxa"/>
+                  <w:tcW w:w="2643" w:type="dxa"/>
                   <w:shd w:val="clear" w:color="auto" w:fill="E8EEF3"/>
                 </w:tcPr>
                 <w:p>
@@ -13760,7 +13760,7 @@
               </w:tc>
               <w:tc>
                 <w:tcPr>
-                  <w:tcW w:w="1200" w:type="dxa"/>
+                  <w:tcW w:w="1174" w:type="dxa"/>
                   <w:shd w:val="clear" w:color="auto" w:fill="E8EEF3"/>
                 </w:tcPr>
                 <w:p>
@@ -13790,7 +13790,7 @@
               </w:tc>
               <w:tc>
                 <w:tcPr>
-                  <w:tcW w:w="1700" w:type="dxa"/>
+                  <w:tcW w:w="1664" w:type="dxa"/>
                   <w:shd w:val="clear" w:color="auto" w:fill="E8EEF3"/>
                 </w:tcPr>
                 <w:p>
@@ -13820,7 +13820,7 @@
               </w:tc>
               <w:tc>
                 <w:tcPr>
-                  <w:tcW w:w="1300" w:type="dxa"/>
+                  <w:tcW w:w="1272" w:type="dxa"/>
                   <w:shd w:val="clear" w:color="auto" w:fill="E8EEF3"/>
                 </w:tcPr>
                 <w:p>
@@ -13850,7 +13850,7 @@
               </w:tc>
               <w:tc>
                 <w:tcPr>
-                  <w:tcW w:w="1300" w:type="dxa"/>
+                  <w:tcW w:w="1272" w:type="dxa"/>
                   <w:shd w:val="clear" w:color="auto" w:fill="E8EEF3"/>
                 </w:tcPr>
                 <w:p>
@@ -13880,7 +13880,7 @@
               </w:tc>
               <w:tc>
                 <w:tcPr>
-                  <w:tcW w:w="1300" w:type="dxa"/>
+                  <w:tcW w:w="1272" w:type="dxa"/>
                   <w:shd w:val="clear" w:color="auto" w:fill="E8EEF3"/>
                 </w:tcPr>
                 <w:p>
@@ -13915,7 +13915,7 @@
               </w:trPr>
               <w:tc>
                 <w:tcPr>
-                  <w:tcW w:w="2700" w:type="dxa"/>
+                  <w:tcW w:w="2643" w:type="dxa"/>
                 </w:tcPr>
                 <w:p>
                   <w:pPr>
@@ -13942,7 +13942,7 @@
               </w:tc>
               <w:tc>
                 <w:tcPr>
-                  <w:tcW w:w="1200" w:type="dxa"/>
+                  <w:tcW w:w="1174" w:type="dxa"/>
                 </w:tcPr>
                 <w:p>
                   <w:pPr>
@@ -13968,7 +13968,7 @@
               </w:tc>
               <w:tc>
                 <w:tcPr>
-                  <w:tcW w:w="1700" w:type="dxa"/>
+                  <w:tcW w:w="1664" w:type="dxa"/>
                 </w:tcPr>
                 <w:p>
                   <w:pPr>
@@ -13994,7 +13994,7 @@
               </w:tc>
               <w:tc>
                 <w:tcPr>
-                  <w:tcW w:w="1300" w:type="dxa"/>
+                  <w:tcW w:w="1272" w:type="dxa"/>
                 </w:tcPr>
                 <w:p>
                   <w:pPr>
@@ -14020,7 +14020,7 @@
               </w:tc>
               <w:tc>
                 <w:tcPr>
-                  <w:tcW w:w="1300" w:type="dxa"/>
+                  <w:tcW w:w="1272" w:type="dxa"/>
                 </w:tcPr>
                 <w:p>
                   <w:pPr>
@@ -14046,7 +14046,7 @@
               </w:tc>
               <w:tc>
                 <w:tcPr>
-                  <w:tcW w:w="1300" w:type="dxa"/>
+                  <w:tcW w:w="1272" w:type="dxa"/>
                 </w:tcPr>
                 <w:p>
                   <w:pPr>
@@ -14077,7 +14077,7 @@
               </w:trPr>
               <w:tc>
                 <w:tcPr>
-                  <w:tcW w:w="2700" w:type="dxa"/>
+                  <w:tcW w:w="2643" w:type="dxa"/>
                 </w:tcPr>
                 <w:p>
                   <w:pPr>
@@ -14104,7 +14104,7 @@
               </w:tc>
               <w:tc>
                 <w:tcPr>
-                  <w:tcW w:w="1200" w:type="dxa"/>
+                  <w:tcW w:w="1174" w:type="dxa"/>
                 </w:tcPr>
                 <w:p>
                   <w:pPr>
@@ -14130,7 +14130,7 @@
               </w:tc>
               <w:tc>
                 <w:tcPr>
-                  <w:tcW w:w="1700" w:type="dxa"/>
+                  <w:tcW w:w="1664" w:type="dxa"/>
                 </w:tcPr>
                 <w:p>
                   <w:pPr>
@@ -14156,7 +14156,7 @@
               </w:tc>
               <w:tc>
                 <w:tcPr>
-                  <w:tcW w:w="1300" w:type="dxa"/>
+                  <w:tcW w:w="1272" w:type="dxa"/>
                 </w:tcPr>
                 <w:p>
                   <w:pPr>
@@ -14182,7 +14182,7 @@
               </w:tc>
               <w:tc>
                 <w:tcPr>
-                  <w:tcW w:w="1300" w:type="dxa"/>
+                  <w:tcW w:w="1272" w:type="dxa"/>
                 </w:tcPr>
                 <w:p>
                   <w:pPr>
@@ -14208,7 +14208,7 @@
               </w:tc>
               <w:tc>
                 <w:tcPr>
-                  <w:tcW w:w="1300" w:type="dxa"/>
+                  <w:tcW w:w="1272" w:type="dxa"/>
                 </w:tcPr>
                 <w:p>
                   <w:pPr>
@@ -14239,7 +14239,7 @@
               </w:trPr>
               <w:tc>
                 <w:tcPr>
-                  <w:tcW w:w="2700" w:type="dxa"/>
+                  <w:tcW w:w="2643" w:type="dxa"/>
                 </w:tcPr>
                 <w:p>
                   <w:pPr>
@@ -14274,7 +14274,7 @@
               </w:tc>
               <w:tc>
                 <w:tcPr>
-                  <w:tcW w:w="1200" w:type="dxa"/>
+                  <w:tcW w:w="1174" w:type="dxa"/>
                 </w:tcPr>
                 <w:p>
                   <w:pPr>
@@ -14300,7 +14300,7 @@
               </w:tc>
               <w:tc>
                 <w:tcPr>
-                  <w:tcW w:w="1700" w:type="dxa"/>
+                  <w:tcW w:w="1664" w:type="dxa"/>
                 </w:tcPr>
                 <w:p>
                   <w:pPr>
@@ -14326,7 +14326,7 @@
               </w:tc>
               <w:tc>
                 <w:tcPr>
-                  <w:tcW w:w="1300" w:type="dxa"/>
+                  <w:tcW w:w="1272" w:type="dxa"/>
                 </w:tcPr>
                 <w:p>
                   <w:pPr>
@@ -14352,7 +14352,7 @@
               </w:tc>
               <w:tc>
                 <w:tcPr>
-                  <w:tcW w:w="1300" w:type="dxa"/>
+                  <w:tcW w:w="1272" w:type="dxa"/>
                 </w:tcPr>
                 <w:p>
                   <w:pPr>
@@ -14378,7 +14378,7 @@
               </w:tc>
               <w:tc>
                 <w:tcPr>
-                  <w:tcW w:w="1300" w:type="dxa"/>
+                  <w:tcW w:w="1272" w:type="dxa"/>
                 </w:tcPr>
                 <w:p>
                   <w:pPr>
@@ -14409,7 +14409,7 @@
               </w:trPr>
               <w:tc>
                 <w:tcPr>
-                  <w:tcW w:w="2700" w:type="dxa"/>
+                  <w:tcW w:w="2643" w:type="dxa"/>
                 </w:tcPr>
                 <w:p>
                   <w:pPr>
@@ -14435,7 +14435,7 @@
               </w:tc>
               <w:tc>
                 <w:tcPr>
-                  <w:tcW w:w="1200" w:type="dxa"/>
+                  <w:tcW w:w="1174" w:type="dxa"/>
                 </w:tcPr>
                 <w:p>
                   <w:pPr>
@@ -14461,7 +14461,7 @@
               </w:tc>
               <w:tc>
                 <w:tcPr>
-                  <w:tcW w:w="1700" w:type="dxa"/>
+                  <w:tcW w:w="1664" w:type="dxa"/>
                 </w:tcPr>
                 <w:p>
                   <w:pPr>
@@ -14487,7 +14487,7 @@
               </w:tc>
               <w:tc>
                 <w:tcPr>
-                  <w:tcW w:w="1300" w:type="dxa"/>
+                  <w:tcW w:w="1272" w:type="dxa"/>
                 </w:tcPr>
                 <w:p>
                   <w:pPr>
@@ -14513,7 +14513,7 @@
               </w:tc>
               <w:tc>
                 <w:tcPr>
-                  <w:tcW w:w="1300" w:type="dxa"/>
+                  <w:tcW w:w="1272" w:type="dxa"/>
                 </w:tcPr>
                 <w:p>
                   <w:pPr>
@@ -14539,7 +14539,7 @@
               </w:tc>
               <w:tc>
                 <w:tcPr>
-                  <w:tcW w:w="1300" w:type="dxa"/>
+                  <w:tcW w:w="1272" w:type="dxa"/>
                 </w:tcPr>
                 <w:p>
                   <w:pPr>
@@ -15370,7 +15370,7 @@
           <w:tbl>
             <w:tblPr>
               <w:bidiVisual/>
-              <w:tblW w:w="9400" w:type="dxa"/>
+              <w:tblW w:w="9298" w:type="dxa"/>
               <w:tblBorders>
                 <w:top w:val="single" w:sz="4" w:space="0" w:color="BFBFBF"/>
                 <w:left w:val="single" w:sz="4" w:space="0" w:color="BFBFBF"/>
@@ -15388,12 +15388,12 @@
               </w:tblCellMar>
             </w:tblPr>
             <w:tblGrid>
-              <w:gridCol w:w="3000"/>
-              <w:gridCol w:w="900"/>
-              <w:gridCol w:w="1100"/>
-              <w:gridCol w:w="2000"/>
-              <w:gridCol w:w="1100"/>
-              <w:gridCol w:w="1300"/>
+              <w:gridCol w:w="2968"/>
+              <w:gridCol w:w="890"/>
+              <w:gridCol w:w="1088"/>
+              <w:gridCol w:w="1978"/>
+              <w:gridCol w:w="1088"/>
+              <w:gridCol w:w="1286"/>
             </w:tblGrid>
             <w:tr>
               <w:trPr>
@@ -15402,7 +15402,7 @@
               </w:trPr>
               <w:tc>
                 <w:tcPr>
-                  <w:tcW w:w="3000" w:type="dxa"/>
+                  <w:tcW w:w="2968" w:type="dxa"/>
                   <w:shd w:val="clear" w:color="auto" w:fill="E8EEF3"/>
                 </w:tcPr>
                 <w:p>
@@ -15432,7 +15432,7 @@
               </w:tc>
               <w:tc>
                 <w:tcPr>
-                  <w:tcW w:w="900" w:type="dxa"/>
+                  <w:tcW w:w="890" w:type="dxa"/>
                   <w:shd w:val="clear" w:color="auto" w:fill="E8EEF3"/>
                 </w:tcPr>
                 <w:p>
@@ -15462,7 +15462,7 @@
               </w:tc>
               <w:tc>
                 <w:tcPr>
-                  <w:tcW w:w="1100" w:type="dxa"/>
+                  <w:tcW w:w="1088" w:type="dxa"/>
                   <w:shd w:val="clear" w:color="auto" w:fill="E8EEF3"/>
                 </w:tcPr>
                 <w:p>
@@ -15492,7 +15492,7 @@
               </w:tc>
               <w:tc>
                 <w:tcPr>
-                  <w:tcW w:w="2000" w:type="dxa"/>
+                  <w:tcW w:w="1978" w:type="dxa"/>
                   <w:shd w:val="clear" w:color="auto" w:fill="E8EEF3"/>
                 </w:tcPr>
                 <w:p>
@@ -15543,7 +15543,7 @@
               </w:tc>
               <w:tc>
                 <w:tcPr>
-                  <w:tcW w:w="1100" w:type="dxa"/>
+                  <w:tcW w:w="1088" w:type="dxa"/>
                   <w:shd w:val="clear" w:color="auto" w:fill="E8EEF3"/>
                 </w:tcPr>
                 <w:p>
@@ -15573,7 +15573,7 @@
               </w:tc>
               <w:tc>
                 <w:tcPr>
-                  <w:tcW w:w="1300" w:type="dxa"/>
+                  <w:tcW w:w="1286" w:type="dxa"/>
                   <w:shd w:val="clear" w:color="auto" w:fill="E8EEF3"/>
                 </w:tcPr>
                 <w:p>
@@ -15607,7 +15607,7 @@
               </w:trPr>
               <w:tc>
                 <w:tcPr>
-                  <w:tcW w:w="3000" w:type="dxa"/>
+                  <w:tcW w:w="2968" w:type="dxa"/>
                 </w:tcPr>
                 <w:p>
                   <w:pPr>
@@ -15651,7 +15651,7 @@
               </w:tc>
               <w:tc>
                 <w:tcPr>
-                  <w:tcW w:w="900" w:type="dxa"/>
+                  <w:tcW w:w="890" w:type="dxa"/>
                 </w:tcPr>
                 <w:p>
                   <w:pPr>
@@ -15677,7 +15677,7 @@
               </w:tc>
               <w:tc>
                 <w:tcPr>
-                  <w:tcW w:w="1100" w:type="dxa"/>
+                  <w:tcW w:w="1088" w:type="dxa"/>
                 </w:tcPr>
                 <w:p>
                   <w:pPr>
@@ -15703,7 +15703,7 @@
               </w:tc>
               <w:tc>
                 <w:tcPr>
-                  <w:tcW w:w="2000" w:type="dxa"/>
+                  <w:tcW w:w="1978" w:type="dxa"/>
                 </w:tcPr>
                 <w:p>
                   <w:pPr>
@@ -15729,7 +15729,7 @@
               </w:tc>
               <w:tc>
                 <w:tcPr>
-                  <w:tcW w:w="1100" w:type="dxa"/>
+                  <w:tcW w:w="1088" w:type="dxa"/>
                 </w:tcPr>
                 <w:p>
                   <w:pPr>
@@ -15755,7 +15755,7 @@
               </w:tc>
               <w:tc>
                 <w:tcPr>
-                  <w:tcW w:w="1300" w:type="dxa"/>
+                  <w:tcW w:w="1286" w:type="dxa"/>
                 </w:tcPr>
                 <w:p>
                   <w:pPr>
@@ -15787,7 +15787,7 @@
               </w:trPr>
               <w:tc>
                 <w:tcPr>
-                  <w:tcW w:w="3000" w:type="dxa"/>
+                  <w:tcW w:w="2968" w:type="dxa"/>
                 </w:tcPr>
                 <w:p>
                   <w:pPr>
@@ -15831,7 +15831,7 @@
               </w:tc>
               <w:tc>
                 <w:tcPr>
-                  <w:tcW w:w="900" w:type="dxa"/>
+                  <w:tcW w:w="890" w:type="dxa"/>
                 </w:tcPr>
                 <w:p>
                   <w:pPr>
@@ -15857,7 +15857,7 @@
               </w:tc>
               <w:tc>
                 <w:tcPr>
-                  <w:tcW w:w="1100" w:type="dxa"/>
+                  <w:tcW w:w="1088" w:type="dxa"/>
                 </w:tcPr>
                 <w:p>
                   <w:pPr>
@@ -15883,7 +15883,7 @@
               </w:tc>
               <w:tc>
                 <w:tcPr>
-                  <w:tcW w:w="2000" w:type="dxa"/>
+                  <w:tcW w:w="1978" w:type="dxa"/>
                 </w:tcPr>
                 <w:p>
                   <w:pPr>
@@ -15909,7 +15909,7 @@
               </w:tc>
               <w:tc>
                 <w:tcPr>
-                  <w:tcW w:w="1100" w:type="dxa"/>
+                  <w:tcW w:w="1088" w:type="dxa"/>
                 </w:tcPr>
                 <w:p>
                   <w:pPr>
@@ -15935,7 +15935,7 @@
               </w:tc>
               <w:tc>
                 <w:tcPr>
-                  <w:tcW w:w="1300" w:type="dxa"/>
+                  <w:tcW w:w="1286" w:type="dxa"/>
                 </w:tcPr>
                 <w:p>
                   <w:pPr>
@@ -15967,7 +15967,7 @@
               </w:trPr>
               <w:tc>
                 <w:tcPr>
-                  <w:tcW w:w="3000" w:type="dxa"/>
+                  <w:tcW w:w="2968" w:type="dxa"/>
                 </w:tcPr>
                 <w:p>
                   <w:pPr>
@@ -16011,7 +16011,7 @@
               </w:tc>
               <w:tc>
                 <w:tcPr>
-                  <w:tcW w:w="900" w:type="dxa"/>
+                  <w:tcW w:w="890" w:type="dxa"/>
                 </w:tcPr>
                 <w:p>
                   <w:pPr>
@@ -16037,7 +16037,7 @@
               </w:tc>
               <w:tc>
                 <w:tcPr>
-                  <w:tcW w:w="1100" w:type="dxa"/>
+                  <w:tcW w:w="1088" w:type="dxa"/>
                 </w:tcPr>
                 <w:p>
                   <w:pPr>
@@ -16063,7 +16063,7 @@
               </w:tc>
               <w:tc>
                 <w:tcPr>
-                  <w:tcW w:w="2000" w:type="dxa"/>
+                  <w:tcW w:w="1978" w:type="dxa"/>
                 </w:tcPr>
                 <w:p>
                   <w:pPr>
@@ -16089,7 +16089,7 @@
               </w:tc>
               <w:tc>
                 <w:tcPr>
-                  <w:tcW w:w="1100" w:type="dxa"/>
+                  <w:tcW w:w="1088" w:type="dxa"/>
                 </w:tcPr>
                 <w:p>
                   <w:pPr>
@@ -16115,7 +16115,7 @@
               </w:tc>
               <w:tc>
                 <w:tcPr>
-                  <w:tcW w:w="1300" w:type="dxa"/>
+                  <w:tcW w:w="1286" w:type="dxa"/>
                 </w:tcPr>
                 <w:p>
                   <w:pPr>
@@ -16379,7 +16379,7 @@
           <w:tbl>
             <w:tblPr>
               <w:bidiVisual/>
-              <w:tblW w:w="9500" w:type="dxa"/>
+              <w:tblW w:w="9299" w:type="dxa"/>
               <w:tblBorders>
                 <w:top w:val="single" w:sz="4" w:space="0" w:color="BFBFBF"/>
                 <w:left w:val="single" w:sz="4" w:space="0" w:color="BFBFBF"/>
@@ -16397,8 +16397,8 @@
               </w:tblCellMar>
             </w:tblPr>
             <w:tblGrid>
-              <w:gridCol w:w="4600"/>
-              <w:gridCol w:w="4900"/>
+              <w:gridCol w:w="4503"/>
+              <w:gridCol w:w="4796"/>
             </w:tblGrid>
             <w:tr>
               <w:trPr>
@@ -16407,7 +16407,7 @@
               </w:trPr>
               <w:tc>
                 <w:tcPr>
-                  <w:tcW w:w="4600" w:type="dxa"/>
+                  <w:tcW w:w="4503" w:type="dxa"/>
                   <w:shd w:val="clear" w:color="auto" w:fill="E8EEF3"/>
                 </w:tcPr>
                 <w:p>
@@ -16437,7 +16437,7 @@
               </w:tc>
               <w:tc>
                 <w:tcPr>
-                  <w:tcW w:w="4900" w:type="dxa"/>
+                  <w:tcW w:w="4796" w:type="dxa"/>
                   <w:shd w:val="clear" w:color="auto" w:fill="E8EEF3"/>
                 </w:tcPr>
                 <w:p>
@@ -16472,7 +16472,7 @@
               </w:trPr>
               <w:tc>
                 <w:tcPr>
-                  <w:tcW w:w="4600" w:type="dxa"/>
+                  <w:tcW w:w="4503" w:type="dxa"/>
                 </w:tcPr>
                 <w:p>
                   <w:pPr>
@@ -16516,7 +16516,7 @@
               </w:tc>
               <w:tc>
                 <w:tcPr>
-                  <w:tcW w:w="4900" w:type="dxa"/>
+                  <w:tcW w:w="4796" w:type="dxa"/>
                 </w:tcPr>
                 <w:p>
                   <w:pPr>
@@ -16573,7 +16573,7 @@
               </w:trPr>
               <w:tc>
                 <w:tcPr>
-                  <w:tcW w:w="4600" w:type="dxa"/>
+                  <w:tcW w:w="4503" w:type="dxa"/>
                 </w:tcPr>
                 <w:p>
                   <w:pPr>
@@ -16608,7 +16608,7 @@
               </w:tc>
               <w:tc>
                 <w:tcPr>
-                  <w:tcW w:w="4900" w:type="dxa"/>
+                  <w:tcW w:w="4796" w:type="dxa"/>
                 </w:tcPr>
                 <w:p>
                   <w:pPr>
@@ -16648,7 +16648,7 @@
               </w:trPr>
               <w:tc>
                 <w:tcPr>
-                  <w:tcW w:w="4600" w:type="dxa"/>
+                  <w:tcW w:w="4503" w:type="dxa"/>
                 </w:tcPr>
                 <w:p>
                   <w:pPr>
@@ -16692,7 +16692,7 @@
               </w:tc>
               <w:tc>
                 <w:tcPr>
-                  <w:tcW w:w="4900" w:type="dxa"/>
+                  <w:tcW w:w="4796" w:type="dxa"/>
                 </w:tcPr>
                 <w:p>
                   <w:pPr>
@@ -16766,7 +16766,7 @@
               </w:trPr>
               <w:tc>
                 <w:tcPr>
-                  <w:tcW w:w="4600" w:type="dxa"/>
+                  <w:tcW w:w="4503" w:type="dxa"/>
                 </w:tcPr>
                 <w:p>
                   <w:pPr>
@@ -16801,7 +16801,7 @@
               </w:tc>
               <w:tc>
                 <w:tcPr>
-                  <w:tcW w:w="4900" w:type="dxa"/>
+                  <w:tcW w:w="4796" w:type="dxa"/>
                 </w:tcPr>
                 <w:p>
                   <w:pPr>
@@ -16867,7 +16867,7 @@
               </w:trPr>
               <w:tc>
                 <w:tcPr>
-                  <w:tcW w:w="4600" w:type="dxa"/>
+                  <w:tcW w:w="4503" w:type="dxa"/>
                 </w:tcPr>
                 <w:p>
                   <w:pPr>
@@ -16911,7 +16911,7 @@
               </w:tc>
               <w:tc>
                 <w:tcPr>
-                  <w:tcW w:w="4900" w:type="dxa"/>
+                  <w:tcW w:w="4796" w:type="dxa"/>
                 </w:tcPr>
                 <w:p>
                   <w:pPr>
@@ -16968,7 +16968,7 @@
               </w:trPr>
               <w:tc>
                 <w:tcPr>
-                  <w:tcW w:w="4600" w:type="dxa"/>
+                  <w:tcW w:w="4503" w:type="dxa"/>
                 </w:tcPr>
                 <w:p>
                   <w:pPr>
@@ -16995,7 +16995,7 @@
               </w:tc>
               <w:tc>
                 <w:tcPr>
-                  <w:tcW w:w="4900" w:type="dxa"/>
+                  <w:tcW w:w="4796" w:type="dxa"/>
                 </w:tcPr>
                 <w:p>
                   <w:pPr>
@@ -17060,7 +17060,7 @@
               </w:trPr>
               <w:tc>
                 <w:tcPr>
-                  <w:tcW w:w="4600" w:type="dxa"/>
+                  <w:tcW w:w="4503" w:type="dxa"/>
                 </w:tcPr>
                 <w:p>
                   <w:pPr>
@@ -17087,7 +17087,7 @@
               </w:tc>
               <w:tc>
                 <w:tcPr>
-                  <w:tcW w:w="4900" w:type="dxa"/>
+                  <w:tcW w:w="4796" w:type="dxa"/>
                 </w:tcPr>
                 <w:p>
                   <w:pPr>
@@ -17214,7 +17214,7 @@
           <w:tbl>
             <w:tblPr>
               <w:bidiVisual/>
-              <w:tblW w:w="9500" w:type="dxa"/>
+              <w:tblW w:w="9299" w:type="dxa"/>
               <w:tblBorders>
                 <w:top w:val="single" w:sz="4" w:space="0" w:color="BFBFBF"/>
                 <w:left w:val="single" w:sz="4" w:space="0" w:color="BFBFBF"/>
@@ -17232,11 +17232,11 @@
               </w:tblCellMar>
             </w:tblPr>
             <w:tblGrid>
-              <w:gridCol w:w="2700"/>
-              <w:gridCol w:w="1700"/>
-              <w:gridCol w:w="1900"/>
-              <w:gridCol w:w="1500"/>
-              <w:gridCol w:w="1700"/>
+              <w:gridCol w:w="2643"/>
+              <w:gridCol w:w="1664"/>
+              <w:gridCol w:w="1860"/>
+              <w:gridCol w:w="1468"/>
+              <w:gridCol w:w="1664"/>
             </w:tblGrid>
             <w:tr>
               <w:trPr>
@@ -17245,7 +17245,7 @@
               </w:trPr>
               <w:tc>
                 <w:tcPr>
-                  <w:tcW w:w="2700" w:type="dxa"/>
+                  <w:tcW w:w="2643" w:type="dxa"/>
                   <w:shd w:val="clear" w:color="auto" w:fill="E8EEF3"/>
                 </w:tcPr>
                 <w:p>
@@ -17275,7 +17275,7 @@
               </w:tc>
               <w:tc>
                 <w:tcPr>
-                  <w:tcW w:w="1700" w:type="dxa"/>
+                  <w:tcW w:w="1664" w:type="dxa"/>
                   <w:shd w:val="clear" w:color="auto" w:fill="E8EEF3"/>
                 </w:tcPr>
                 <w:p>
@@ -17305,7 +17305,7 @@
               </w:tc>
               <w:tc>
                 <w:tcPr>
-                  <w:tcW w:w="1900" w:type="dxa"/>
+                  <w:tcW w:w="1860" w:type="dxa"/>
                   <w:shd w:val="clear" w:color="auto" w:fill="E8EEF3"/>
                 </w:tcPr>
                 <w:p>
@@ -17335,7 +17335,7 @@
               </w:tc>
               <w:tc>
                 <w:tcPr>
-                  <w:tcW w:w="1500" w:type="dxa"/>
+                  <w:tcW w:w="1468" w:type="dxa"/>
                   <w:shd w:val="clear" w:color="auto" w:fill="E8EEF3"/>
                 </w:tcPr>
                 <w:p>
@@ -17365,7 +17365,7 @@
               </w:tc>
               <w:tc>
                 <w:tcPr>
-                  <w:tcW w:w="1700" w:type="dxa"/>
+                  <w:tcW w:w="1664" w:type="dxa"/>
                   <w:shd w:val="clear" w:color="auto" w:fill="E8EEF3"/>
                 </w:tcPr>
                 <w:p>
@@ -17400,7 +17400,7 @@
               </w:trPr>
               <w:tc>
                 <w:tcPr>
-                  <w:tcW w:w="2700" w:type="dxa"/>
+                  <w:tcW w:w="2643" w:type="dxa"/>
                 </w:tcPr>
                 <w:p>
                   <w:pPr>
@@ -17435,7 +17435,7 @@
               </w:tc>
               <w:tc>
                 <w:tcPr>
-                  <w:tcW w:w="1700" w:type="dxa"/>
+                  <w:tcW w:w="1664" w:type="dxa"/>
                 </w:tcPr>
                 <w:p>
                   <w:pPr>
@@ -17470,7 +17470,7 @@
               </w:tc>
               <w:tc>
                 <w:tcPr>
-                  <w:tcW w:w="1900" w:type="dxa"/>
+                  <w:tcW w:w="1860" w:type="dxa"/>
                 </w:tcPr>
                 <w:p>
                   <w:pPr>
@@ -17496,7 +17496,7 @@
               </w:tc>
               <w:tc>
                 <w:tcPr>
-                  <w:tcW w:w="1500" w:type="dxa"/>
+                  <w:tcW w:w="1468" w:type="dxa"/>
                 </w:tcPr>
                 <w:p>
                   <w:pPr>
@@ -17522,7 +17522,7 @@
               </w:tc>
               <w:tc>
                 <w:tcPr>
-                  <w:tcW w:w="1700" w:type="dxa"/>
+                  <w:tcW w:w="1664" w:type="dxa"/>
                 </w:tcPr>
                 <w:p>
                   <w:pPr>
@@ -17553,7 +17553,7 @@
               </w:trPr>
               <w:tc>
                 <w:tcPr>
-                  <w:tcW w:w="2700" w:type="dxa"/>
+                  <w:tcW w:w="2643" w:type="dxa"/>
                 </w:tcPr>
                 <w:p>
                   <w:pPr>
@@ -17579,7 +17579,7 @@
               </w:tc>
               <w:tc>
                 <w:tcPr>
-                  <w:tcW w:w="1700" w:type="dxa"/>
+                  <w:tcW w:w="1664" w:type="dxa"/>
                 </w:tcPr>
                 <w:p>
                   <w:pPr>
@@ -17614,7 +17614,7 @@
               </w:tc>
               <w:tc>
                 <w:tcPr>
-                  <w:tcW w:w="1900" w:type="dxa"/>
+                  <w:tcW w:w="1860" w:type="dxa"/>
                 </w:tcPr>
                 <w:p>
                   <w:pPr>
@@ -17640,7 +17640,7 @@
               </w:tc>
               <w:tc>
                 <w:tcPr>
-                  <w:tcW w:w="1500" w:type="dxa"/>
+                  <w:tcW w:w="1468" w:type="dxa"/>
                 </w:tcPr>
                 <w:p>
                   <w:pPr>
@@ -17666,7 +17666,7 @@
               </w:tc>
               <w:tc>
                 <w:tcPr>
-                  <w:tcW w:w="1700" w:type="dxa"/>
+                  <w:tcW w:w="1664" w:type="dxa"/>
                 </w:tcPr>
                 <w:p>
                   <w:pPr>
@@ -17697,7 +17697,7 @@
               </w:trPr>
               <w:tc>
                 <w:tcPr>
-                  <w:tcW w:w="2700" w:type="dxa"/>
+                  <w:tcW w:w="2643" w:type="dxa"/>
                 </w:tcPr>
                 <w:p>
                   <w:pPr>
@@ -17740,7 +17740,7 @@
               </w:tc>
               <w:tc>
                 <w:tcPr>
-                  <w:tcW w:w="1700" w:type="dxa"/>
+                  <w:tcW w:w="1664" w:type="dxa"/>
                 </w:tcPr>
                 <w:p>
                   <w:pPr>
@@ -17775,7 +17775,7 @@
               </w:tc>
               <w:tc>
                 <w:tcPr>
-                  <w:tcW w:w="1900" w:type="dxa"/>
+                  <w:tcW w:w="1860" w:type="dxa"/>
                 </w:tcPr>
                 <w:p>
                   <w:pPr>
@@ -17801,7 +17801,7 @@
               </w:tc>
               <w:tc>
                 <w:tcPr>
-                  <w:tcW w:w="1500" w:type="dxa"/>
+                  <w:tcW w:w="1468" w:type="dxa"/>
                 </w:tcPr>
                 <w:p>
                   <w:pPr>
@@ -17827,7 +17827,7 @@
               </w:tc>
               <w:tc>
                 <w:tcPr>
-                  <w:tcW w:w="1700" w:type="dxa"/>
+                  <w:tcW w:w="1664" w:type="dxa"/>
                 </w:tcPr>
                 <w:p>
                   <w:pPr>
@@ -17858,7 +17858,7 @@
               </w:trPr>
               <w:tc>
                 <w:tcPr>
-                  <w:tcW w:w="2700" w:type="dxa"/>
+                  <w:tcW w:w="2643" w:type="dxa"/>
                 </w:tcPr>
                 <w:p>
                   <w:pPr>
@@ -17910,7 +17910,7 @@
               </w:tc>
               <w:tc>
                 <w:tcPr>
-                  <w:tcW w:w="1700" w:type="dxa"/>
+                  <w:tcW w:w="1664" w:type="dxa"/>
                 </w:tcPr>
                 <w:p>
                   <w:pPr>
@@ -17962,7 +17962,7 @@
               </w:tc>
               <w:tc>
                 <w:tcPr>
-                  <w:tcW w:w="1900" w:type="dxa"/>
+                  <w:tcW w:w="1860" w:type="dxa"/>
                 </w:tcPr>
                 <w:p>
                   <w:pPr>
@@ -18006,7 +18006,7 @@
               </w:tc>
               <w:tc>
                 <w:tcPr>
-                  <w:tcW w:w="1500" w:type="dxa"/>
+                  <w:tcW w:w="1468" w:type="dxa"/>
                 </w:tcPr>
                 <w:p>
                   <w:pPr>
@@ -18033,7 +18033,7 @@
               </w:tc>
               <w:tc>
                 <w:tcPr>
-                  <w:tcW w:w="1700" w:type="dxa"/>
+                  <w:tcW w:w="1664" w:type="dxa"/>
                 </w:tcPr>
                 <w:p>
                   <w:pPr>
@@ -18431,7 +18431,7 @@
           <w:tbl>
             <w:tblPr>
               <w:bidiVisual/>
-              <w:tblW w:w="10300" w:type="dxa"/>
+              <w:tblW w:w="9296" w:type="dxa"/>
               <w:tblBorders>
                 <w:top w:val="single" w:sz="4" w:space="0" w:color="BFBFBF"/>
                 <w:left w:val="single" w:sz="4" w:space="0" w:color="BFBFBF"/>
@@ -18449,12 +18449,12 @@
               </w:tblCellMar>
             </w:tblPr>
             <w:tblGrid>
-              <w:gridCol w:w="3200"/>
-              <w:gridCol w:w="1300"/>
-              <w:gridCol w:w="1300"/>
-              <w:gridCol w:w="1300"/>
-              <w:gridCol w:w="1700"/>
-              <w:gridCol w:w="1500"/>
+              <w:gridCol w:w="2889"/>
+              <w:gridCol w:w="1173"/>
+              <w:gridCol w:w="1173"/>
+              <w:gridCol w:w="1173"/>
+              <w:gridCol w:w="1534"/>
+              <w:gridCol w:w="1354"/>
             </w:tblGrid>
             <w:tr>
               <w:trPr>
@@ -18463,7 +18463,7 @@
               </w:trPr>
               <w:tc>
                 <w:tcPr>
-                  <w:tcW w:w="3200" w:type="dxa"/>
+                  <w:tcW w:w="2889" w:type="dxa"/>
                   <w:shd w:val="clear" w:color="auto" w:fill="E8EEF3"/>
                 </w:tcPr>
                 <w:p>
@@ -18493,7 +18493,7 @@
               </w:tc>
               <w:tc>
                 <w:tcPr>
-                  <w:tcW w:w="1300" w:type="dxa"/>
+                  <w:tcW w:w="1173" w:type="dxa"/>
                   <w:shd w:val="clear" w:color="auto" w:fill="E8EEF3"/>
                 </w:tcPr>
                 <w:p>
@@ -18522,7 +18522,7 @@
               </w:tc>
               <w:tc>
                 <w:tcPr>
-                  <w:tcW w:w="1300" w:type="dxa"/>
+                  <w:tcW w:w="1173" w:type="dxa"/>
                   <w:shd w:val="clear" w:color="auto" w:fill="E8EEF3"/>
                 </w:tcPr>
                 <w:p>
@@ -18562,7 +18562,7 @@
               </w:tc>
               <w:tc>
                 <w:tcPr>
-                  <w:tcW w:w="1300" w:type="dxa"/>
+                  <w:tcW w:w="1173" w:type="dxa"/>
                   <w:shd w:val="clear" w:color="auto" w:fill="E8EEF3"/>
                 </w:tcPr>
                 <w:p>
@@ -18592,7 +18592,7 @@
               </w:tc>
               <w:tc>
                 <w:tcPr>
-                  <w:tcW w:w="1700" w:type="dxa"/>
+                  <w:tcW w:w="1534" w:type="dxa"/>
                   <w:shd w:val="clear" w:color="auto" w:fill="E8EEF3"/>
                 </w:tcPr>
                 <w:p>
@@ -18622,7 +18622,7 @@
               </w:tc>
               <w:tc>
                 <w:tcPr>
-                  <w:tcW w:w="1500" w:type="dxa"/>
+                  <w:tcW w:w="1354" w:type="dxa"/>
                   <w:shd w:val="clear" w:color="auto" w:fill="E8EEF3"/>
                 </w:tcPr>
                 <w:p>
@@ -18657,7 +18657,7 @@
               </w:trPr>
               <w:tc>
                 <w:tcPr>
-                  <w:tcW w:w="3200" w:type="dxa"/>
+                  <w:tcW w:w="2889" w:type="dxa"/>
                 </w:tcPr>
                 <w:p>
                   <w:pPr>
@@ -18709,7 +18709,7 @@
               </w:tc>
               <w:tc>
                 <w:tcPr>
-                  <w:tcW w:w="1300" w:type="dxa"/>
+                  <w:tcW w:w="1173" w:type="dxa"/>
                 </w:tcPr>
                 <w:p>
                   <w:pPr>
@@ -18735,7 +18735,7 @@
               </w:tc>
               <w:tc>
                 <w:tcPr>
-                  <w:tcW w:w="1300" w:type="dxa"/>
+                  <w:tcW w:w="1173" w:type="dxa"/>
                 </w:tcPr>
                 <w:p>
                   <w:pPr>
@@ -18761,7 +18761,7 @@
               </w:tc>
               <w:tc>
                 <w:tcPr>
-                  <w:tcW w:w="1300" w:type="dxa"/>
+                  <w:tcW w:w="1173" w:type="dxa"/>
                 </w:tcPr>
                 <w:p>
                   <w:pPr>
@@ -18787,7 +18787,7 @@
               </w:tc>
               <w:tc>
                 <w:tcPr>
-                  <w:tcW w:w="1700" w:type="dxa"/>
+                  <w:tcW w:w="1534" w:type="dxa"/>
                 </w:tcPr>
                 <w:p>
                   <w:pPr>
@@ -18813,7 +18813,7 @@
               </w:tc>
               <w:tc>
                 <w:tcPr>
-                  <w:tcW w:w="1500" w:type="dxa"/>
+                  <w:tcW w:w="1354" w:type="dxa"/>
                 </w:tcPr>
                 <w:p>
                   <w:pPr>
@@ -18844,7 +18844,7 @@
               </w:trPr>
               <w:tc>
                 <w:tcPr>
-                  <w:tcW w:w="3200" w:type="dxa"/>
+                  <w:tcW w:w="2889" w:type="dxa"/>
                 </w:tcPr>
                 <w:p>
                   <w:pPr>
@@ -18871,7 +18871,7 @@
               </w:tc>
               <w:tc>
                 <w:tcPr>
-                  <w:tcW w:w="1300" w:type="dxa"/>
+                  <w:tcW w:w="1173" w:type="dxa"/>
                 </w:tcPr>
                 <w:p>
                   <w:pPr>
@@ -18897,7 +18897,7 @@
               </w:tc>
               <w:tc>
                 <w:tcPr>
-                  <w:tcW w:w="1300" w:type="dxa"/>
+                  <w:tcW w:w="1173" w:type="dxa"/>
                 </w:tcPr>
                 <w:p>
                   <w:pPr>
@@ -18923,7 +18923,7 @@
               </w:tc>
               <w:tc>
                 <w:tcPr>
-                  <w:tcW w:w="1300" w:type="dxa"/>
+                  <w:tcW w:w="1173" w:type="dxa"/>
                 </w:tcPr>
                 <w:p>
                   <w:pPr>
@@ -18949,7 +18949,7 @@
               </w:tc>
               <w:tc>
                 <w:tcPr>
-                  <w:tcW w:w="1700" w:type="dxa"/>
+                  <w:tcW w:w="1534" w:type="dxa"/>
                 </w:tcPr>
                 <w:p>
                   <w:pPr>
@@ -18975,7 +18975,7 @@
               </w:tc>
               <w:tc>
                 <w:tcPr>
-                  <w:tcW w:w="1500" w:type="dxa"/>
+                  <w:tcW w:w="1354" w:type="dxa"/>
                 </w:tcPr>
                 <w:p>
                   <w:pPr>
@@ -19006,7 +19006,7 @@
               </w:trPr>
               <w:tc>
                 <w:tcPr>
-                  <w:tcW w:w="3200" w:type="dxa"/>
+                  <w:tcW w:w="2889" w:type="dxa"/>
                 </w:tcPr>
                 <w:p>
                   <w:pPr>
@@ -19058,7 +19058,7 @@
               </w:tc>
               <w:tc>
                 <w:tcPr>
-                  <w:tcW w:w="1300" w:type="dxa"/>
+                  <w:tcW w:w="1173" w:type="dxa"/>
                 </w:tcPr>
                 <w:p>
                   <w:pPr>
@@ -19084,7 +19084,7 @@
               </w:tc>
               <w:tc>
                 <w:tcPr>
-                  <w:tcW w:w="1300" w:type="dxa"/>
+                  <w:tcW w:w="1173" w:type="dxa"/>
                 </w:tcPr>
                 <w:p>
                   <w:pPr>
@@ -19110,7 +19110,7 @@
               </w:tc>
               <w:tc>
                 <w:tcPr>
-                  <w:tcW w:w="1300" w:type="dxa"/>
+                  <w:tcW w:w="1173" w:type="dxa"/>
                 </w:tcPr>
                 <w:p>
                   <w:pPr>
@@ -19136,7 +19136,7 @@
               </w:tc>
               <w:tc>
                 <w:tcPr>
-                  <w:tcW w:w="1700" w:type="dxa"/>
+                  <w:tcW w:w="1534" w:type="dxa"/>
                 </w:tcPr>
                 <w:p>
                   <w:pPr>
@@ -19162,7 +19162,7 @@
               </w:tc>
               <w:tc>
                 <w:tcPr>
-                  <w:tcW w:w="1500" w:type="dxa"/>
+                  <w:tcW w:w="1354" w:type="dxa"/>
                 </w:tcPr>
                 <w:p>
                   <w:pPr>
@@ -19193,7 +19193,7 @@
               </w:trPr>
               <w:tc>
                 <w:tcPr>
-                  <w:tcW w:w="3200" w:type="dxa"/>
+                  <w:tcW w:w="2889" w:type="dxa"/>
                 </w:tcPr>
                 <w:p>
                   <w:pPr>
@@ -19220,7 +19220,7 @@
               </w:tc>
               <w:tc>
                 <w:tcPr>
-                  <w:tcW w:w="1300" w:type="dxa"/>
+                  <w:tcW w:w="1173" w:type="dxa"/>
                 </w:tcPr>
                 <w:p>
                   <w:pPr>
@@ -19246,7 +19246,7 @@
               </w:tc>
               <w:tc>
                 <w:tcPr>
-                  <w:tcW w:w="1300" w:type="dxa"/>
+                  <w:tcW w:w="1173" w:type="dxa"/>
                 </w:tcPr>
                 <w:p>
                   <w:pPr>
@@ -19272,7 +19272,7 @@
               </w:tc>
               <w:tc>
                 <w:tcPr>
-                  <w:tcW w:w="1300" w:type="dxa"/>
+                  <w:tcW w:w="1173" w:type="dxa"/>
                 </w:tcPr>
                 <w:p>
                   <w:pPr>
@@ -19298,7 +19298,7 @@
               </w:tc>
               <w:tc>
                 <w:tcPr>
-                  <w:tcW w:w="1700" w:type="dxa"/>
+                  <w:tcW w:w="1534" w:type="dxa"/>
                 </w:tcPr>
                 <w:p>
                   <w:pPr>
@@ -19324,7 +19324,7 @@
               </w:tc>
               <w:tc>
                 <w:tcPr>
-                  <w:tcW w:w="1500" w:type="dxa"/>
+                  <w:tcW w:w="1354" w:type="dxa"/>
                 </w:tcPr>
                 <w:p>
                   <w:pPr>
@@ -19355,7 +19355,7 @@
               </w:trPr>
               <w:tc>
                 <w:tcPr>
-                  <w:tcW w:w="3200" w:type="dxa"/>
+                  <w:tcW w:w="2889" w:type="dxa"/>
                 </w:tcPr>
                 <w:p>
                   <w:pPr>
@@ -19390,7 +19390,7 @@
               </w:tc>
               <w:tc>
                 <w:tcPr>
-                  <w:tcW w:w="1300" w:type="dxa"/>
+                  <w:tcW w:w="1173" w:type="dxa"/>
                 </w:tcPr>
                 <w:p>
                   <w:pPr>
@@ -19416,7 +19416,7 @@
               </w:tc>
               <w:tc>
                 <w:tcPr>
-                  <w:tcW w:w="1300" w:type="dxa"/>
+                  <w:tcW w:w="1173" w:type="dxa"/>
                 </w:tcPr>
                 <w:p>
                   <w:pPr>
@@ -19442,7 +19442,7 @@
               </w:tc>
               <w:tc>
                 <w:tcPr>
-                  <w:tcW w:w="1300" w:type="dxa"/>
+                  <w:tcW w:w="1173" w:type="dxa"/>
                 </w:tcPr>
                 <w:p>
                   <w:pPr>
@@ -19468,7 +19468,7 @@
               </w:tc>
               <w:tc>
                 <w:tcPr>
-                  <w:tcW w:w="1700" w:type="dxa"/>
+                  <w:tcW w:w="1534" w:type="dxa"/>
                 </w:tcPr>
                 <w:p>
                   <w:pPr>
@@ -19494,7 +19494,7 @@
               </w:tc>
               <w:tc>
                 <w:tcPr>
-                  <w:tcW w:w="1500" w:type="dxa"/>
+                  <w:tcW w:w="1354" w:type="dxa"/>
                 </w:tcPr>
                 <w:p>
                   <w:pPr>
@@ -22321,7 +22321,7 @@
           <w:tbl>
             <w:tblPr>
               <w:bidiVisual/>
-              <w:tblW w:w="9500" w:type="dxa"/>
+              <w:tblW w:w="9299" w:type="dxa"/>
               <w:tblBorders>
                 <w:top w:val="single" w:sz="4" w:space="0" w:color="BFBFBF"/>
                 <w:left w:val="single" w:sz="4" w:space="0" w:color="BFBFBF"/>
@@ -22339,10 +22339,10 @@
               </w:tblCellMar>
             </w:tblPr>
             <w:tblGrid>
-              <w:gridCol w:w="2300"/>
-              <w:gridCol w:w="3800"/>
-              <w:gridCol w:w="1900"/>
-              <w:gridCol w:w="1500"/>
+              <w:gridCol w:w="2251"/>
+              <w:gridCol w:w="3720"/>
+              <w:gridCol w:w="1860"/>
+              <w:gridCol w:w="1468"/>
             </w:tblGrid>
             <w:tr>
               <w:trPr>
@@ -22351,7 +22351,7 @@
               </w:trPr>
               <w:tc>
                 <w:tcPr>
-                  <w:tcW w:w="2300" w:type="dxa"/>
+                  <w:tcW w:w="2251" w:type="dxa"/>
                   <w:shd w:val="clear" w:color="auto" w:fill="E8EEF3"/>
                 </w:tcPr>
                 <w:p>
@@ -22381,7 +22381,7 @@
               </w:tc>
               <w:tc>
                 <w:tcPr>
-                  <w:tcW w:w="3800" w:type="dxa"/>
+                  <w:tcW w:w="3720" w:type="dxa"/>
                   <w:shd w:val="clear" w:color="auto" w:fill="E8EEF3"/>
                 </w:tcPr>
                 <w:p>
@@ -22411,7 +22411,7 @@
               </w:tc>
               <w:tc>
                 <w:tcPr>
-                  <w:tcW w:w="1900" w:type="dxa"/>
+                  <w:tcW w:w="1860" w:type="dxa"/>
                   <w:shd w:val="clear" w:color="auto" w:fill="E8EEF3"/>
                 </w:tcPr>
                 <w:p>
@@ -22441,7 +22441,7 @@
               </w:tc>
               <w:tc>
                 <w:tcPr>
-                  <w:tcW w:w="1500" w:type="dxa"/>
+                  <w:tcW w:w="1468" w:type="dxa"/>
                   <w:shd w:val="clear" w:color="auto" w:fill="E8EEF3"/>
                 </w:tcPr>
                 <w:p>
@@ -22476,7 +22476,7 @@
               </w:trPr>
               <w:tc>
                 <w:tcPr>
-                  <w:tcW w:w="2300" w:type="dxa"/>
+                  <w:tcW w:w="2251" w:type="dxa"/>
                 </w:tcPr>
                 <w:p>
                   <w:pPr>
@@ -22511,7 +22511,7 @@
               </w:tc>
               <w:tc>
                 <w:tcPr>
-                  <w:tcW w:w="3800" w:type="dxa"/>
+                  <w:tcW w:w="3720" w:type="dxa"/>
                 </w:tcPr>
                 <w:p>
                   <w:pPr>
@@ -22555,7 +22555,7 @@
               </w:tc>
               <w:tc>
                 <w:tcPr>
-                  <w:tcW w:w="1900" w:type="dxa"/>
+                  <w:tcW w:w="1860" w:type="dxa"/>
                 </w:tcPr>
                 <w:p>
                   <w:pPr>
@@ -22582,7 +22582,7 @@
               </w:tc>
               <w:tc>
                 <w:tcPr>
-                  <w:tcW w:w="1500" w:type="dxa"/>
+                  <w:tcW w:w="1468" w:type="dxa"/>
                 </w:tcPr>
                 <w:p>
                   <w:pPr>
@@ -22614,7 +22614,7 @@
               </w:trPr>
               <w:tc>
                 <w:tcPr>
-                  <w:tcW w:w="2300" w:type="dxa"/>
+                  <w:tcW w:w="2251" w:type="dxa"/>
                 </w:tcPr>
                 <w:p>
                   <w:pPr>
@@ -22649,7 +22649,7 @@
               </w:tc>
               <w:tc>
                 <w:tcPr>
-                  <w:tcW w:w="3800" w:type="dxa"/>
+                  <w:tcW w:w="3720" w:type="dxa"/>
                 </w:tcPr>
                 <w:p>
                   <w:pPr>
@@ -22676,7 +22676,7 @@
               </w:tc>
               <w:tc>
                 <w:tcPr>
-                  <w:tcW w:w="1900" w:type="dxa"/>
+                  <w:tcW w:w="1860" w:type="dxa"/>
                 </w:tcPr>
                 <w:p>
                   <w:pPr>
@@ -22703,7 +22703,7 @@
               </w:tc>
               <w:tc>
                 <w:tcPr>
-                  <w:tcW w:w="1500" w:type="dxa"/>
+                  <w:tcW w:w="1468" w:type="dxa"/>
                 </w:tcPr>
                 <w:p>
                   <w:pPr>
@@ -22735,7 +22735,7 @@
               </w:trPr>
               <w:tc>
                 <w:tcPr>
-                  <w:tcW w:w="2300" w:type="dxa"/>
+                  <w:tcW w:w="2251" w:type="dxa"/>
                 </w:tcPr>
                 <w:p>
                   <w:pPr>
@@ -22778,7 +22778,7 @@
               </w:tc>
               <w:tc>
                 <w:tcPr>
-                  <w:tcW w:w="3800" w:type="dxa"/>
+                  <w:tcW w:w="3720" w:type="dxa"/>
                 </w:tcPr>
                 <w:p>
                   <w:pPr>
@@ -22805,7 +22805,7 @@
               </w:tc>
               <w:tc>
                 <w:tcPr>
-                  <w:tcW w:w="1900" w:type="dxa"/>
+                  <w:tcW w:w="1860" w:type="dxa"/>
                 </w:tcPr>
                 <w:p>
                   <w:pPr>
@@ -22832,7 +22832,7 @@
               </w:tc>
               <w:tc>
                 <w:tcPr>
-                  <w:tcW w:w="1500" w:type="dxa"/>
+                  <w:tcW w:w="1468" w:type="dxa"/>
                 </w:tcPr>
                 <w:p>
                   <w:pPr>
@@ -22864,7 +22864,7 @@
               </w:trPr>
               <w:tc>
                 <w:tcPr>
-                  <w:tcW w:w="2300" w:type="dxa"/>
+                  <w:tcW w:w="2251" w:type="dxa"/>
                 </w:tcPr>
                 <w:p>
                   <w:pPr>
@@ -22916,7 +22916,7 @@
               </w:tc>
               <w:tc>
                 <w:tcPr>
-                  <w:tcW w:w="3800" w:type="dxa"/>
+                  <w:tcW w:w="3720" w:type="dxa"/>
                 </w:tcPr>
                 <w:p>
                   <w:pPr>
@@ -22960,7 +22960,7 @@
               </w:tc>
               <w:tc>
                 <w:tcPr>
-                  <w:tcW w:w="1900" w:type="dxa"/>
+                  <w:tcW w:w="1860" w:type="dxa"/>
                 </w:tcPr>
                 <w:p>
                   <w:pPr>
@@ -22987,7 +22987,7 @@
               </w:tc>
               <w:tc>
                 <w:tcPr>
-                  <w:tcW w:w="1500" w:type="dxa"/>
+                  <w:tcW w:w="1468" w:type="dxa"/>
                 </w:tcPr>
                 <w:p>
                   <w:pPr>

</xml_diff>

<commit_message>
Ibdaa form v12: AI-use disclosure now states Claude converted the real incidents (v11/v12)
Co-Authored-By: Claude Opus 5.5 <noreply@anthropic.com>
Claude-Session: https://claude.ai/code/session_013B4LPWZWgdrx1XoL9LPLxx
</commit_message>
<xml_diff>
--- a/docs/qacrs/form_drafts/IBDAA_2027_FORM_ACRS_v12.docx
+++ b/docs/qacrs/form_drafts/IBDAA_2027_FORM_ACRS_v12.docx
@@ -24118,6 +24118,46 @@
                 <w:rtl/>
               </w:rPr>
               <w:t xml:space="preserve">–  إعداد الرسوم البيانية من ملفات النتائج.</w:t>
+            </w:r>
+          </w:p>
+          <w:p>
+            <w:pPr>
+              <w:bidi/>
+              <w:spacing w:after="60" w:line="300" w:lineRule="auto"/>
+              <w:ind w:start="340" w:hanging="340"/>
+              <w:jc w:val="both"/>
+              <w:rPr>
+                <w:rFonts w:ascii="Arial" w:hAnsi="Arial" w:cs="Arial"/>
+                <w:sz w:val="22"/>
+                <w:szCs w:val="22"/>
+                <w:rtl/>
+              </w:rPr>
+            </w:pPr>
+            <w:r>
+              <w:rPr>
+                <w:rFonts w:ascii="Arial" w:hAnsi="Arial" w:cs="Arial"/>
+                <w:sz w:val="22"/>
+                <w:szCs w:val="22"/>
+                <w:rtl/>
+              </w:rPr>
+              <w:t xml:space="preserve">–  تحويل الحوادث الحقيقية (</w:t>
+            </w:r>
+            <w:r>
+              <w:rPr>
+                <w:rFonts w:ascii="Arial" w:hAnsi="Arial" w:cs="Arial"/>
+                <w:sz w:val="22"/>
+                <w:szCs w:val="22"/>
+              </w:rPr>
+              <w:t xml:space="preserve">v11/v12)</w:t>
+            </w:r>
+            <w:r>
+              <w:rPr>
+                <w:rFonts w:ascii="Arial" w:hAnsi="Arial" w:cs="Arial"/>
+                <w:sz w:val="22"/>
+                <w:szCs w:val="22"/>
+                <w:rtl/>
+              </w:rPr>
+              <w:t xml:space="preserve"> من تقاريرها العامة إلى شبكات وتنبيهات بالقواعد المسجّلة مسبقًا؛ لذلك نصف هذه النتائج بأنها تجريبية حتى يعيد محوّل بشري مستقل التحويل.</w:t>
             </w:r>
           </w:p>
           <w:p>

</xml_diff>

<commit_message>
Ibdaa form v12 review: abstract/methodology no longer say 'all synthetic', one research question, sensitivity 8/16 -> 4/16 (was misstated), 15 pre-registrations, 135 tests, ML-DSA timing range, figure/table numbering in reading order, redundant S6 opener removed
Co-Authored-By: Claude Opus 5.5 <noreply@anthropic.com>
Claude-Session: https://claude.ai/code/session_013B4LPWZWgdrx1XoL9LPLxx
</commit_message>
<xml_diff>
--- a/docs/qacrs/form_drafts/IBDAA_2027_FORM_ACRS_v12.docx
+++ b/docs/qacrs/form_drafts/IBDAA_2027_FORM_ACRS_v12.docx
@@ -3176,7 +3176,7 @@
                 <w:szCs w:val="22"/>
                 <w:rtl/>
               </w:rPr>
-              <w:t xml:space="preserve"> كيوبت) على جهازين، وطابق القرار النهائي الحل الدقيق. ننشر الأهداف التي فشلت وكيف أصلحناها، ولا ندّعي تفوقًا كمّيًا. الشبكات اصطناعية، لكن النتائج تشير إلى أن الأنظمة يمكن أن تحتوي الهجوم دون أن توقف خدماتها.</w:t>
+              <w:t xml:space="preserve"> كيوبت) على جهازين، وطابق القرار النهائي الحل الدقيق. ننشر الأهداف التي فشلت وكيف أصلحناها، ولا ندّعي تفوقًا كمّيًا. الشبكات الحقيقية مُعاد بناؤها جزئيًا من التقارير العامة، والنتائج تشير إلى أن الأنظمة يمكن أن تحتوي الهجوم دون أن توقف خدماتها متى وصل التنبيه.</w:t>
             </w:r>
           </w:p>
         </w:tc>
@@ -5998,16 +5998,33 @@
                 <w:szCs w:val="22"/>
                 <w:rtl/>
               </w:rPr>
-              <w:t xml:space="preserve">سؤال البحث:</w:t>
-            </w:r>
-            <w:r>
-              <w:rPr>
-                <w:rFonts w:ascii="Arial" w:hAnsi="Arial" w:cs="Arial"/>
-                <w:sz w:val="22"/>
-                <w:szCs w:val="22"/>
-                <w:rtl/>
-              </w:rPr>
-              <w:t xml:space="preserve"> هل يحقق نموذج احتواء تكيفي ببوابة سلامة احتواءً مقاربًا للعزل الكامل، مع إيقاف خدمات أقل، ودون كسر أي قاعدة سلامة؟</w:t>
+              <w:t xml:space="preserve">سؤال البحث</w:t>
+            </w:r>
+            <w:r>
+              <w:rPr>
+                <w:rFonts w:ascii="Arial" w:hAnsi="Arial" w:cs="Arial"/>
+                <w:sz w:val="22"/>
+                <w:szCs w:val="22"/>
+                <w:rtl/>
+              </w:rPr>
+              <w:t xml:space="preserve"> (القسم </w:t>
+            </w:r>
+            <w:r>
+              <w:rPr>
+                <w:rFonts w:ascii="Arial" w:hAnsi="Arial" w:cs="Arial"/>
+                <w:sz w:val="22"/>
+                <w:szCs w:val="22"/>
+              </w:rPr>
+              <w:t xml:space="preserve">2)</w:t>
+            </w:r>
+            <w:r>
+              <w:rPr>
+                <w:rFonts w:ascii="Arial" w:hAnsi="Arial" w:cs="Arial"/>
+                <w:sz w:val="22"/>
+                <w:szCs w:val="22"/>
+                <w:rtl/>
+              </w:rPr>
+              <w:t xml:space="preserve"> يتحول هنا إلى فرضيات قابلة للقياس.</w:t>
             </w:r>
           </w:p>
           <w:p>
@@ -7724,7 +7741,7 @@
               <w:drawing>
                 <wp:inline distT="0" distB="0" distL="0" distR="0">
                   <wp:extent cx="5900000" cy="3003636"/>
-                  <wp:docPr id="9001" name="Figure 1" descr="شكل 3: الرسم الهندسي للنظام — عشرة مكوّنات وواجهاتها، وما يُقاس عند كل واجهة، ومنصّات الاختبار الأربع التي تُختبر عليها «الدائرة» نفسها"/>
+                  <wp:docPr id="9001" name="Figure 1" descr="شكل 1: الرسم الهندسي للنظام — عشرة مكوّنات وواجهاتها، وما يُقاس عند كل واجهة، ومنصّات الاختبار الأربع التي تُختبر عليها «الدائرة» نفسها"/>
                   <wp:cNvGraphicFramePr>
                     <a:graphicFrameLocks xmlns:a="http://schemas.openxmlformats.org/drawingml/2006/main" noChangeAspect="1"/>
                   </wp:cNvGraphicFramePr>
@@ -7786,7 +7803,7 @@
                 <w:sz w:val="18"/>
                 <w:szCs w:val="18"/>
               </w:rPr>
-              <w:t xml:space="preserve">3</w:t>
+              <w:t xml:space="preserve">1</w:t>
             </w:r>
             <w:r>
               <w:rPr>
@@ -8555,28 +8572,6 @@
             <w:r>
               <w:rPr>
                 <w:rFonts w:ascii="Arial" w:hAnsi="Arial" w:cs="Arial"/>
-                <w:sz w:val="22"/>
-                <w:szCs w:val="22"/>
-                <w:rtl/>
-              </w:rPr>
-              <w:t xml:space="preserve">المنهجية تجريبية مقارنة: نفس سيناريوهات الهجوم تُعطى لعدة طرق قرار، وتُقيَّم كلها بالمعايير نفسها المسجلة مسبقًا.</w:t>
-            </w:r>
-          </w:p>
-          <w:p>
-            <w:pPr>
-              <w:bidi/>
-              <w:spacing w:after="100" w:line="300" w:lineRule="auto"/>
-              <w:jc w:val="both"/>
-              <w:rPr>
-                <w:rFonts w:ascii="Arial" w:hAnsi="Arial" w:cs="Arial"/>
-                <w:sz w:val="22"/>
-                <w:szCs w:val="22"/>
-                <w:rtl/>
-              </w:rPr>
-            </w:pPr>
-            <w:r>
-              <w:rPr>
-                <w:rFonts w:ascii="Arial" w:hAnsi="Arial" w:cs="Arial"/>
                 <w:b/>
                 <w:bCs/>
                 <w:sz w:val="22"/>
@@ -8627,7 +8622,7 @@
                 <w:sz w:val="22"/>
                 <w:szCs w:val="22"/>
               </w:rPr>
-              <w:t xml:space="preserve">12</w:t>
+              <w:t xml:space="preserve">15</w:t>
             </w:r>
             <w:r>
               <w:rPr>
@@ -8661,7 +8656,7 @@
                 <w:sz w:val="22"/>
                 <w:szCs w:val="22"/>
               </w:rPr>
-              <w:t xml:space="preserve">v10</w:t>
+              <w:t xml:space="preserve">v13</w:t>
             </w:r>
             <w:r>
               <w:rPr>
@@ -9121,7 +9116,7 @@
                       <w:szCs w:val="19"/>
                       <w:rtl/>
                     </w:rPr>
-                    <w:t xml:space="preserve">+ تركيبي، </w:t>
+                    <w:t xml:space="preserve">+ تركيبي، و</w:t>
                   </w:r>
                   <w:r>
                     <w:rPr>
@@ -9138,7 +9133,7 @@
                       <w:szCs w:val="19"/>
                       <w:rtl/>
                     </w:rPr>
-                    <w:t xml:space="preserve"> واقعي)</w:t>
+                    <w:t xml:space="preserve"> واقعي لكل السياسات)</w:t>
                   </w:r>
                 </w:p>
               </w:tc>
@@ -10089,7 +10084,7 @@
                       <w:szCs w:val="19"/>
                       <w:rtl/>
                     </w:rPr>
-                    <w:t xml:space="preserve"> تنبيه/ثانية</w:t>
+                    <w:t xml:space="preserve"> تنبيه دفعة واحدة</w:t>
                   </w:r>
                 </w:p>
               </w:tc>
@@ -12606,7 +12601,7 @@
                       <w:sz w:val="19"/>
                       <w:szCs w:val="19"/>
                     </w:rPr>
-                    <w:t xml:space="preserve">128</w:t>
+                    <w:t xml:space="preserve">135</w:t>
                   </w:r>
                   <w:r>
                     <w:rPr>
@@ -13068,7 +13063,41 @@
                 <w:szCs w:val="22"/>
                 <w:rtl/>
               </w:rPr>
-              <w:t xml:space="preserve"> الشبكات اصطناعية (صحية وصناعية ومصرفية وجامعية)، والأوزان افتراضات تصميم منشورة ومختبرة بالحساسية، والتنبيهات مُعطاة (النظام لا يكشف الهجوم بنفسه).</w:t>
+              <w:t xml:space="preserve"> الشبكات اصطناعية حتى </w:t>
+            </w:r>
+            <w:r>
+              <w:rPr>
+                <w:rFonts w:ascii="Arial" w:hAnsi="Arial" w:cs="Arial"/>
+                <w:sz w:val="22"/>
+                <w:szCs w:val="22"/>
+              </w:rPr>
+              <w:t xml:space="preserve">v10</w:t>
+            </w:r>
+            <w:r>
+              <w:rPr>
+                <w:rFonts w:ascii="Arial" w:hAnsi="Arial" w:cs="Arial"/>
+                <w:sz w:val="22"/>
+                <w:szCs w:val="22"/>
+                <w:rtl/>
+              </w:rPr>
+              <w:t xml:space="preserve">، ومُعاد بناؤها من تقارير عامة في </w:t>
+            </w:r>
+            <w:r>
+              <w:rPr>
+                <w:rFonts w:ascii="Arial" w:hAnsi="Arial" w:cs="Arial"/>
+                <w:sz w:val="22"/>
+                <w:szCs w:val="22"/>
+              </w:rPr>
+              <w:t xml:space="preserve">v11/v12</w:t>
+            </w:r>
+            <w:r>
+              <w:rPr>
+                <w:rFonts w:ascii="Arial" w:hAnsi="Arial" w:cs="Arial"/>
+                <w:sz w:val="22"/>
+                <w:szCs w:val="22"/>
+                <w:rtl/>
+              </w:rPr>
+              <w:t xml:space="preserve">، والأوزان افتراضات تصميم منشورة ومختبرة بالحساسية، والتنبيهات مُعطاة (النظام لا يكشف الهجوم بنفسه).</w:t>
             </w:r>
           </w:p>
         </w:tc>
@@ -14588,7 +14617,7 @@
               <w:drawing>
                 <wp:inline distT="0" distB="0" distL="0" distR="0">
                   <wp:extent cx="5900000" cy="1984545"/>
-                  <wp:docPr id="9002" name="Figure 2" descr="شكل 1: الاحتواء والخدمات المتوقفة لأربع طرق قرار على نفس 259 سلسلة هجوم"/>
+                  <wp:docPr id="9002" name="Figure 2" descr="شكل 2: الاحتواء والخدمات المتوقفة لأربع طرق قرار على نفس 259 سلسلة هجوم"/>
                   <wp:cNvGraphicFramePr>
                     <a:graphicFrameLocks xmlns:a="http://schemas.openxmlformats.org/drawingml/2006/main" noChangeAspect="1"/>
                   </wp:cNvGraphicFramePr>
@@ -14650,7 +14679,7 @@
                 <w:sz w:val="18"/>
                 <w:szCs w:val="18"/>
               </w:rPr>
-              <w:t xml:space="preserve">1</w:t>
+              <w:t xml:space="preserve">2</w:t>
             </w:r>
             <w:r>
               <w:rPr>
@@ -18414,7 +18443,7 @@
                 <w:sz w:val="19"/>
                 <w:szCs w:val="19"/>
               </w:rPr>
-              <w:t xml:space="preserve">3</w:t>
+              <w:t xml:space="preserve">5</w:t>
             </w:r>
             <w:r>
               <w:rPr>
@@ -20155,7 +20184,7 @@
                 <w:sz w:val="22"/>
                 <w:szCs w:val="22"/>
               </w:rPr>
-              <w:t xml:space="preserve">2)</w:t>
+              <w:t xml:space="preserve">3)</w:t>
             </w:r>
             <w:r>
               <w:rPr>
@@ -20314,7 +20343,7 @@
                 <w:sz w:val="22"/>
                 <w:szCs w:val="22"/>
               </w:rPr>
-              <w:t xml:space="preserve">12/16</w:t>
+              <w:t xml:space="preserve">4/16</w:t>
             </w:r>
             <w:r>
               <w:rPr>
@@ -20490,7 +20519,7 @@
                 <w:sz w:val="22"/>
                 <w:szCs w:val="22"/>
               </w:rPr>
-              <w:t xml:space="preserve">71</w:t>
+              <w:t xml:space="preserve">71–98</w:t>
             </w:r>
             <w:r>
               <w:rPr>
@@ -20516,7 +20545,41 @@
                 <w:szCs w:val="22"/>
                 <w:rtl/>
               </w:rPr>
-              <w:t xml:space="preserve"> بتطبيق بايثون نقي.</w:t>
+              <w:t xml:space="preserve"> بتطبيق بايثون نقي، بينما حقق </w:t>
+            </w:r>
+            <w:r>
+              <w:rPr>
+                <w:rFonts w:ascii="Arial" w:hAnsi="Arial" w:cs="Arial"/>
+                <w:sz w:val="22"/>
+                <w:szCs w:val="22"/>
+              </w:rPr>
+              <w:t xml:space="preserve">ML-DSA-44</w:t>
+            </w:r>
+            <w:r>
+              <w:rPr>
+                <w:rFonts w:ascii="Arial" w:hAnsi="Arial" w:cs="Arial"/>
+                <w:sz w:val="22"/>
+                <w:szCs w:val="22"/>
+                <w:rtl/>
+              </w:rPr>
+              <w:t xml:space="preserve"> الهدف (</w:t>
+            </w:r>
+            <w:r>
+              <w:rPr>
+                <w:rFonts w:ascii="Arial" w:hAnsi="Arial" w:cs="Arial"/>
+                <w:sz w:val="22"/>
+                <w:szCs w:val="22"/>
+              </w:rPr>
+              <w:t xml:space="preserve">40)</w:t>
+            </w:r>
+            <w:r>
+              <w:rPr>
+                <w:rFonts w:ascii="Arial" w:hAnsi="Arial" w:cs="Arial"/>
+                <w:sz w:val="22"/>
+                <w:szCs w:val="22"/>
+                <w:rtl/>
+              </w:rPr>
+              <w:t xml:space="preserve">.</w:t>
             </w:r>
           </w:p>
           <w:p>
@@ -20654,7 +20717,7 @@
               <w:drawing>
                 <wp:inline distT="0" distB="0" distL="0" distR="0">
                   <wp:extent cx="5900000" cy="2520909"/>
-                  <wp:docPr id="9003" name="Figure 3" descr="شكل 2: الأهداف الأربعة التي فشلت في v8 وقيمها بعد الإصلاح في v9 على بيانات جديدة"/>
+                  <wp:docPr id="9003" name="Figure 3" descr="شكل 3: الأهداف الأربعة التي فشلت في v8 وقيمها بعد الإصلاح في v9 على بيانات جديدة"/>
                   <wp:cNvGraphicFramePr>
                     <a:graphicFrameLocks xmlns:a="http://schemas.openxmlformats.org/drawingml/2006/main" noChangeAspect="1"/>
                   </wp:cNvGraphicFramePr>
@@ -20716,7 +20779,7 @@
                 <w:sz w:val="18"/>
                 <w:szCs w:val="18"/>
               </w:rPr>
-              <w:t xml:space="preserve">2</w:t>
+              <w:t xml:space="preserve">3</w:t>
             </w:r>
             <w:r>
               <w:rPr>
@@ -22043,7 +22106,7 @@
                 <w:sz w:val="22"/>
                 <w:szCs w:val="22"/>
               </w:rPr>
-              <w:t xml:space="preserve">128</w:t>
+              <w:t xml:space="preserve">135</w:t>
             </w:r>
             <w:r>
               <w:rPr>

</xml_diff>

<commit_message>
Ibdaa form v12: independent fact-check applied — every '0 services down' labelled pre-approval (+164 pending for full isolation, 9/6 after approval), v12 kernel p95 118 ms disclosed next to v9's 41, 16/16 marked in-sample vs 91% on 75 new incidents, pre-registration from v2 (v1 prototype), 0.55 on the same 259 chains, E8 angle+noise not separated, QPU solved 75/132 variables, factory 1 silent / 2.8%, Wazuh-style 99.5% and 13 unsafe, control-group result (23 open paths to critical), refs/labels corrected; RESULTS_v12 timing synced
Co-Authored-By: Claude Opus 5.5 <noreply@anthropic.com>
Claude-Session: https://claude.ai/code/session_013B4LPWZWgdrx1XoL9LPLxx
</commit_message>
<xml_diff>
--- a/docs/qacrs/form_drafts/IBDAA_2027_FORM_ACRS_v12.docx
+++ b/docs/qacrs/form_drafts/IBDAA_2027_FORM_ACRS_v12.docx
@@ -2559,7 +2559,7 @@
                 <w:szCs w:val="22"/>
                 <w:rtl/>
               </w:rPr>
-              <w:t xml:space="preserve">سجّلنا معايير النجاح في </w:t>
+              <w:t xml:space="preserve">من الإصدار الثاني سجّلنا معايير النجاح في </w:t>
             </w:r>
             <w:r>
               <w:rPr>
@@ -2712,7 +2712,24 @@
                 <w:szCs w:val="22"/>
                 <w:rtl/>
               </w:rPr>
-              <w:t xml:space="preserve"> خدمات متوقفة مقابل </w:t>
+              <w:t xml:space="preserve"> خدمات متوقفة (قبل موافقة البشر على </w:t>
+            </w:r>
+            <w:r>
+              <w:rPr>
+                <w:rFonts w:ascii="Arial" w:hAnsi="Arial" w:cs="Arial"/>
+                <w:sz w:val="22"/>
+                <w:szCs w:val="22"/>
+              </w:rPr>
+              <w:t xml:space="preserve">6</w:t>
+            </w:r>
+            <w:r>
+              <w:rPr>
+                <w:rFonts w:ascii="Arial" w:hAnsi="Arial" w:cs="Arial"/>
+                <w:sz w:val="22"/>
+                <w:szCs w:val="22"/>
+                <w:rtl/>
+              </w:rPr>
+              <w:t xml:space="preserve"> إحالات) مقابل </w:t>
             </w:r>
             <w:r>
               <w:rPr>
@@ -2729,7 +2746,7 @@
                 <w:szCs w:val="22"/>
                 <w:rtl/>
               </w:rPr>
-              <w:t xml:space="preserve">، ودون أي فشل صامت. وتأكدت النتيجة على بيانات جديدة تمامًا (</w:t>
+              <w:t xml:space="preserve"> للعزل الكامل، ودون أي فشل صامت. وتأكدت النتيجة على بيانات جديدة تمامًا (</w:t>
             </w:r>
             <w:r>
               <w:rPr>
@@ -3001,7 +3018,7 @@
                 <w:szCs w:val="22"/>
                 <w:rtl/>
               </w:rPr>
-              <w:t xml:space="preserve"> و</w:t>
+              <w:t xml:space="preserve"> على الحوادث الثماني التي صُمّمت الأرضية بعدها، و</w:t>
             </w:r>
             <w:r>
               <w:rPr>
@@ -3018,7 +3035,24 @@
                 <w:szCs w:val="22"/>
                 <w:rtl/>
               </w:rPr>
-              <w:t xml:space="preserve">، والخدمات المتوقفة بعد الموافقات أقل من القاعدة والعزل الكامل، دائمًا بشرط وصول التنبيه. وطابق السلوك الحقيقي النموذج في </w:t>
+              <w:t xml:space="preserve"> على </w:t>
+            </w:r>
+            <w:r>
+              <w:rPr>
+                <w:rFonts w:ascii="Arial" w:hAnsi="Arial" w:cs="Arial"/>
+                <w:sz w:val="22"/>
+                <w:szCs w:val="22"/>
+              </w:rPr>
+              <w:t xml:space="preserve">75</w:t>
+            </w:r>
+            <w:r>
+              <w:rPr>
+                <w:rFonts w:ascii="Arial" w:hAnsi="Arial" w:cs="Arial"/>
+                <w:sz w:val="22"/>
+                <w:szCs w:val="22"/>
+                <w:rtl/>
+              </w:rPr>
+              <w:t xml:space="preserve"> حادثة جديدة، والخدمات المتوقفة بعد الموافقات أقل من القاعدة والعزل الكامل، دائمًا بشرط وصول التنبيه. وطابق السلوك الحقيقي النموذج في </w:t>
             </w:r>
             <w:r>
               <w:rPr>
@@ -3069,7 +3103,24 @@
                 <w:szCs w:val="22"/>
                 <w:rtl/>
               </w:rPr>
-              <w:t xml:space="preserve">، ولم تستطع التنبيهات المزوّرة إجبار النظام على إيقاف أي خدمة.</w:t>
+              <w:t xml:space="preserve"> على السيناريوهات التركيبية و</w:t>
+            </w:r>
+            <w:r>
+              <w:rPr>
+                <w:rFonts w:ascii="Arial" w:hAnsi="Arial" w:cs="Arial"/>
+                <w:sz w:val="22"/>
+                <w:szCs w:val="22"/>
+              </w:rPr>
+              <w:t xml:space="preserve">118</w:t>
+            </w:r>
+            <w:r>
+              <w:rPr>
+                <w:rFonts w:ascii="Arial" w:hAnsi="Arial" w:cs="Arial"/>
+                <w:sz w:val="22"/>
+                <w:szCs w:val="22"/>
+                <w:rtl/>
+              </w:rPr>
+              <w:t xml:space="preserve"> على الحوادث الحقيقية، ولم تستطع التنبيهات المزوّرة إجبار النظام على إيقاف أي خدمة.</w:t>
             </w:r>
           </w:p>
           <w:p>
@@ -3108,7 +3159,7 @@
                 <w:szCs w:val="22"/>
                 <w:rtl/>
               </w:rPr>
-              <w:t xml:space="preserve"> قرار حادث في شبكة من أربعة مواقع (</w:t>
+              <w:t xml:space="preserve"> الجزء المترابط من قرار حادث في شبكة من أربعة مواقع (</w:t>
             </w:r>
             <w:r>
               <w:rPr>
@@ -3125,7 +3176,41 @@
                 <w:szCs w:val="22"/>
                 <w:rtl/>
               </w:rPr>
-              <w:t xml:space="preserve"> جهازًا): وجد الأمثل في </w:t>
+              <w:t xml:space="preserve"> جهازًا، </w:t>
+            </w:r>
+            <w:r>
+              <w:rPr>
+                <w:rFonts w:ascii="Arial" w:hAnsi="Arial" w:cs="Arial"/>
+                <w:sz w:val="22"/>
+                <w:szCs w:val="22"/>
+              </w:rPr>
+              <w:t xml:space="preserve">75</w:t>
+            </w:r>
+            <w:r>
+              <w:rPr>
+                <w:rFonts w:ascii="Arial" w:hAnsi="Arial" w:cs="Arial"/>
+                <w:sz w:val="22"/>
+                <w:szCs w:val="22"/>
+                <w:rtl/>
+              </w:rPr>
+              <w:t xml:space="preserve"> من </w:t>
+            </w:r>
+            <w:r>
+              <w:rPr>
+                <w:rFonts w:ascii="Arial" w:hAnsi="Arial" w:cs="Arial"/>
+                <w:sz w:val="22"/>
+                <w:szCs w:val="22"/>
+              </w:rPr>
+              <w:t xml:space="preserve">132</w:t>
+            </w:r>
+            <w:r>
+              <w:rPr>
+                <w:rFonts w:ascii="Arial" w:hAnsi="Arial" w:cs="Arial"/>
+                <w:sz w:val="22"/>
+                <w:szCs w:val="22"/>
+                <w:rtl/>
+              </w:rPr>
+              <w:t xml:space="preserve"> متغيرًا): وجد الأمثل في </w:t>
             </w:r>
             <w:r>
               <w:rPr>
@@ -3159,24 +3244,7 @@
                 <w:szCs w:val="22"/>
                 <w:rtl/>
               </w:rPr>
-              <w:t xml:space="preserve"> مسألة (</w:t>
-            </w:r>
-            <w:r>
-              <w:rPr>
-                <w:rFonts w:ascii="Arial" w:hAnsi="Arial" w:cs="Arial"/>
-                <w:sz w:val="22"/>
-                <w:szCs w:val="22"/>
-              </w:rPr>
-              <w:t xml:space="preserve">75</w:t>
-            </w:r>
-            <w:r>
-              <w:rPr>
-                <w:rFonts w:ascii="Arial" w:hAnsi="Arial" w:cs="Arial"/>
-                <w:sz w:val="22"/>
-                <w:szCs w:val="22"/>
-                <w:rtl/>
-              </w:rPr>
-              <w:t xml:space="preserve"> كيوبت) على جهازين، وطابق القرار النهائي الحل الدقيق. ننشر الأهداف التي فشلت وكيف أصلحناها، ولا ندّعي تفوقًا كمّيًا. الشبكات الحقيقية مُعاد بناؤها جزئيًا من التقارير العامة، والنتائج تشير إلى أن الأنظمة يمكن أن تحتوي الهجوم دون أن توقف خدماتها متى وصل التنبيه.</w:t>
+              <w:t xml:space="preserve"> مسألة على جهازين، وطابق القرار النهائي الحل الدقيق. ننشر الأهداف التي فشلت وكيف أصلحناها، ولا ندّعي تفوقًا كمّيًا. الشبكات الحقيقية مُعاد بناؤها جزئيًا من التقارير العامة، والنتائج تشير إلى أن الأنظمة يمكن أن تحتوي الهجوم دون أن توقف خدماتها متى وصل التنبيه.</w:t>
             </w:r>
           </w:p>
         </w:tc>
@@ -6057,7 +6125,7 @@
                 <w:szCs w:val="22"/>
                 <w:rtl/>
               </w:rPr>
-              <w:t xml:space="preserve"> (كلها مثبتة في </w:t>
+              <w:t xml:space="preserve"> (مثبتة في </w:t>
             </w:r>
             <w:r>
               <w:rPr>
@@ -6074,7 +6142,24 @@
                 <w:szCs w:val="22"/>
                 <w:rtl/>
               </w:rPr>
-              <w:t xml:space="preserve"> قبل أي نتيجة):</w:t>
+              <w:t xml:space="preserve"> قبل نتائجها من </w:t>
+            </w:r>
+            <w:r>
+              <w:rPr>
+                <w:rFonts w:ascii="Arial" w:hAnsi="Arial" w:cs="Arial"/>
+                <w:sz w:val="22"/>
+                <w:szCs w:val="22"/>
+              </w:rPr>
+              <w:t xml:space="preserve">v2</w:t>
+            </w:r>
+            <w:r>
+              <w:rPr>
+                <w:rFonts w:ascii="Arial" w:hAnsi="Arial" w:cs="Arial"/>
+                <w:sz w:val="22"/>
+                <w:szCs w:val="22"/>
+                <w:rtl/>
+              </w:rPr>
+              <w:t xml:space="preserve"> فصاعدًا):</w:t>
             </w:r>
           </w:p>
           <w:p>
@@ -6795,7 +6880,24 @@
                 <w:szCs w:val="22"/>
                 <w:rtl/>
               </w:rPr>
-              <w:t xml:space="preserve">، وخدمات متوقفة بعد الموافقات ≤ القاعدة البسيطة؛ المقياس يُحسب </w:t>
+              <w:t xml:space="preserve">، وخدمات متوقفة بعد الموافقات ≤ القاعدة البسيطة؛ وأضاف تسجيل </w:t>
+            </w:r>
+            <w:r>
+              <w:rPr>
+                <w:rFonts w:ascii="Arial" w:hAnsi="Arial" w:cs="Arial"/>
+                <w:sz w:val="22"/>
+                <w:szCs w:val="22"/>
+              </w:rPr>
+              <w:t xml:space="preserve">v12</w:t>
+            </w:r>
+            <w:r>
+              <w:rPr>
+                <w:rFonts w:ascii="Arial" w:hAnsi="Arial" w:cs="Arial"/>
+                <w:sz w:val="22"/>
+                <w:szCs w:val="22"/>
+                <w:rtl/>
+              </w:rPr>
+              <w:t xml:space="preserve"> حساب الخدمات المتوقفة </w:t>
             </w:r>
             <w:r>
               <w:rPr>
@@ -7424,15 +7526,15 @@
                 <w:szCs w:val="22"/>
                 <w:rtl/>
               </w:rPr>
-              <w:t xml:space="preserve"> قناة المهاجم والحركة الجانبية فقط، فتبقى الخدمة تعمل. هذا رفع نسبة الاحتواء من </w:t>
-            </w:r>
-            <w:r>
-              <w:rPr>
-                <w:rFonts w:ascii="Arial" w:hAnsi="Arial" w:cs="Arial"/>
-                <w:sz w:val="22"/>
-                <w:szCs w:val="22"/>
-              </w:rPr>
-              <w:t xml:space="preserve">0.56</w:t>
+              <w:t xml:space="preserve"> قناة المهاجم والحركة الجانبية فقط، فتبقى الخدمة تعمل. ورفع هذا الاحتواء من </w:t>
+            </w:r>
+            <w:r>
+              <w:rPr>
+                <w:rFonts w:ascii="Arial" w:hAnsi="Arial" w:cs="Arial"/>
+                <w:sz w:val="22"/>
+                <w:szCs w:val="22"/>
+              </w:rPr>
+              <w:t xml:space="preserve">0.55</w:t>
             </w:r>
             <w:r>
               <w:rPr>
@@ -7458,7 +7560,24 @@
                 <w:szCs w:val="22"/>
                 <w:rtl/>
               </w:rPr>
-              <w:t xml:space="preserve">.</w:t>
+              <w:t xml:space="preserve"> على نفس </w:t>
+            </w:r>
+            <w:r>
+              <w:rPr>
+                <w:rFonts w:ascii="Arial" w:hAnsi="Arial" w:cs="Arial"/>
+                <w:sz w:val="22"/>
+                <w:szCs w:val="22"/>
+              </w:rPr>
+              <w:t xml:space="preserve">259</w:t>
+            </w:r>
+            <w:r>
+              <w:rPr>
+                <w:rFonts w:ascii="Arial" w:hAnsi="Arial" w:cs="Arial"/>
+                <w:sz w:val="22"/>
+                <w:szCs w:val="22"/>
+                <w:rtl/>
+              </w:rPr>
+              <w:t xml:space="preserve"> سلسلة.</w:t>
             </w:r>
           </w:p>
           <w:p>
@@ -7604,7 +7723,7 @@
                 <w:szCs w:val="22"/>
                 <w:rtl/>
               </w:rPr>
-              <w:t xml:space="preserve"> بها وجد الحاسوب الكمّي الأمثل الدقيق لقرار </w:t>
+              <w:t xml:space="preserve"> بها وجد الحاسوب الكمّي الأمثل الدقيق للجزء المترابط من قرار </w:t>
             </w:r>
             <w:r>
               <w:rPr>
@@ -8631,7 +8750,58 @@
                 <w:szCs w:val="22"/>
                 <w:rtl/>
               </w:rPr>
-              <w:t xml:space="preserve"> تسجيلًا مسبقًا من </w:t>
+              <w:t xml:space="preserve"> تسجيلًا: </w:t>
+            </w:r>
+            <w:r>
+              <w:rPr>
+                <w:rFonts w:ascii="Arial" w:hAnsi="Arial" w:cs="Arial"/>
+                <w:sz w:val="22"/>
+                <w:szCs w:val="22"/>
+              </w:rPr>
+              <w:t xml:space="preserve">v2–v13</w:t>
+            </w:r>
+            <w:r>
+              <w:rPr>
+                <w:rFonts w:ascii="Arial" w:hAnsi="Arial" w:cs="Arial"/>
+                <w:sz w:val="22"/>
+                <w:szCs w:val="22"/>
+                <w:rtl/>
+              </w:rPr>
+              <w:t xml:space="preserve"> و</w:t>
+            </w:r>
+            <w:r>
+              <w:rPr>
+                <w:rFonts w:ascii="Arial" w:hAnsi="Arial" w:cs="Arial"/>
+                <w:sz w:val="22"/>
+                <w:szCs w:val="22"/>
+              </w:rPr>
+              <w:t xml:space="preserve">E8</w:t>
+            </w:r>
+            <w:r>
+              <w:rPr>
+                <w:rFonts w:ascii="Arial" w:hAnsi="Arial" w:cs="Arial"/>
+                <w:sz w:val="22"/>
+                <w:szCs w:val="22"/>
+                <w:rtl/>
+              </w:rPr>
+              <w:t xml:space="preserve"> و</w:t>
+            </w:r>
+            <w:r>
+              <w:rPr>
+                <w:rFonts w:ascii="Arial" w:hAnsi="Arial" w:cs="Arial"/>
+                <w:sz w:val="22"/>
+                <w:szCs w:val="22"/>
+              </w:rPr>
+              <w:t xml:space="preserve">E9</w:t>
+            </w:r>
+            <w:r>
+              <w:rPr>
+                <w:rFonts w:ascii="Arial" w:hAnsi="Arial" w:cs="Arial"/>
+                <w:sz w:val="22"/>
+                <w:szCs w:val="22"/>
+                <w:rtl/>
+              </w:rPr>
+              <w:t xml:space="preserve"> والاختبار الأعمى؛ و</w:t>
             </w:r>
             <w:r>
               <w:rPr>
@@ -8648,58 +8818,7 @@
                 <w:szCs w:val="22"/>
                 <w:rtl/>
               </w:rPr>
-              <w:t xml:space="preserve"> إلى </w:t>
-            </w:r>
-            <w:r>
-              <w:rPr>
-                <w:rFonts w:ascii="Arial" w:hAnsi="Arial" w:cs="Arial"/>
-                <w:sz w:val="22"/>
-                <w:szCs w:val="22"/>
-              </w:rPr>
-              <w:t xml:space="preserve">v13</w:t>
-            </w:r>
-            <w:r>
-              <w:rPr>
-                <w:rFonts w:ascii="Arial" w:hAnsi="Arial" w:cs="Arial"/>
-                <w:sz w:val="22"/>
-                <w:szCs w:val="22"/>
-                <w:rtl/>
-              </w:rPr>
-              <w:t xml:space="preserve"> و</w:t>
-            </w:r>
-            <w:r>
-              <w:rPr>
-                <w:rFonts w:ascii="Arial" w:hAnsi="Arial" w:cs="Arial"/>
-                <w:sz w:val="22"/>
-                <w:szCs w:val="22"/>
-              </w:rPr>
-              <w:t xml:space="preserve">E8</w:t>
-            </w:r>
-            <w:r>
-              <w:rPr>
-                <w:rFonts w:ascii="Arial" w:hAnsi="Arial" w:cs="Arial"/>
-                <w:sz w:val="22"/>
-                <w:szCs w:val="22"/>
-                <w:rtl/>
-              </w:rPr>
-              <w:t xml:space="preserve"> و</w:t>
-            </w:r>
-            <w:r>
-              <w:rPr>
-                <w:rFonts w:ascii="Arial" w:hAnsi="Arial" w:cs="Arial"/>
-                <w:sz w:val="22"/>
-                <w:szCs w:val="22"/>
-              </w:rPr>
-              <w:t xml:space="preserve">E9</w:t>
-            </w:r>
-            <w:r>
-              <w:rPr>
-                <w:rFonts w:ascii="Arial" w:hAnsi="Arial" w:cs="Arial"/>
-                <w:sz w:val="22"/>
-                <w:szCs w:val="22"/>
-                <w:rtl/>
-              </w:rPr>
-              <w:t xml:space="preserve"> والاختبار الأعمى).</w:t>
+              <w:t xml:space="preserve"> نموذج أولي سبق التسجيل).</w:t>
             </w:r>
           </w:p>
           <w:p>
@@ -9409,16 +9528,7 @@
                       <w:sz w:val="19"/>
                       <w:szCs w:val="19"/>
                     </w:rPr>
-                    <w:t xml:space="preserve">IBM (156</w:t>
-                  </w:r>
-                  <w:r>
-                    <w:rPr>
-                      <w:rFonts w:ascii="Arial" w:hAnsi="Arial" w:cs="Arial"/>
-                      <w:sz w:val="19"/>
-                      <w:szCs w:val="19"/>
-                      <w:rtl/>
-                    </w:rPr>
-                    <w:t xml:space="preserve"> كيوبت)</w:t>
+                    <w:t xml:space="preserve">IBM</w:t>
                   </w:r>
                 </w:p>
               </w:tc>
@@ -11244,7 +11354,7 @@
                 <w:sz w:val="22"/>
                 <w:szCs w:val="22"/>
               </w:rPr>
-              <w:t xml:space="preserve">NAO</w:t>
+              <w:t xml:space="preserve">NAO [1]</w:t>
             </w:r>
             <w:r>
               <w:rPr>
@@ -11278,33 +11388,16 @@
                 <w:sz w:val="22"/>
                 <w:szCs w:val="22"/>
               </w:rPr>
-              <w:t xml:space="preserve">PwC</w:t>
-            </w:r>
-            <w:r>
-              <w:rPr>
-                <w:rFonts w:ascii="Arial" w:hAnsi="Arial" w:cs="Arial"/>
-                <w:sz w:val="22"/>
-                <w:szCs w:val="22"/>
-                <w:rtl/>
-              </w:rPr>
-              <w:t xml:space="preserve"> وشهادات الكونغرس </w:t>
-            </w:r>
-            <w:r>
-              <w:rPr>
-                <w:rFonts w:ascii="Arial" w:hAnsi="Arial" w:cs="Arial"/>
-                <w:sz w:val="22"/>
-                <w:szCs w:val="22"/>
-              </w:rPr>
-              <w:t xml:space="preserve">[18]</w:t>
-            </w:r>
-            <w:r>
-              <w:rPr>
-                <w:rFonts w:ascii="Arial" w:hAnsi="Arial" w:cs="Arial"/>
-                <w:sz w:val="22"/>
-                <w:szCs w:val="22"/>
-                <w:rtl/>
-              </w:rPr>
-              <w:t xml:space="preserve">): </w:t>
+              <w:t xml:space="preserve">PwC [18]</w:t>
+            </w:r>
+            <w:r>
+              <w:rPr>
+                <w:rFonts w:ascii="Arial" w:hAnsi="Arial" w:cs="Arial"/>
+                <w:sz w:val="22"/>
+                <w:szCs w:val="22"/>
+                <w:rtl/>
+              </w:rPr>
+              <w:t xml:space="preserve"> وشهادات الكونغرس): </w:t>
             </w:r>
             <w:r>
               <w:rPr>
@@ -11423,7 +11516,24 @@
                 <w:szCs w:val="22"/>
                 <w:rtl/>
               </w:rPr>
-              <w:t xml:space="preserve"> سيناريو من مولّد واقعي جديد؛ المحوّل هنا نموذج ذكاء اصطناعي لا إنسان مستقل، وهذا مذكور في كل جدول.</w:t>
+              <w:t xml:space="preserve"> سيناريو من مولّد واقعي جديد؛ المحوّل هنا نموذج ذكاء اصطناعي لا إنسان مستقل، وهذا مذكور في الجدول </w:t>
+            </w:r>
+            <w:r>
+              <w:rPr>
+                <w:rFonts w:ascii="Arial" w:hAnsi="Arial" w:cs="Arial"/>
+                <w:sz w:val="22"/>
+                <w:szCs w:val="22"/>
+              </w:rPr>
+              <w:t xml:space="preserve">5</w:t>
+            </w:r>
+            <w:r>
+              <w:rPr>
+                <w:rFonts w:ascii="Arial" w:hAnsi="Arial" w:cs="Arial"/>
+                <w:sz w:val="22"/>
+                <w:szCs w:val="22"/>
+                <w:rtl/>
+              </w:rPr>
+              <w:t xml:space="preserve">.</w:t>
             </w:r>
           </w:p>
           <w:p>
@@ -11753,7 +11863,41 @@
                 <w:sz w:val="22"/>
                 <w:szCs w:val="22"/>
               </w:rPr>
-              <w:t xml:space="preserve">v12)</w:t>
+              <w:t xml:space="preserve">v12</w:t>
+            </w:r>
+            <w:r>
+              <w:rPr>
+                <w:rFonts w:ascii="Arial" w:hAnsi="Arial" w:cs="Arial"/>
+                <w:sz w:val="22"/>
+                <w:szCs w:val="22"/>
+                <w:rtl/>
+              </w:rPr>
+              <w:t xml:space="preserve">؛ زمن القطع: الوسيط </w:t>
+            </w:r>
+            <w:r>
+              <w:rPr>
+                <w:rFonts w:ascii="Arial" w:hAnsi="Arial" w:cs="Arial"/>
+                <w:sz w:val="22"/>
+                <w:szCs w:val="22"/>
+              </w:rPr>
+              <w:t xml:space="preserve">10</w:t>
+            </w:r>
+            <w:r>
+              <w:rPr>
+                <w:rFonts w:ascii="Arial" w:hAnsi="Arial" w:cs="Arial"/>
+                <w:sz w:val="22"/>
+                <w:szCs w:val="22"/>
+                <w:rtl/>
+              </w:rPr>
+              <w:t xml:space="preserve"> مللي ثانية و</w:t>
+            </w:r>
+            <w:r>
+              <w:rPr>
+                <w:rFonts w:ascii="Arial" w:hAnsi="Arial" w:cs="Arial"/>
+                <w:sz w:val="22"/>
+                <w:szCs w:val="22"/>
+              </w:rPr>
+              <w:t xml:space="preserve">p95 = 118)</w:t>
             </w:r>
             <w:r>
               <w:rPr>
@@ -11770,7 +11914,7 @@
                 <w:sz w:val="22"/>
                 <w:szCs w:val="22"/>
               </w:rPr>
-              <w:t xml:space="preserve">2.2</w:t>
+              <w:t xml:space="preserve">2.3</w:t>
             </w:r>
             <w:r>
               <w:rPr>
@@ -11804,7 +11948,7 @@
                 <w:sz w:val="22"/>
                 <w:szCs w:val="22"/>
               </w:rPr>
-              <w:t xml:space="preserve">p95 = 9.2)</w:t>
+              <w:t xml:space="preserve">p95 = 9.8)</w:t>
             </w:r>
             <w:r>
               <w:rPr>
@@ -11923,33 +12067,16 @@
                 <w:sz w:val="22"/>
                 <w:szCs w:val="22"/>
               </w:rPr>
-              <w:t xml:space="preserve">ibm_fez</w:t>
-            </w:r>
-            <w:r>
-              <w:rPr>
-                <w:rFonts w:ascii="Arial" w:hAnsi="Arial" w:cs="Arial"/>
-                <w:sz w:val="22"/>
-                <w:szCs w:val="22"/>
-                <w:rtl/>
-              </w:rPr>
-              <w:t xml:space="preserve">، </w:t>
-            </w:r>
-            <w:r>
-              <w:rPr>
-                <w:rFonts w:ascii="Arial" w:hAnsi="Arial" w:cs="Arial"/>
-                <w:sz w:val="22"/>
-                <w:szCs w:val="22"/>
-              </w:rPr>
-              <w:t xml:space="preserve">156</w:t>
-            </w:r>
-            <w:r>
-              <w:rPr>
-                <w:rFonts w:ascii="Arial" w:hAnsi="Arial" w:cs="Arial"/>
-                <w:sz w:val="22"/>
-                <w:szCs w:val="22"/>
-                <w:rtl/>
-              </w:rPr>
-              <w:t xml:space="preserve"> كيوبت): نضبط زوايا </w:t>
+              <w:t xml:space="preserve">ibm_fez)</w:t>
+            </w:r>
+            <w:r>
+              <w:rPr>
+                <w:rFonts w:ascii="Arial" w:hAnsi="Arial" w:cs="Arial"/>
+                <w:sz w:val="22"/>
+                <w:szCs w:val="22"/>
+                <w:rtl/>
+              </w:rPr>
+              <w:t xml:space="preserve">: نضبط زوايا </w:t>
             </w:r>
             <w:r>
               <w:rPr>
@@ -12834,7 +12961,7 @@
                 <w:szCs w:val="22"/>
                 <w:rtl/>
               </w:rPr>
-              <w:t xml:space="preserve"> سلسلة هجوم لكل شبكة ببذور جديدة. وقارنّا الحل الدقيق (</w:t>
+              <w:t xml:space="preserve"> سلسلة لكل شبكة قبل حذف المكرر، ببذور جديدة. وقارنّا الحل الدقيق (</w:t>
             </w:r>
             <w:r>
               <w:rPr>
@@ -12962,7 +13089,24 @@
                 <w:szCs w:val="22"/>
                 <w:rtl/>
               </w:rPr>
-              <w:t xml:space="preserve"> يعيد النتائج الأساسية في </w:t>
+              <w:t xml:space="preserve"> يعيد ملفات نتائج </w:t>
+            </w:r>
+            <w:r>
+              <w:rPr>
+                <w:rFonts w:ascii="Arial" w:hAnsi="Arial" w:cs="Arial"/>
+                <w:sz w:val="22"/>
+                <w:szCs w:val="22"/>
+              </w:rPr>
+              <w:t xml:space="preserve">v7/v8</w:t>
+            </w:r>
+            <w:r>
+              <w:rPr>
+                <w:rFonts w:ascii="Arial" w:hAnsi="Arial" w:cs="Arial"/>
+                <w:sz w:val="22"/>
+                <w:szCs w:val="22"/>
+                <w:rtl/>
+              </w:rPr>
+              <w:t xml:space="preserve"> الأساسية في </w:t>
             </w:r>
             <w:r>
               <w:rPr>
@@ -12979,7 +13123,7 @@
                 <w:szCs w:val="22"/>
                 <w:rtl/>
               </w:rPr>
-              <w:t xml:space="preserve"> ثانية، وأعطى نتائج مطابقة من نسخة جديدة من المستودع. ملاحظة: الإصدارات </w:t>
+              <w:t xml:space="preserve"> ثانية، وأعطى نتائج مطابقة (عدا الأزمنة) من نسخة جديدة. ملاحظة: </w:t>
             </w:r>
             <w:r>
               <w:rPr>
@@ -12996,24 +13140,7 @@
                 <w:szCs w:val="22"/>
                 <w:rtl/>
               </w:rPr>
-              <w:t xml:space="preserve"> من </w:t>
-            </w:r>
-            <w:r>
-              <w:rPr>
-                <w:rFonts w:ascii="Arial" w:hAnsi="Arial" w:cs="Arial"/>
-                <w:sz w:val="22"/>
-                <w:szCs w:val="22"/>
-              </w:rPr>
-              <w:t xml:space="preserve">ACRS</w:t>
-            </w:r>
-            <w:r>
-              <w:rPr>
-                <w:rFonts w:ascii="Arial" w:hAnsi="Arial" w:cs="Arial"/>
-                <w:sz w:val="22"/>
-                <w:szCs w:val="22"/>
-                <w:rtl/>
-              </w:rPr>
-              <w:t xml:space="preserve"> تظهر في التسجيلات المسبقة وملفات النتائج باسم </w:t>
+              <w:t xml:space="preserve"> تظهر في المستودع باسم </w:t>
             </w:r>
             <w:r>
               <w:rPr>
@@ -13030,7 +13157,7 @@
                 <w:szCs w:val="22"/>
                 <w:rtl/>
               </w:rPr>
-              <w:t xml:space="preserve"> (اسم المحرّك آنذاك)، وتركناها دون تعديل حفاظًا على سجلها الزمني.</w:t>
+              <w:t xml:space="preserve"> (اسم المحرّك آنذاك).</w:t>
             </w:r>
           </w:p>
           <w:p>
@@ -13627,7 +13754,24 @@
                 <w:szCs w:val="22"/>
                 <w:rtl/>
               </w:rPr>
-              <w:t xml:space="preserve"> خدمات متوقفة مقابل </w:t>
+              <w:t xml:space="preserve"> خدمات متوقفة (قبل موافقة البشر على </w:t>
+            </w:r>
+            <w:r>
+              <w:rPr>
+                <w:rFonts w:ascii="Arial" w:hAnsi="Arial" w:cs="Arial"/>
+                <w:sz w:val="22"/>
+                <w:szCs w:val="22"/>
+              </w:rPr>
+              <w:t xml:space="preserve">6</w:t>
+            </w:r>
+            <w:r>
+              <w:rPr>
+                <w:rFonts w:ascii="Arial" w:hAnsi="Arial" w:cs="Arial"/>
+                <w:sz w:val="22"/>
+                <w:szCs w:val="22"/>
+                <w:rtl/>
+              </w:rPr>
+              <w:t xml:space="preserve"> إحالات) مقابل </w:t>
             </w:r>
             <w:r>
               <w:rPr>
@@ -13873,7 +14017,7 @@
                       <w:szCs w:val="19"/>
                       <w:rtl/>
                     </w:rPr>
-                    <w:t xml:space="preserve">إحالة للبشر</w:t>
+                    <w:t xml:space="preserve">إحالة للبشر أو موافقة شخصين</w:t>
                   </w:r>
                 </w:p>
               </w:tc>
@@ -14043,7 +14187,7 @@
                       <w:sz w:val="19"/>
                       <w:szCs w:val="19"/>
                     </w:rPr>
-                    <w:t xml:space="preserve">0</w:t>
+                    <w:t xml:space="preserve">164</w:t>
                   </w:r>
                 </w:p>
               </w:tc>
@@ -15292,7 +15436,58 @@
                 <w:szCs w:val="22"/>
                 <w:rtl/>
               </w:rPr>
-              <w:t xml:space="preserve"> خدمات متوقفة، و</w:t>
+              <w:t xml:space="preserve"> خدمات متوقفة قبل الموافقات (وبعدها </w:t>
+            </w:r>
+            <w:r>
+              <w:rPr>
+                <w:rFonts w:ascii="Arial" w:hAnsi="Arial" w:cs="Arial"/>
+                <w:sz w:val="22"/>
+                <w:szCs w:val="22"/>
+              </w:rPr>
+              <w:t xml:space="preserve">9</w:t>
+            </w:r>
+            <w:r>
+              <w:rPr>
+                <w:rFonts w:ascii="Arial" w:hAnsi="Arial" w:cs="Arial"/>
+                <w:sz w:val="22"/>
+                <w:szCs w:val="22"/>
+                <w:rtl/>
+              </w:rPr>
+              <w:t xml:space="preserve"> على السلاسل، و</w:t>
+            </w:r>
+            <w:r>
+              <w:rPr>
+                <w:rFonts w:ascii="Arial" w:hAnsi="Arial" w:cs="Arial"/>
+                <w:sz w:val="22"/>
+                <w:szCs w:val="22"/>
+              </w:rPr>
+              <w:t xml:space="preserve">6</w:t>
+            </w:r>
+            <w:r>
+              <w:rPr>
+                <w:rFonts w:ascii="Arial" w:hAnsi="Arial" w:cs="Arial"/>
+                <w:sz w:val="22"/>
+                <w:szCs w:val="22"/>
+                <w:rtl/>
+              </w:rPr>
+              <w:t xml:space="preserve"> لـ </w:t>
+            </w:r>
+            <w:r>
+              <w:rPr>
+                <w:rFonts w:ascii="Arial" w:hAnsi="Arial" w:cs="Arial"/>
+                <w:sz w:val="22"/>
+                <w:szCs w:val="22"/>
+              </w:rPr>
+              <w:t xml:space="preserve">v12)</w:t>
+            </w:r>
+            <w:r>
+              <w:rPr>
+                <w:rFonts w:ascii="Arial" w:hAnsi="Arial" w:cs="Arial"/>
+                <w:sz w:val="22"/>
+                <w:szCs w:val="22"/>
+                <w:rtl/>
+              </w:rPr>
+              <w:t xml:space="preserve">، و</w:t>
             </w:r>
             <w:r>
               <w:rPr>
@@ -15545,7 +15740,7 @@
                       <w:szCs w:val="19"/>
                       <w:rtl/>
                     </w:rPr>
-                    <w:t xml:space="preserve">خدمات متوقفة (</w:t>
+                    <w:t xml:space="preserve">خدمات متوقفة قبل الموافقات (</w:t>
                   </w:r>
                   <w:r>
                     <w:rPr>
@@ -16254,7 +16449,58 @@
                 <w:szCs w:val="22"/>
                 <w:rtl/>
               </w:rPr>
-              <w:t xml:space="preserve"> فشل صامت. وكل سلاسل الهجوم مربوطة بتقنيات </w:t>
+              <w:t xml:space="preserve"> فشل صامت على السلاسل، وفشل صامت واحد في </w:t>
+            </w:r>
+            <w:r>
+              <w:rPr>
+                <w:rFonts w:ascii="Arial" w:hAnsi="Arial" w:cs="Arial"/>
+                <w:sz w:val="22"/>
+                <w:szCs w:val="22"/>
+              </w:rPr>
+              <w:t xml:space="preserve">199</w:t>
+            </w:r>
+            <w:r>
+              <w:rPr>
+                <w:rFonts w:ascii="Arial" w:hAnsi="Arial" w:cs="Arial"/>
+                <w:sz w:val="22"/>
+                <w:szCs w:val="22"/>
+                <w:rtl/>
+              </w:rPr>
+              <w:t xml:space="preserve"> مجموعة عشوائية بالمصنع (الحد الأعلى </w:t>
+            </w:r>
+            <w:r>
+              <w:rPr>
+                <w:rFonts w:ascii="Arial" w:hAnsi="Arial" w:cs="Arial"/>
+                <w:sz w:val="22"/>
+                <w:szCs w:val="22"/>
+              </w:rPr>
+              <w:t xml:space="preserve">2.8%</w:t>
+            </w:r>
+            <w:r>
+              <w:rPr>
+                <w:rFonts w:ascii="Arial" w:hAnsi="Arial" w:cs="Arial"/>
+                <w:sz w:val="22"/>
+                <w:szCs w:val="22"/>
+                <w:rtl/>
+              </w:rPr>
+              <w:t xml:space="preserve">، فوق الحد المسجل </w:t>
+            </w:r>
+            <w:r>
+              <w:rPr>
+                <w:rFonts w:ascii="Arial" w:hAnsi="Arial" w:cs="Arial"/>
+                <w:sz w:val="22"/>
+                <w:szCs w:val="22"/>
+              </w:rPr>
+              <w:t xml:space="preserve">2%)</w:t>
+            </w:r>
+            <w:r>
+              <w:rPr>
+                <w:rFonts w:ascii="Arial" w:hAnsi="Arial" w:cs="Arial"/>
+                <w:sz w:val="22"/>
+                <w:szCs w:val="22"/>
+                <w:rtl/>
+              </w:rPr>
+              <w:t xml:space="preserve">. وكل سلاسل الهجوم مربوطة بتقنيات </w:t>
             </w:r>
             <w:r>
               <w:rPr>
@@ -16715,7 +16961,15 @@
                       <w:szCs w:val="19"/>
                       <w:rtl/>
                     </w:rPr>
-                    <w:t xml:space="preserve"> تنبيه في دقيقة</w:t>
+                    <w:t xml:space="preserve"> تنبيه في دقيقة (</w:t>
+                  </w:r>
+                  <w:r>
+                    <w:rPr>
+                      <w:rFonts w:ascii="Arial" w:hAnsi="Arial" w:cs="Arial"/>
+                      <w:sz w:val="19"/>
+                      <w:szCs w:val="19"/>
+                    </w:rPr>
+                    <w:t xml:space="preserve">v8)</w:t>
                   </w:r>
                 </w:p>
               </w:tc>
@@ -17070,7 +17324,7 @@
                       <w:szCs w:val="19"/>
                       <w:rtl/>
                     </w:rPr>
-                    <w:t xml:space="preserve">، والوسيط </w:t>
+                    <w:t xml:space="preserve"> والوسيط </w:t>
                   </w:r>
                   <w:r>
                     <w:rPr>
@@ -17079,6 +17333,108 @@
                       <w:szCs w:val="19"/>
                     </w:rPr>
                     <w:t xml:space="preserve">11</w:t>
+                  </w:r>
+                  <w:r>
+                    <w:rPr>
+                      <w:rFonts w:ascii="Arial" w:hAnsi="Arial" w:cs="Arial"/>
+                      <w:sz w:val="19"/>
+                      <w:szCs w:val="19"/>
+                      <w:rtl/>
+                    </w:rPr>
+                    <w:t xml:space="preserve"> على </w:t>
+                  </w:r>
+                  <w:r>
+                    <w:rPr>
+                      <w:rFonts w:ascii="Arial" w:hAnsi="Arial" w:cs="Arial"/>
+                      <w:sz w:val="19"/>
+                      <w:szCs w:val="19"/>
+                    </w:rPr>
+                    <w:t xml:space="preserve">200</w:t>
+                  </w:r>
+                  <w:r>
+                    <w:rPr>
+                      <w:rFonts w:ascii="Arial" w:hAnsi="Arial" w:cs="Arial"/>
+                      <w:sz w:val="19"/>
+                      <w:szCs w:val="19"/>
+                      <w:rtl/>
+                    </w:rPr>
+                    <w:t xml:space="preserve"> قرار تركيبي (</w:t>
+                  </w:r>
+                  <w:r>
+                    <w:rPr>
+                      <w:rFonts w:ascii="Arial" w:hAnsi="Arial" w:cs="Arial"/>
+                      <w:sz w:val="19"/>
+                      <w:szCs w:val="19"/>
+                    </w:rPr>
+                    <w:t xml:space="preserve">v9)</w:t>
+                  </w:r>
+                  <w:r>
+                    <w:rPr>
+                      <w:rFonts w:ascii="Arial" w:hAnsi="Arial" w:cs="Arial"/>
+                      <w:sz w:val="19"/>
+                      <w:szCs w:val="19"/>
+                      <w:rtl/>
+                    </w:rPr>
+                    <w:t xml:space="preserve">؛ و</w:t>
+                  </w:r>
+                  <w:r>
+                    <w:rPr>
+                      <w:rFonts w:ascii="Arial" w:hAnsi="Arial" w:cs="Arial"/>
+                      <w:sz w:val="19"/>
+                      <w:szCs w:val="19"/>
+                    </w:rPr>
+                    <w:t xml:space="preserve">118 (p95)</w:t>
+                  </w:r>
+                  <w:r>
+                    <w:rPr>
+                      <w:rFonts w:ascii="Arial" w:hAnsi="Arial" w:cs="Arial"/>
+                      <w:sz w:val="19"/>
+                      <w:szCs w:val="19"/>
+                      <w:rtl/>
+                    </w:rPr>
+                    <w:t xml:space="preserve"> والوسيط </w:t>
+                  </w:r>
+                  <w:r>
+                    <w:rPr>
+                      <w:rFonts w:ascii="Arial" w:hAnsi="Arial" w:cs="Arial"/>
+                      <w:sz w:val="19"/>
+                      <w:szCs w:val="19"/>
+                    </w:rPr>
+                    <w:t xml:space="preserve">10</w:t>
+                  </w:r>
+                  <w:r>
+                    <w:rPr>
+                      <w:rFonts w:ascii="Arial" w:hAnsi="Arial" w:cs="Arial"/>
+                      <w:sz w:val="19"/>
+                      <w:szCs w:val="19"/>
+                      <w:rtl/>
+                    </w:rPr>
+                    <w:t xml:space="preserve"> على </w:t>
+                  </w:r>
+                  <w:r>
+                    <w:rPr>
+                      <w:rFonts w:ascii="Arial" w:hAnsi="Arial" w:cs="Arial"/>
+                      <w:sz w:val="19"/>
+                      <w:szCs w:val="19"/>
+                    </w:rPr>
+                    <w:t xml:space="preserve">66</w:t>
+                  </w:r>
+                  <w:r>
+                    <w:rPr>
+                      <w:rFonts w:ascii="Arial" w:hAnsi="Arial" w:cs="Arial"/>
+                      <w:sz w:val="19"/>
+                      <w:szCs w:val="19"/>
+                      <w:rtl/>
+                    </w:rPr>
+                    <w:t xml:space="preserve"> سيناريو حقيقي وواقعي (</w:t>
+                  </w:r>
+                  <w:r>
+                    <w:rPr>
+                      <w:rFonts w:ascii="Arial" w:hAnsi="Arial" w:cs="Arial"/>
+                      <w:sz w:val="19"/>
+                      <w:szCs w:val="19"/>
+                    </w:rPr>
+                    <w:t xml:space="preserve">v12)</w:t>
                   </w:r>
                 </w:p>
               </w:tc>
@@ -17755,7 +18111,7 @@
                       <w:szCs w:val="19"/>
                       <w:rtl/>
                     </w:rPr>
-                    <w:t xml:space="preserve"> بعد إصلاح الزوايا (</w:t>
+                    <w:t xml:space="preserve"> بعد توسيع الزوايا وتقليل الضوضاء (</w:t>
                   </w:r>
                   <w:r>
                     <w:rPr>
@@ -18272,7 +18628,24 @@
                 <w:szCs w:val="22"/>
                 <w:rtl/>
               </w:rPr>
-              <w:t xml:space="preserve"> دون تغيير على حوادث حقيقية، فكان آمنًا (</w:t>
+              <w:t xml:space="preserve"> دون تغيير على حوادث حقيقية، فكان آمنًا على الـ</w:t>
+            </w:r>
+            <w:r>
+              <w:rPr>
+                <w:rFonts w:ascii="Arial" w:hAnsi="Arial" w:cs="Arial"/>
+                <w:sz w:val="22"/>
+                <w:szCs w:val="22"/>
+              </w:rPr>
+              <w:t xml:space="preserve">16</w:t>
+            </w:r>
+            <w:r>
+              <w:rPr>
+                <w:rFonts w:ascii="Arial" w:hAnsi="Arial" w:cs="Arial"/>
+                <w:sz w:val="22"/>
+                <w:szCs w:val="22"/>
+                <w:rtl/>
+              </w:rPr>
+              <w:t xml:space="preserve"> لحظة (</w:t>
             </w:r>
             <w:r>
               <w:rPr>
@@ -18306,7 +18679,24 @@
                 <w:szCs w:val="22"/>
                 <w:rtl/>
               </w:rPr>
-              <w:t xml:space="preserve"> صامت) لكنه أحال </w:t>
+              <w:t xml:space="preserve"> صامت؛ لكن فشلًا صامتًا واحدًا في الكوربس و</w:t>
+            </w:r>
+            <w:r>
+              <w:rPr>
+                <w:rFonts w:ascii="Arial" w:hAnsi="Arial" w:cs="Arial"/>
+                <w:sz w:val="22"/>
+                <w:szCs w:val="22"/>
+              </w:rPr>
+              <w:t xml:space="preserve">6</w:t>
+            </w:r>
+            <w:r>
+              <w:rPr>
+                <w:rFonts w:ascii="Arial" w:hAnsi="Arial" w:cs="Arial"/>
+                <w:sz w:val="22"/>
+                <w:szCs w:val="22"/>
+                <w:rtl/>
+              </w:rPr>
+              <w:t xml:space="preserve"> في المولّد الواقعي) وأحال </w:t>
             </w:r>
             <w:r>
               <w:rPr>
@@ -18454,7 +18844,7 @@
                 <w:szCs w:val="19"/>
                 <w:rtl/>
               </w:rPr>
-              <w:t xml:space="preserve">: الهجمات الحقيقية — خمس سياسات على السيناريوهات نفسها، الخدمات المتوقفة تُحسب بعد موافقة البشر على كل تصعيد</w:t>
+              <w:t xml:space="preserve">: الهجمات الحقيقية — خمس سياسات على السيناريوهات نفسها، الخدمات المتوقفة بعد موافقة البشر على كل تصعيد، والمحوّل نموذج ذكاء اصطناعي</w:t>
             </w:r>
           </w:p>
           <w:tbl>
@@ -18732,7 +19122,7 @@
                       <w:szCs w:val="19"/>
                       <w:rtl/>
                     </w:rPr>
-                    <w:t xml:space="preserve"> لحظة): احتواء تلقائي</w:t>
+                    <w:t xml:space="preserve"> لحظة، صُمّمت الأرضية بعدها): احتواء تلقائي</w:t>
                   </w:r>
                 </w:p>
               </w:tc>
@@ -19064,7 +19454,7 @@
                       <w:szCs w:val="19"/>
                       <w:rtl/>
                     </w:rPr>
-                    <w:t xml:space="preserve"> حادثة مفتوحة المصدر </w:t>
+                    <w:t xml:space="preserve"> حادثة جديدة مفتوحة المصدر </w:t>
                   </w:r>
                   <w:r>
                     <w:rPr>
@@ -19185,7 +19575,7 @@
                       <w:sz w:val="19"/>
                       <w:szCs w:val="19"/>
                     </w:rPr>
-                    <w:t xml:space="preserve">100%</w:t>
+                    <w:t xml:space="preserve">99.5%</w:t>
                   </w:r>
                 </w:p>
               </w:tc>
@@ -19649,7 +20039,126 @@
                 <w:szCs w:val="22"/>
                 <w:rtl/>
               </w:rPr>
-              <w:t xml:space="preserve"> جهاز سليم معزول. وأهم ما في الأمر حادثة </w:t>
+              <w:t xml:space="preserve"> جهاز سليم معزول، بينما اتخذ نمط «عزل كل مُنبَّه عليه» </w:t>
+            </w:r>
+            <w:r>
+              <w:rPr>
+                <w:rFonts w:ascii="Arial" w:hAnsi="Arial" w:cs="Arial"/>
+                <w:sz w:val="22"/>
+                <w:szCs w:val="22"/>
+              </w:rPr>
+              <w:t xml:space="preserve">13</w:t>
+            </w:r>
+            <w:r>
+              <w:rPr>
+                <w:rFonts w:ascii="Arial" w:hAnsi="Arial" w:cs="Arial"/>
+                <w:sz w:val="22"/>
+                <w:szCs w:val="22"/>
+                <w:rtl/>
+              </w:rPr>
+              <w:t xml:space="preserve"> قرارًا غير آمن (</w:t>
+            </w:r>
+            <w:r>
+              <w:rPr>
+                <w:rFonts w:ascii="Arial" w:hAnsi="Arial" w:cs="Arial"/>
+                <w:sz w:val="22"/>
+                <w:szCs w:val="22"/>
+              </w:rPr>
+              <w:t xml:space="preserve">12 + 1)</w:t>
+            </w:r>
+            <w:r>
+              <w:rPr>
+                <w:rFonts w:ascii="Arial" w:hAnsi="Arial" w:cs="Arial"/>
+                <w:sz w:val="22"/>
+                <w:szCs w:val="22"/>
+                <w:rtl/>
+              </w:rPr>
+              <w:t xml:space="preserve">. وبلا حماية (المجموعة الضابطة) بقي في </w:t>
+            </w:r>
+            <w:r>
+              <w:rPr>
+                <w:rFonts w:ascii="Arial" w:hAnsi="Arial" w:cs="Arial"/>
+                <w:sz w:val="22"/>
+                <w:szCs w:val="22"/>
+              </w:rPr>
+              <w:t xml:space="preserve">8</w:t>
+            </w:r>
+            <w:r>
+              <w:rPr>
+                <w:rFonts w:ascii="Arial" w:hAnsi="Arial" w:cs="Arial"/>
+                <w:sz w:val="22"/>
+                <w:szCs w:val="22"/>
+                <w:rtl/>
+              </w:rPr>
+              <w:t xml:space="preserve"> من الـ</w:t>
+            </w:r>
+            <w:r>
+              <w:rPr>
+                <w:rFonts w:ascii="Arial" w:hAnsi="Arial" w:cs="Arial"/>
+                <w:sz w:val="22"/>
+                <w:szCs w:val="22"/>
+              </w:rPr>
+              <w:t xml:space="preserve">16</w:t>
+            </w:r>
+            <w:r>
+              <w:rPr>
+                <w:rFonts w:ascii="Arial" w:hAnsi="Arial" w:cs="Arial"/>
+                <w:sz w:val="22"/>
+                <w:szCs w:val="22"/>
+                <w:rtl/>
+              </w:rPr>
+              <w:t xml:space="preserve"> لحظة </w:t>
+            </w:r>
+            <w:r>
+              <w:rPr>
+                <w:rFonts w:ascii="Arial" w:hAnsi="Arial" w:cs="Arial"/>
+                <w:sz w:val="22"/>
+                <w:szCs w:val="22"/>
+              </w:rPr>
+              <w:t xml:space="preserve">23</w:t>
+            </w:r>
+            <w:r>
+              <w:rPr>
+                <w:rFonts w:ascii="Arial" w:hAnsi="Arial" w:cs="Arial"/>
+                <w:sz w:val="22"/>
+                <w:szCs w:val="22"/>
+                <w:rtl/>
+              </w:rPr>
+              <w:t xml:space="preserve"> مسارًا مفتوحًا إلى خوادم حرجة، و</w:t>
+            </w:r>
+            <w:r>
+              <w:rPr>
+                <w:rFonts w:ascii="Arial" w:hAnsi="Arial" w:cs="Arial"/>
+                <w:sz w:val="22"/>
+                <w:szCs w:val="22"/>
+              </w:rPr>
+              <w:t xml:space="preserve">0</w:t>
+            </w:r>
+            <w:r>
+              <w:rPr>
+                <w:rFonts w:ascii="Arial" w:hAnsi="Arial" w:cs="Arial"/>
+                <w:sz w:val="22"/>
+                <w:szCs w:val="22"/>
+                <w:rtl/>
+              </w:rPr>
+              <w:t xml:space="preserve"> بعد قرار </w:t>
+            </w:r>
+            <w:r>
+              <w:rPr>
+                <w:rFonts w:ascii="Arial" w:hAnsi="Arial" w:cs="Arial"/>
+                <w:sz w:val="22"/>
+                <w:szCs w:val="22"/>
+              </w:rPr>
+              <w:t xml:space="preserve">v12</w:t>
+            </w:r>
+            <w:r>
+              <w:rPr>
+                <w:rFonts w:ascii="Arial" w:hAnsi="Arial" w:cs="Arial"/>
+                <w:sz w:val="22"/>
+                <w:szCs w:val="22"/>
+                <w:rtl/>
+              </w:rPr>
+              <w:t xml:space="preserve">. وأهم ما في الأمر حادثة </w:t>
             </w:r>
             <w:r>
               <w:rPr>
@@ -19802,7 +20311,58 @@
                 <w:szCs w:val="22"/>
                 <w:rtl/>
               </w:rPr>
-              <w:t xml:space="preserve"> مع كشف أفضل للحقن. ونُفّذت القرارات في نواة </w:t>
+              <w:t xml:space="preserve"> مع كشف أفضل للحقن الذكي (</w:t>
+            </w:r>
+            <w:r>
+              <w:rPr>
+                <w:rFonts w:ascii="Arial" w:hAnsi="Arial" w:cs="Arial"/>
+                <w:sz w:val="22"/>
+                <w:szCs w:val="22"/>
+              </w:rPr>
+              <w:t xml:space="preserve">158</w:t>
+            </w:r>
+            <w:r>
+              <w:rPr>
+                <w:rFonts w:ascii="Arial" w:hAnsi="Arial" w:cs="Arial"/>
+                <w:sz w:val="22"/>
+                <w:szCs w:val="22"/>
+                <w:rtl/>
+              </w:rPr>
+              <w:t xml:space="preserve"> مقابل </w:t>
+            </w:r>
+            <w:r>
+              <w:rPr>
+                <w:rFonts w:ascii="Arial" w:hAnsi="Arial" w:cs="Arial"/>
+                <w:sz w:val="22"/>
+                <w:szCs w:val="22"/>
+              </w:rPr>
+              <w:t xml:space="preserve">61</w:t>
+            </w:r>
+            <w:r>
+              <w:rPr>
+                <w:rFonts w:ascii="Arial" w:hAnsi="Arial" w:cs="Arial"/>
+                <w:sz w:val="22"/>
+                <w:szCs w:val="22"/>
+                <w:rtl/>
+              </w:rPr>
+              <w:t xml:space="preserve"> من </w:t>
+            </w:r>
+            <w:r>
+              <w:rPr>
+                <w:rFonts w:ascii="Arial" w:hAnsi="Arial" w:cs="Arial"/>
+                <w:sz w:val="22"/>
+                <w:szCs w:val="22"/>
+              </w:rPr>
+              <w:t xml:space="preserve">500)</w:t>
+            </w:r>
+            <w:r>
+              <w:rPr>
+                <w:rFonts w:ascii="Arial" w:hAnsi="Arial" w:cs="Arial"/>
+                <w:sz w:val="22"/>
+                <w:szCs w:val="22"/>
+                <w:rtl/>
+              </w:rPr>
+              <w:t xml:space="preserve">. ونُفّذت القرارات في نواة </w:t>
             </w:r>
             <w:r>
               <w:rPr>
@@ -20579,6 +21139,57 @@
                 <w:szCs w:val="22"/>
                 <w:rtl/>
               </w:rPr>
+              <w:t xml:space="preserve">. وزمن القطع في النواة على الحوادث الحقيقية </w:t>
+            </w:r>
+            <w:r>
+              <w:rPr>
+                <w:rFonts w:ascii="Arial" w:hAnsi="Arial" w:cs="Arial"/>
+                <w:sz w:val="22"/>
+                <w:szCs w:val="22"/>
+              </w:rPr>
+              <w:t xml:space="preserve">p95 = 118</w:t>
+            </w:r>
+            <w:r>
+              <w:rPr>
+                <w:rFonts w:ascii="Arial" w:hAnsi="Arial" w:cs="Arial"/>
+                <w:sz w:val="22"/>
+                <w:szCs w:val="22"/>
+                <w:rtl/>
+              </w:rPr>
+              <w:t xml:space="preserve"> مللي ثانية، فوق هدف </w:t>
+            </w:r>
+            <w:r>
+              <w:rPr>
+                <w:rFonts w:ascii="Arial" w:hAnsi="Arial" w:cs="Arial"/>
+                <w:sz w:val="22"/>
+                <w:szCs w:val="22"/>
+              </w:rPr>
+              <w:t xml:space="preserve">50</w:t>
+            </w:r>
+            <w:r>
+              <w:rPr>
+                <w:rFonts w:ascii="Arial" w:hAnsi="Arial" w:cs="Arial"/>
+                <w:sz w:val="22"/>
+                <w:szCs w:val="22"/>
+                <w:rtl/>
+              </w:rPr>
+              <w:t xml:space="preserve"> الذي تحقق على التركيبي (</w:t>
+            </w:r>
+            <w:r>
+              <w:rPr>
+                <w:rFonts w:ascii="Arial" w:hAnsi="Arial" w:cs="Arial"/>
+                <w:sz w:val="22"/>
+                <w:szCs w:val="22"/>
+              </w:rPr>
+              <w:t xml:space="preserve">41)</w:t>
+            </w:r>
+            <w:r>
+              <w:rPr>
+                <w:rFonts w:ascii="Arial" w:hAnsi="Arial" w:cs="Arial"/>
+                <w:sz w:val="22"/>
+                <w:szCs w:val="22"/>
+                <w:rtl/>
+              </w:rPr>
               <w:t xml:space="preserve">.</w:t>
             </w:r>
           </w:p>
@@ -20636,7 +21247,7 @@
                 <w:szCs w:val="22"/>
                 <w:rtl/>
               </w:rPr>
-              <w:t xml:space="preserve"> ← السبب مدى البحث عن الزوايا ← </w:t>
+              <w:t xml:space="preserve"> ← وسّعنا مدى الزوايا وأضفنا تقليل الضوضاء (لم نفصل أثرهما) ← </w:t>
             </w:r>
             <w:r>
               <w:rPr>
@@ -21355,7 +21966,7 @@
                 <w:szCs w:val="22"/>
                 <w:rtl/>
               </w:rPr>
-              <w:t xml:space="preserve"> دقيقة انتظار مرضى على </w:t>
+              <w:t xml:space="preserve"> دقيقة انتظار مرضى (قبل احتساب الإحالات للبشر) على </w:t>
             </w:r>
             <w:r>
               <w:rPr>
@@ -21967,7 +22578,7 @@
                 <w:szCs w:val="22"/>
                 <w:rtl/>
               </w:rPr>
-              <w:t xml:space="preserve">–  النموذج الرياضي، وبوابة السلامة، وإجراء التجزئة، وثلاثة عشر إصدارًا موثقًا بتسجيل مسبق (</w:t>
+              <w:t xml:space="preserve">–  النموذج الرياضي، وبوابة السلامة، وإجراء التجزئة، وثلاثة عشر إصدارًا موثقًا (</w:t>
             </w:r>
             <w:r>
               <w:rPr>
@@ -21984,7 +22595,7 @@
                 <w:szCs w:val="22"/>
                 <w:rtl/>
               </w:rPr>
-              <w:t xml:space="preserve">.</w:t>
+              <w:t xml:space="preserve">، منها اثنا عشر بتسجيل مسبق.</w:t>
             </w:r>
           </w:p>
           <w:p>

</xml_diff>

<commit_message>
Ibdaa form v12 final: references renumbered by first appearance (19), unmet targets phrased as result -> cause -> fix -> pre-registered next target, S8 plan row with the three next targets, figure 3 wording
Co-Authored-By: Claude Opus 5.5 <noreply@anthropic.com>
Claude-Session: https://claude.ai/code/session_013B4LPWZWgdrx1XoL9LPLxx
</commit_message>
<xml_diff>
--- a/docs/qacrs/form_drafts/IBDAA_2027_FORM_ACRS_v12.docx
+++ b/docs/qacrs/form_drafts/IBDAA_2027_FORM_ACRS_v12.docx
@@ -3244,7 +3244,7 @@
                 <w:szCs w:val="22"/>
                 <w:rtl/>
               </w:rPr>
-              <w:t xml:space="preserve"> مسألة على جهازين، وطابق القرار النهائي الحل الدقيق. ننشر الأهداف التي فشلت وكيف أصلحناها، ولا ندّعي تفوقًا كمّيًا. الشبكات الحقيقية مُعاد بناؤها جزئيًا من التقارير العامة، والنتائج تشير إلى أن الأنظمة يمكن أن تحتوي الهجوم دون أن توقف خدماتها متى وصل التنبيه.</w:t>
+              <w:t xml:space="preserve"> مسألة على جهازين، وطابق القرار النهائي الحل الدقيق. ننشر الأهداف التي لم تتحقق من أول مرة وكيف عالجناها، ولا ندّعي تفوقًا كمّيًا. الشبكات الحقيقية مُعاد بناؤها جزئيًا من التقارير العامة، والنتائج تشير إلى أن الأنظمة يمكن أن تحتوي الهجوم دون أن توقف خدماتها متى وصل التنبيه.</w:t>
             </w:r>
           </w:p>
         </w:tc>
@@ -3970,7 +3970,7 @@
                 <w:sz w:val="22"/>
                 <w:szCs w:val="22"/>
               </w:rPr>
-              <w:t xml:space="preserve">[4]</w:t>
+              <w:t xml:space="preserve">[3]</w:t>
             </w:r>
             <w:r>
               <w:rPr>
@@ -4205,7 +4205,7 @@
                 <w:sz w:val="22"/>
                 <w:szCs w:val="22"/>
               </w:rPr>
-              <w:t xml:space="preserve">[16]</w:t>
+              <w:t xml:space="preserve">[4]</w:t>
             </w:r>
             <w:r>
               <w:rPr>
@@ -4762,7 +4762,7 @@
                 <w:sz w:val="22"/>
                 <w:szCs w:val="22"/>
               </w:rPr>
-              <w:t xml:space="preserve">[8]</w:t>
+              <w:t xml:space="preserve">[5]</w:t>
             </w:r>
             <w:r>
               <w:rPr>
@@ -4779,7 +4779,7 @@
                 <w:sz w:val="22"/>
                 <w:szCs w:val="22"/>
               </w:rPr>
-              <w:t xml:space="preserve">[7]</w:t>
+              <w:t xml:space="preserve">[6]</w:t>
             </w:r>
             <w:r>
               <w:rPr>
@@ -4911,7 +4911,7 @@
                 <w:sz w:val="22"/>
                 <w:szCs w:val="22"/>
               </w:rPr>
-              <w:t xml:space="preserve">[3]</w:t>
+              <w:t xml:space="preserve">[7]</w:t>
             </w:r>
             <w:r>
               <w:rPr>
@@ -4968,7 +4968,7 @@
                 <w:sz w:val="22"/>
                 <w:szCs w:val="22"/>
               </w:rPr>
-              <w:t xml:space="preserve">[4]</w:t>
+              <w:t xml:space="preserve">[3]</w:t>
             </w:r>
             <w:r>
               <w:rPr>
@@ -5049,7 +5049,7 @@
                 <w:sz w:val="22"/>
                 <w:szCs w:val="22"/>
               </w:rPr>
-              <w:t xml:space="preserve">[5]</w:t>
+              <w:t xml:space="preserve">[8]</w:t>
             </w:r>
             <w:r>
               <w:rPr>
@@ -5106,7 +5106,7 @@
                 <w:sz w:val="22"/>
                 <w:szCs w:val="22"/>
               </w:rPr>
-              <w:t xml:space="preserve">[6]</w:t>
+              <w:t xml:space="preserve">[9]</w:t>
             </w:r>
             <w:r>
               <w:rPr>
@@ -5173,7 +5173,7 @@
                 <w:sz w:val="22"/>
                 <w:szCs w:val="22"/>
               </w:rPr>
-              <w:t xml:space="preserve">Ising [13][14]</w:t>
+              <w:t xml:space="preserve">Ising [10][11]</w:t>
             </w:r>
             <w:r>
               <w:rPr>
@@ -5190,7 +5190,7 @@
                 <w:sz w:val="22"/>
                 <w:szCs w:val="22"/>
               </w:rPr>
-              <w:t xml:space="preserve">QAOA [11]</w:t>
+              <w:t xml:space="preserve">QAOA [12]</w:t>
             </w:r>
             <w:r>
               <w:rPr>
@@ -5224,7 +5224,7 @@
                 <w:sz w:val="22"/>
                 <w:szCs w:val="22"/>
               </w:rPr>
-              <w:t xml:space="preserve">[12]</w:t>
+              <w:t xml:space="preserve">[13]</w:t>
             </w:r>
             <w:r>
               <w:rPr>
@@ -5298,7 +5298,7 @@
                 <w:sz w:val="22"/>
                 <w:szCs w:val="22"/>
               </w:rPr>
-              <w:t xml:space="preserve">QUBO [9]</w:t>
+              <w:t xml:space="preserve">QUBO [14]</w:t>
             </w:r>
             <w:r>
               <w:rPr>
@@ -5474,7 +5474,7 @@
                 <w:sz w:val="22"/>
                 <w:szCs w:val="22"/>
               </w:rPr>
-              <w:t xml:space="preserve">[10]</w:t>
+              <w:t xml:space="preserve">[15]</w:t>
             </w:r>
             <w:r>
               <w:rPr>
@@ -5575,7 +5575,7 @@
                 <w:sz w:val="22"/>
                 <w:szCs w:val="22"/>
               </w:rPr>
-              <w:t xml:space="preserve">7.0 [15]</w:t>
+              <w:t xml:space="preserve">7.0 [16]</w:t>
             </w:r>
             <w:r>
               <w:rPr>
@@ -7406,7 +7406,7 @@
                 <w:sz w:val="22"/>
                 <w:szCs w:val="22"/>
               </w:rPr>
-              <w:t xml:space="preserve">[5]</w:t>
+              <w:t xml:space="preserve">[8]</w:t>
             </w:r>
             <w:r>
               <w:rPr>
@@ -7440,7 +7440,7 @@
                 <w:sz w:val="22"/>
                 <w:szCs w:val="22"/>
               </w:rPr>
-              <w:t xml:space="preserve">[10]</w:t>
+              <w:t xml:space="preserve">[15]</w:t>
             </w:r>
             <w:r>
               <w:rPr>
@@ -7748,7 +7748,7 @@
                 <w:sz w:val="22"/>
                 <w:szCs w:val="22"/>
               </w:rPr>
-              <w:t xml:space="preserve">[10]</w:t>
+              <w:t xml:space="preserve">[15]</w:t>
             </w:r>
             <w:r>
               <w:rPr>
@@ -10928,7 +10928,7 @@
                       <w:sz w:val="19"/>
                       <w:szCs w:val="19"/>
                     </w:rPr>
-                    <w:t xml:space="preserve">CVSS [15])</w:t>
+                    <w:t xml:space="preserve">CVSS [16])</w:t>
                   </w:r>
                   <w:r>
                     <w:rPr>
@@ -11388,7 +11388,7 @@
                 <w:sz w:val="22"/>
                 <w:szCs w:val="22"/>
               </w:rPr>
-              <w:t xml:space="preserve">PwC [18]</w:t>
+              <w:t xml:space="preserve">PwC [17]</w:t>
             </w:r>
             <w:r>
               <w:rPr>
@@ -11473,7 +11473,7 @@
                 <w:sz w:val="22"/>
                 <w:szCs w:val="22"/>
               </w:rPr>
-              <w:t xml:space="preserve">MITRE Attack Flow [19]</w:t>
+              <w:t xml:space="preserve">MITRE Attack Flow [18]</w:t>
             </w:r>
             <w:r>
               <w:rPr>
@@ -20183,7 +20183,7 @@
                 <w:sz w:val="22"/>
                 <w:szCs w:val="22"/>
               </w:rPr>
-              <w:t xml:space="preserve">[18]</w:t>
+              <w:t xml:space="preserve">[17]</w:t>
             </w:r>
             <w:r>
               <w:rPr>
@@ -20522,16 +20522,16 @@
                 <w:szCs w:val="22"/>
                 <w:rtl/>
               </w:rPr>
-              <w:t xml:space="preserve">ما الذي فشل، وكيف أصلحناه.</w:t>
-            </w:r>
-            <w:r>
-              <w:rPr>
-                <w:rFonts w:ascii="Arial" w:hAnsi="Arial" w:cs="Arial"/>
-                <w:sz w:val="22"/>
-                <w:szCs w:val="22"/>
-                <w:rtl/>
-              </w:rPr>
-              <w:t xml:space="preserve"> النتائج الفاشلة منشورة كما هي، وكانت مصدر أهم التحسينات:</w:t>
+              <w:t xml:space="preserve">ما لم يتحقق من أول مرة، وكيف عالجناه.</w:t>
+            </w:r>
+            <w:r>
+              <w:rPr>
+                <w:rFonts w:ascii="Arial" w:hAnsi="Arial" w:cs="Arial"/>
+                <w:sz w:val="22"/>
+                <w:szCs w:val="22"/>
+                <w:rtl/>
+              </w:rPr>
+              <w:t xml:space="preserve"> ننشر كل نتيجة كما هي، وكانت هذه مصدر أهم التحسينات:</w:t>
             </w:r>
           </w:p>
           <w:p>
@@ -20702,7 +20702,7 @@
                 <w:szCs w:val="22"/>
                 <w:rtl/>
               </w:rPr>
-              <w:t xml:space="preserve">–  أربعة أهداف مسجلة فشلت في </w:t>
+              <w:t xml:space="preserve">–  أربعة أهداف مسجلة لم تتحقق في </w:t>
             </w:r>
             <w:r>
               <w:rPr>
@@ -20793,24 +20793,24 @@
                 <w:szCs w:val="22"/>
                 <w:rtl/>
               </w:rPr>
-              <w:t xml:space="preserve"> فشل هدف الاحتواء التلقائي (</w:t>
-            </w:r>
-            <w:r>
-              <w:rPr>
-                <w:rFonts w:ascii="Arial" w:hAnsi="Arial" w:cs="Arial"/>
-                <w:sz w:val="22"/>
-                <w:szCs w:val="22"/>
-              </w:rPr>
-              <w:t xml:space="preserve">31%</w:t>
-            </w:r>
-            <w:r>
-              <w:rPr>
-                <w:rFonts w:ascii="Arial" w:hAnsi="Arial" w:cs="Arial"/>
-                <w:sz w:val="22"/>
-                <w:szCs w:val="22"/>
-                <w:rtl/>
-              </w:rPr>
-              <w:t xml:space="preserve"> فقط) وتبيّن أن «</w:t>
+              <w:t xml:space="preserve"> لم يتحقق هدف الاحتواء التلقائي (</w:t>
+            </w:r>
+            <w:r>
+              <w:rPr>
+                <w:rFonts w:ascii="Arial" w:hAnsi="Arial" w:cs="Arial"/>
+                <w:sz w:val="22"/>
+                <w:szCs w:val="22"/>
+              </w:rPr>
+              <w:t xml:space="preserve">31%)</w:t>
+            </w:r>
+            <w:r>
+              <w:rPr>
+                <w:rFonts w:ascii="Arial" w:hAnsi="Arial" w:cs="Arial"/>
+                <w:sz w:val="22"/>
+                <w:szCs w:val="22"/>
+                <w:rtl/>
+              </w:rPr>
+              <w:t xml:space="preserve"> وتبيّن أن «</w:t>
             </w:r>
             <w:r>
               <w:rPr>
@@ -20969,7 +20969,7 @@
                 <w:szCs w:val="22"/>
                 <w:rtl/>
               </w:rPr>
-              <w:t xml:space="preserve"> فشل هدف «المناعة» بحادثة واحدة (عزل بوابة </w:t>
+              <w:t xml:space="preserve"> لم يتحقق هدف «المناعة» في حادثة واحدة (عزل بوابة </w:t>
             </w:r>
             <w:r>
               <w:rPr>
@@ -21156,7 +21156,7 @@
                 <w:szCs w:val="22"/>
                 <w:rtl/>
               </w:rPr>
-              <w:t xml:space="preserve"> مللي ثانية، فوق هدف </w:t>
+              <w:t xml:space="preserve"> مللي ثانية مقابل هدف </w:t>
             </w:r>
             <w:r>
               <w:rPr>
@@ -21173,7 +21173,7 @@
                 <w:szCs w:val="22"/>
                 <w:rtl/>
               </w:rPr>
-              <w:t xml:space="preserve"> الذي تحقق على التركيبي (</w:t>
+              <w:t xml:space="preserve"> تحقق على التركيبي (</w:t>
             </w:r>
             <w:r>
               <w:rPr>
@@ -21182,6 +21182,23 @@
                 <w:szCs w:val="22"/>
               </w:rPr>
               <w:t xml:space="preserve">41)</w:t>
+            </w:r>
+            <w:r>
+              <w:rPr>
+                <w:rFonts w:ascii="Arial" w:hAnsi="Arial" w:cs="Arial"/>
+                <w:sz w:val="22"/>
+                <w:szCs w:val="22"/>
+                <w:rtl/>
+              </w:rPr>
+              <w:t xml:space="preserve">؛ والمعالجة القادمة لهما في القسم </w:t>
+            </w:r>
+            <w:r>
+              <w:rPr>
+                <w:rFonts w:ascii="Arial" w:hAnsi="Arial" w:cs="Arial"/>
+                <w:sz w:val="22"/>
+                <w:szCs w:val="22"/>
+              </w:rPr>
+              <w:t xml:space="preserve">8</w:t>
             </w:r>
             <w:r>
               <w:rPr>
@@ -21328,7 +21345,7 @@
               <w:drawing>
                 <wp:inline distT="0" distB="0" distL="0" distR="0">
                   <wp:extent cx="5900000" cy="2520909"/>
-                  <wp:docPr id="9003" name="Figure 3" descr="شكل 3: الأهداف الأربعة التي فشلت في v8 وقيمها بعد الإصلاح في v9 على بيانات جديدة"/>
+                  <wp:docPr id="9003" name="Figure 3" descr="شكل 3: الأهداف الأربعة التي لم تتحقق في v8 وقيمها بعد الإصلاح في v9 على بيانات جديدة"/>
                   <wp:cNvGraphicFramePr>
                     <a:graphicFrameLocks xmlns:a="http://schemas.openxmlformats.org/drawingml/2006/main" noChangeAspect="1"/>
                   </wp:cNvGraphicFramePr>
@@ -21400,7 +21417,7 @@
                 <w:szCs w:val="18"/>
                 <w:rtl/>
               </w:rPr>
-              <w:t xml:space="preserve">: الأهداف الأربعة التي فشلت في </w:t>
+              <w:t xml:space="preserve">: الأهداف الأربعة التي لم تتحقق في </w:t>
             </w:r>
             <w:r>
               <w:rPr>
@@ -21479,7 +21496,7 @@
                 <w:sz w:val="22"/>
                 <w:szCs w:val="22"/>
               </w:rPr>
-              <w:t xml:space="preserve">[4]</w:t>
+              <w:t xml:space="preserve">[3]</w:t>
             </w:r>
             <w:r>
               <w:rPr>
@@ -21513,7 +21530,7 @@
                 <w:sz w:val="22"/>
                 <w:szCs w:val="22"/>
               </w:rPr>
-              <w:t xml:space="preserve">[5][6]</w:t>
+              <w:t xml:space="preserve">[8][9]</w:t>
             </w:r>
             <w:r>
               <w:rPr>
@@ -21530,7 +21547,7 @@
                 <w:sz w:val="22"/>
                 <w:szCs w:val="22"/>
               </w:rPr>
-              <w:t xml:space="preserve">[10]</w:t>
+              <w:t xml:space="preserve">[15]</w:t>
             </w:r>
             <w:r>
               <w:rPr>
@@ -21580,7 +21597,7 @@
                 <w:szCs w:val="22"/>
                 <w:rtl/>
               </w:rPr>
-              <w:t xml:space="preserve">القيود (بصدق):</w:t>
+              <w:t xml:space="preserve">القيود وحدود التعميم:</w:t>
             </w:r>
           </w:p>
           <w:p>
@@ -22076,7 +22093,7 @@
                 <w:sz w:val="22"/>
                 <w:szCs w:val="22"/>
               </w:rPr>
-              <w:t xml:space="preserve">ECC-2:2024 [16]</w:t>
+              <w:t xml:space="preserve">ECC-2:2024 [4]</w:t>
             </w:r>
             <w:r>
               <w:rPr>
@@ -22093,7 +22110,7 @@
                 <w:sz w:val="22"/>
                 <w:szCs w:val="22"/>
               </w:rPr>
-              <w:t xml:space="preserve">[17]</w:t>
+              <w:t xml:space="preserve">[19]</w:t>
             </w:r>
             <w:r>
               <w:rPr>
@@ -23428,17 +23445,9 @@
                       <w:rFonts w:ascii="Arial" w:hAnsi="Arial" w:cs="Arial"/>
                       <w:sz w:val="19"/>
                       <w:szCs w:val="19"/>
-                    </w:rPr>
-                    <w:t xml:space="preserve">24–26</w:t>
-                  </w:r>
-                  <w:r>
-                    <w:rPr>
-                      <w:rFonts w:ascii="Arial" w:hAnsi="Arial" w:cs="Arial"/>
-                      <w:sz w:val="19"/>
-                      <w:szCs w:val="19"/>
-                      <w:rtl/>
-                    </w:rPr>
-                    <w:t xml:space="preserve"> نوفمبر </w:t>
+                      <w:rtl/>
+                    </w:rPr>
+                    <w:t xml:space="preserve">نوفمبر </w:t>
                   </w:r>
                   <w:r>
                     <w:rPr>
@@ -23473,7 +23482,134 @@
                       <w:szCs w:val="19"/>
                       <w:rtl/>
                     </w:rPr>
-                    <w:t xml:space="preserve">عرض حي في معرض سيف: هجوم ← قرار ← قطع المهاجم مع بقاء الخدمات</w:t>
+                    <w:t xml:space="preserve">تحسينات بأهداف مسجلة مسبقًا: قواعد مجمّعة (</w:t>
+                  </w:r>
+                  <w:r>
+                    <w:rPr>
+                      <w:rFonts w:ascii="Arial" w:hAnsi="Arial" w:cs="Arial"/>
+                      <w:sz w:val="19"/>
+                      <w:szCs w:val="19"/>
+                    </w:rPr>
+                    <w:t xml:space="preserve">nftables sets)</w:t>
+                  </w:r>
+                  <w:r>
+                    <w:rPr>
+                      <w:rFonts w:ascii="Arial" w:hAnsi="Arial" w:cs="Arial"/>
+                      <w:sz w:val="19"/>
+                      <w:szCs w:val="19"/>
+                      <w:rtl/>
+                    </w:rPr>
+                    <w:t xml:space="preserve"> لخفض </w:t>
+                  </w:r>
+                  <w:r>
+                    <w:rPr>
+                      <w:rFonts w:ascii="Arial" w:hAnsi="Arial" w:cs="Arial"/>
+                      <w:sz w:val="19"/>
+                      <w:szCs w:val="19"/>
+                    </w:rPr>
+                    <w:t xml:space="preserve">p95</w:t>
+                  </w:r>
+                  <w:r>
+                    <w:rPr>
+                      <w:rFonts w:ascii="Arial" w:hAnsi="Arial" w:cs="Arial"/>
+                      <w:sz w:val="19"/>
+                      <w:szCs w:val="19"/>
+                      <w:rtl/>
+                    </w:rPr>
+                    <w:t xml:space="preserve"> القطع إلى &lt; </w:t>
+                  </w:r>
+                  <w:r>
+                    <w:rPr>
+                      <w:rFonts w:ascii="Arial" w:hAnsi="Arial" w:cs="Arial"/>
+                      <w:sz w:val="19"/>
+                      <w:szCs w:val="19"/>
+                    </w:rPr>
+                    <w:t xml:space="preserve">50</w:t>
+                  </w:r>
+                  <w:r>
+                    <w:rPr>
+                      <w:rFonts w:ascii="Arial" w:hAnsi="Arial" w:cs="Arial"/>
+                      <w:sz w:val="19"/>
+                      <w:szCs w:val="19"/>
+                      <w:rtl/>
+                    </w:rPr>
+                    <w:t xml:space="preserve"> مللي ثانية، وتطبيق </w:t>
+                  </w:r>
+                  <w:r>
+                    <w:rPr>
+                      <w:rFonts w:ascii="Arial" w:hAnsi="Arial" w:cs="Arial"/>
+                      <w:sz w:val="19"/>
+                      <w:szCs w:val="19"/>
+                    </w:rPr>
+                    <w:t xml:space="preserve">ML-DSA</w:t>
+                  </w:r>
+                  <w:r>
+                    <w:rPr>
+                      <w:rFonts w:ascii="Arial" w:hAnsi="Arial" w:cs="Arial"/>
+                      <w:sz w:val="19"/>
+                      <w:szCs w:val="19"/>
+                      <w:rtl/>
+                    </w:rPr>
+                    <w:t xml:space="preserve"> بلغة </w:t>
+                  </w:r>
+                  <w:r>
+                    <w:rPr>
+                      <w:rFonts w:ascii="Arial" w:hAnsi="Arial" w:cs="Arial"/>
+                      <w:sz w:val="19"/>
+                      <w:szCs w:val="19"/>
+                    </w:rPr>
+                    <w:t xml:space="preserve">C</w:t>
+                  </w:r>
+                  <w:r>
+                    <w:rPr>
+                      <w:rFonts w:ascii="Arial" w:hAnsi="Arial" w:cs="Arial"/>
+                      <w:sz w:val="19"/>
+                      <w:szCs w:val="19"/>
+                      <w:rtl/>
+                    </w:rPr>
+                    <w:t xml:space="preserve"> لخفضه إلى &lt; </w:t>
+                  </w:r>
+                  <w:r>
+                    <w:rPr>
+                      <w:rFonts w:ascii="Arial" w:hAnsi="Arial" w:cs="Arial"/>
+                      <w:sz w:val="19"/>
+                      <w:szCs w:val="19"/>
+                    </w:rPr>
+                    <w:t xml:space="preserve">50</w:t>
+                  </w:r>
+                  <w:r>
+                    <w:rPr>
+                      <w:rFonts w:ascii="Arial" w:hAnsi="Arial" w:cs="Arial"/>
+                      <w:sz w:val="19"/>
+                      <w:szCs w:val="19"/>
+                      <w:rtl/>
+                    </w:rPr>
+                    <w:t xml:space="preserve">، وأرضية الأمان </w:t>
+                  </w:r>
+                  <w:r>
+                    <w:rPr>
+                      <w:rFonts w:ascii="Arial" w:hAnsi="Arial" w:cs="Arial"/>
+                      <w:sz w:val="19"/>
+                      <w:szCs w:val="19"/>
+                    </w:rPr>
+                    <w:t xml:space="preserve">v12</w:t>
+                  </w:r>
+                  <w:r>
+                    <w:rPr>
+                      <w:rFonts w:ascii="Arial" w:hAnsi="Arial" w:cs="Arial"/>
+                      <w:sz w:val="19"/>
+                      <w:szCs w:val="19"/>
+                      <w:rtl/>
+                    </w:rPr>
+                    <w:t xml:space="preserve"> على شبكة المصنع لرفع الاحتواء إلى ≥ </w:t>
+                  </w:r>
+                  <w:r>
+                    <w:rPr>
+                      <w:rFonts w:ascii="Arial" w:hAnsi="Arial" w:cs="Arial"/>
+                      <w:sz w:val="19"/>
+                      <w:szCs w:val="19"/>
+                    </w:rPr>
+                    <w:t xml:space="preserve">0.80</w:t>
                   </w:r>
                 </w:p>
               </w:tc>
@@ -23500,7 +23636,7 @@
                       <w:szCs w:val="19"/>
                       <w:rtl/>
                     </w:rPr>
-                    <w:t xml:space="preserve">مركز الرياض الدولي للمؤتمرات والمعارض</w:t>
+                    <w:t xml:space="preserve">المنزل</w:t>
                   </w:r>
                 </w:p>
               </w:tc>
@@ -23527,7 +23663,7 @@
                       <w:szCs w:val="19"/>
                       <w:rtl/>
                     </w:rPr>
-                    <w:t xml:space="preserve">حاسوبان محمولان</w:t>
+                    <w:t xml:space="preserve">حاسوب شخصي</w:t>
                   </w:r>
                 </w:p>
               </w:tc>
@@ -23557,9 +23693,17 @@
                       <w:rFonts w:ascii="Arial" w:hAnsi="Arial" w:cs="Arial"/>
                       <w:sz w:val="19"/>
                       <w:szCs w:val="19"/>
-                      <w:rtl/>
-                    </w:rPr>
-                    <w:t xml:space="preserve">ديسمبر </w:t>
+                    </w:rPr>
+                    <w:t xml:space="preserve">24–26</w:t>
+                  </w:r>
+                  <w:r>
+                    <w:rPr>
+                      <w:rFonts w:ascii="Arial" w:hAnsi="Arial" w:cs="Arial"/>
+                      <w:sz w:val="19"/>
+                      <w:szCs w:val="19"/>
+                      <w:rtl/>
+                    </w:rPr>
+                    <w:t xml:space="preserve"> نوفمبر </w:t>
                   </w:r>
                   <w:r>
                     <w:rPr>
@@ -23568,23 +23712,6 @@
                       <w:szCs w:val="19"/>
                     </w:rPr>
                     <w:t xml:space="preserve">2026</w:t>
-                  </w:r>
-                  <w:r>
-                    <w:rPr>
-                      <w:rFonts w:ascii="Arial" w:hAnsi="Arial" w:cs="Arial"/>
-                      <w:sz w:val="19"/>
-                      <w:szCs w:val="19"/>
-                      <w:rtl/>
-                    </w:rPr>
-                    <w:t xml:space="preserve"> – يناير </w:t>
-                  </w:r>
-                  <w:r>
-                    <w:rPr>
-                      <w:rFonts w:ascii="Arial" w:hAnsi="Arial" w:cs="Arial"/>
-                      <w:sz w:val="19"/>
-                      <w:szCs w:val="19"/>
-                    </w:rPr>
-                    <w:t xml:space="preserve">2027</w:t>
                   </w:r>
                 </w:p>
               </w:tc>
@@ -23611,24 +23738,7 @@
                       <w:szCs w:val="19"/>
                       <w:rtl/>
                     </w:rPr>
-                    <w:t xml:space="preserve">اختبار على بيانات شبكة حقيقية عامة (مثل </w:t>
-                  </w:r>
-                  <w:r>
-                    <w:rPr>
-                      <w:rFonts w:ascii="Arial" w:hAnsi="Arial" w:cs="Arial"/>
-                      <w:sz w:val="19"/>
-                      <w:szCs w:val="19"/>
-                    </w:rPr>
-                    <w:t xml:space="preserve">CIC-IDS2017)</w:t>
-                  </w:r>
-                  <w:r>
-                    <w:rPr>
-                      <w:rFonts w:ascii="Arial" w:hAnsi="Arial" w:cs="Arial"/>
-                      <w:sz w:val="19"/>
-                      <w:szCs w:val="19"/>
-                      <w:rtl/>
-                    </w:rPr>
-                    <w:t xml:space="preserve">، وكتابة الورقة البحثية</w:t>
+                    <w:t xml:space="preserve">عرض حي في معرض سيف: هجوم ← قرار ← قطع المهاجم مع بقاء الخدمات</w:t>
                   </w:r>
                 </w:p>
               </w:tc>
@@ -23655,7 +23765,7 @@
                       <w:szCs w:val="19"/>
                       <w:rtl/>
                     </w:rPr>
-                    <w:t xml:space="preserve">المنزل</w:t>
+                    <w:t xml:space="preserve">مركز الرياض الدولي للمؤتمرات والمعارض</w:t>
                   </w:r>
                 </w:p>
               </w:tc>
@@ -23682,6 +23792,161 @@
                       <w:szCs w:val="19"/>
                       <w:rtl/>
                     </w:rPr>
+                    <w:t xml:space="preserve">حاسوبان محمولان</w:t>
+                  </w:r>
+                </w:p>
+              </w:tc>
+            </w:tr>
+            <w:tr>
+              <w:trPr>
+                <w:cantSplit/>
+              </w:trPr>
+              <w:tc>
+                <w:tcPr>
+                  <w:tcW w:w="2251" w:type="dxa"/>
+                </w:tcPr>
+                <w:p>
+                  <w:pPr>
+                    <w:bidi/>
+                    <w:spacing w:after="0" w:line="300" w:lineRule="auto"/>
+                    <w:jc w:val="start"/>
+                    <w:rPr>
+                      <w:rFonts w:ascii="Arial" w:hAnsi="Arial" w:cs="Arial"/>
+                      <w:sz w:val="19"/>
+                      <w:szCs w:val="19"/>
+                      <w:rtl/>
+                    </w:rPr>
+                  </w:pPr>
+                  <w:r>
+                    <w:rPr>
+                      <w:rFonts w:ascii="Arial" w:hAnsi="Arial" w:cs="Arial"/>
+                      <w:sz w:val="19"/>
+                      <w:szCs w:val="19"/>
+                      <w:rtl/>
+                    </w:rPr>
+                    <w:t xml:space="preserve">ديسمبر </w:t>
+                  </w:r>
+                  <w:r>
+                    <w:rPr>
+                      <w:rFonts w:ascii="Arial" w:hAnsi="Arial" w:cs="Arial"/>
+                      <w:sz w:val="19"/>
+                      <w:szCs w:val="19"/>
+                    </w:rPr>
+                    <w:t xml:space="preserve">2026</w:t>
+                  </w:r>
+                  <w:r>
+                    <w:rPr>
+                      <w:rFonts w:ascii="Arial" w:hAnsi="Arial" w:cs="Arial"/>
+                      <w:sz w:val="19"/>
+                      <w:szCs w:val="19"/>
+                      <w:rtl/>
+                    </w:rPr>
+                    <w:t xml:space="preserve"> – يناير </w:t>
+                  </w:r>
+                  <w:r>
+                    <w:rPr>
+                      <w:rFonts w:ascii="Arial" w:hAnsi="Arial" w:cs="Arial"/>
+                      <w:sz w:val="19"/>
+                      <w:szCs w:val="19"/>
+                    </w:rPr>
+                    <w:t xml:space="preserve">2027</w:t>
+                  </w:r>
+                </w:p>
+              </w:tc>
+              <w:tc>
+                <w:tcPr>
+                  <w:tcW w:w="3720" w:type="dxa"/>
+                </w:tcPr>
+                <w:p>
+                  <w:pPr>
+                    <w:bidi/>
+                    <w:spacing w:after="0" w:line="300" w:lineRule="auto"/>
+                    <w:jc w:val="start"/>
+                    <w:rPr>
+                      <w:rFonts w:ascii="Arial" w:hAnsi="Arial" w:cs="Arial"/>
+                      <w:sz w:val="19"/>
+                      <w:szCs w:val="19"/>
+                      <w:rtl/>
+                    </w:rPr>
+                  </w:pPr>
+                  <w:r>
+                    <w:rPr>
+                      <w:rFonts w:ascii="Arial" w:hAnsi="Arial" w:cs="Arial"/>
+                      <w:sz w:val="19"/>
+                      <w:szCs w:val="19"/>
+                      <w:rtl/>
+                    </w:rPr>
+                    <w:t xml:space="preserve">اختبار على بيانات شبكة حقيقية عامة (مثل </w:t>
+                  </w:r>
+                  <w:r>
+                    <w:rPr>
+                      <w:rFonts w:ascii="Arial" w:hAnsi="Arial" w:cs="Arial"/>
+                      <w:sz w:val="19"/>
+                      <w:szCs w:val="19"/>
+                    </w:rPr>
+                    <w:t xml:space="preserve">CIC-IDS2017)</w:t>
+                  </w:r>
+                  <w:r>
+                    <w:rPr>
+                      <w:rFonts w:ascii="Arial" w:hAnsi="Arial" w:cs="Arial"/>
+                      <w:sz w:val="19"/>
+                      <w:szCs w:val="19"/>
+                      <w:rtl/>
+                    </w:rPr>
+                    <w:t xml:space="preserve">، وكتابة الورقة البحثية</w:t>
+                  </w:r>
+                </w:p>
+              </w:tc>
+              <w:tc>
+                <w:tcPr>
+                  <w:tcW w:w="1860" w:type="dxa"/>
+                </w:tcPr>
+                <w:p>
+                  <w:pPr>
+                    <w:bidi/>
+                    <w:spacing w:after="0" w:line="300" w:lineRule="auto"/>
+                    <w:jc w:val="start"/>
+                    <w:rPr>
+                      <w:rFonts w:ascii="Arial" w:hAnsi="Arial" w:cs="Arial"/>
+                      <w:sz w:val="19"/>
+                      <w:szCs w:val="19"/>
+                      <w:rtl/>
+                    </w:rPr>
+                  </w:pPr>
+                  <w:r>
+                    <w:rPr>
+                      <w:rFonts w:ascii="Arial" w:hAnsi="Arial" w:cs="Arial"/>
+                      <w:sz w:val="19"/>
+                      <w:szCs w:val="19"/>
+                      <w:rtl/>
+                    </w:rPr>
+                    <w:t xml:space="preserve">المنزل</w:t>
+                  </w:r>
+                </w:p>
+              </w:tc>
+              <w:tc>
+                <w:tcPr>
+                  <w:tcW w:w="1468" w:type="dxa"/>
+                </w:tcPr>
+                <w:p>
+                  <w:pPr>
+                    <w:bidi/>
+                    <w:spacing w:after="0" w:line="300" w:lineRule="auto"/>
+                    <w:jc w:val="start"/>
+                    <w:rPr>
+                      <w:rFonts w:ascii="Arial" w:hAnsi="Arial" w:cs="Arial"/>
+                      <w:sz w:val="19"/>
+                      <w:szCs w:val="19"/>
+                      <w:rtl/>
+                    </w:rPr>
+                  </w:pPr>
+                  <w:r>
+                    <w:rPr>
+                      <w:rFonts w:ascii="Arial" w:hAnsi="Arial" w:cs="Arial"/>
+                      <w:sz w:val="19"/>
+                      <w:szCs w:val="19"/>
+                      <w:rtl/>
+                    </w:rPr>
                     <w:t xml:space="preserve">المشرف، وحاسوب شخصي</w:t>
                   </w:r>
                 </w:p>
@@ -23720,7 +23985,7 @@
                 <w:szCs w:val="22"/>
                 <w:rtl/>
               </w:rPr>
-              <w:t xml:space="preserve">كل نتيجة جديدة ستُسجَّل مسبقًا وتُنشر بالطريقة نفسها، نجحت أو فشلت.</w:t>
+              <w:t xml:space="preserve">كل هدف جديد يُسجَّل مسبقًا قبل تجربته، وتُنشر نتيجته كما هي.</w:t>
             </w:r>
           </w:p>
         </w:tc>
@@ -24244,7 +24509,89 @@
                 <w:sz w:val="19"/>
                 <w:szCs w:val="19"/>
               </w:rPr>
-              <w:t xml:space="preserve">[3]  Islam, C., Babar, M. A., &amp; Nepal, S. (2019). A Multi-Vocal Review of Security Orchestration. ACM Computing Surveys, 52(2), Article 37. https://doi.org/10.1145/3305268</w:t>
+              <w:t xml:space="preserve">[3]  Microsoft. (n.d.). Automatic attack disruption in Microsoft Defender; Exclude assets from automated response in attack disruption. Microsoft Learn. Retrieved October 14, 2026, from https://learn.microsoft.com/en-us/defender-xdr/automatic-attack-disruption-exclusions</w:t>
+            </w:r>
+          </w:p>
+          <w:p>
+            <w:pPr>
+              <w:bidi/>
+              <w:spacing w:after="50" w:line="300" w:lineRule="auto"/>
+              <w:ind w:start="520" w:hanging="520"/>
+              <w:jc w:val="start"/>
+              <w:rPr>
+                <w:rFonts w:ascii="Arial" w:hAnsi="Arial" w:cs="Arial"/>
+                <w:sz w:val="19"/>
+                <w:szCs w:val="19"/>
+                <w:rtl/>
+              </w:rPr>
+            </w:pPr>
+            <w:r>
+              <w:rPr>
+                <w:rFonts w:ascii="Arial" w:hAnsi="Arial" w:cs="Arial"/>
+                <w:sz w:val="19"/>
+                <w:szCs w:val="19"/>
+              </w:rPr>
+              <w:t xml:space="preserve">[4]</w:t>
+            </w:r>
+            <w:r>
+              <w:rPr>
+                <w:rFonts w:ascii="Arial" w:hAnsi="Arial" w:cs="Arial"/>
+                <w:sz w:val="19"/>
+                <w:szCs w:val="19"/>
+                <w:rtl/>
+              </w:rPr>
+              <w:t xml:space="preserve">  الهيئة الوطنية للأمن السيبراني. (</w:t>
+            </w:r>
+            <w:r>
+              <w:rPr>
+                <w:rFonts w:ascii="Arial" w:hAnsi="Arial" w:cs="Arial"/>
+                <w:sz w:val="19"/>
+                <w:szCs w:val="19"/>
+              </w:rPr>
+              <w:t xml:space="preserve">2024)</w:t>
+            </w:r>
+            <w:r>
+              <w:rPr>
+                <w:rFonts w:ascii="Arial" w:hAnsi="Arial" w:cs="Arial"/>
+                <w:sz w:val="19"/>
+                <w:szCs w:val="19"/>
+                <w:rtl/>
+              </w:rPr>
+              <w:t xml:space="preserve">. الضوابط الأساسية للأمن السيبراني (</w:t>
+            </w:r>
+            <w:r>
+              <w:rPr>
+                <w:rFonts w:ascii="Arial" w:hAnsi="Arial" w:cs="Arial"/>
+                <w:sz w:val="19"/>
+                <w:szCs w:val="19"/>
+              </w:rPr>
+              <w:t xml:space="preserve">ECC-2:2024). https://cdn.nca.gov.sa/api/files/public/upload/86e09090-44e4-481f-bc28-355673607654_ECC--2024-EN.pdf</w:t>
+            </w:r>
+            <w:r>
+              <w:rPr>
+                <w:rFonts w:ascii="Arial" w:hAnsi="Arial" w:cs="Arial"/>
+                <w:sz w:val="19"/>
+                <w:szCs w:val="19"/>
+                <w:rtl/>
+              </w:rPr>
+              <w:t xml:space="preserve"> ؛ ودليل التطبيق (</w:t>
+            </w:r>
+            <w:r>
+              <w:rPr>
+                <w:rFonts w:ascii="Arial" w:hAnsi="Arial" w:cs="Arial"/>
+                <w:sz w:val="19"/>
+                <w:szCs w:val="19"/>
+              </w:rPr>
+              <w:t xml:space="preserve">GECC-2:2026)</w:t>
+            </w:r>
+            <w:r>
+              <w:rPr>
+                <w:rFonts w:ascii="Arial" w:hAnsi="Arial" w:cs="Arial"/>
+                <w:sz w:val="19"/>
+                <w:szCs w:val="19"/>
+                <w:rtl/>
+              </w:rPr>
+              <w:t xml:space="preserve">.</w:t>
             </w:r>
           </w:p>
           <w:p>
@@ -24260,7 +24607,7 @@
                 <w:sz w:val="19"/>
                 <w:szCs w:val="19"/>
               </w:rPr>
-              <w:t xml:space="preserve">[4]  Microsoft. (n.d.). Automatic attack disruption in Microsoft Defender; Exclude assets from automated response in attack disruption. Microsoft Learn. Retrieved October 14, 2026, from https://learn.microsoft.com/en-us/defender-xdr/automatic-attack-disruption-exclusions</w:t>
+              <w:t xml:space="preserve">[5]  Anwar, S., et al. (2017). From intrusion detection to an intrusion response system: Fundamentals, requirements, and future directions. Algorithms, 10(2), 39. https://doi.org/10.3390/a10020039</w:t>
             </w:r>
           </w:p>
           <w:p>
@@ -24276,7 +24623,7 @@
                 <w:sz w:val="19"/>
                 <w:szCs w:val="19"/>
               </w:rPr>
-              <w:t xml:space="preserve">[5]  Shameli-Sendi, A., Louafi, H., He, W., &amp; Cheriet, M. (2018). Dynamic optimal countermeasure selection for intrusion response system. IEEE Transactions on Dependable and Secure Computing, 15(5), 755–770. https://doi.org/10.1109/TDSC.2016.2615622</w:t>
+              <w:t xml:space="preserve">[6]  Nespoli, P., Bernardez Molina, S., Beltrán López, P., &amp; Gómez Mármol, F. (2026). Tackling Cyberattacks Through AI-Based Reactive Systems: A Holistic Review and Future Vision. IEEE Communications Surveys &amp; Tutorials, 28, 1557–1596. https://doi.org/10.1109/COMST.2025.3583868</w:t>
             </w:r>
           </w:p>
           <w:p>
@@ -24292,7 +24639,7 @@
                 <w:sz w:val="19"/>
                 <w:szCs w:val="19"/>
               </w:rPr>
-              <w:t xml:space="preserve">[6]  Bozorgchenani, A., Zarakovitis, C. C., Chien, S. F., Ni, Q., Gouglidis, A., Mallouli, W., &amp; Lim, H. S. (2024). Intrusion Response Systems for the 5G Networks and Beyond: A New Joint Security-vs-QoS Optimization Approach. IEEE Transactions on Network Science and Engineering, 11(3), 3039–3052. https://doi.org/10.1109/TNSE.2024.3358170</w:t>
+              <w:t xml:space="preserve">[7]  Islam, C., Babar, M. A., &amp; Nepal, S. (2019). A Multi-Vocal Review of Security Orchestration. ACM Computing Surveys, 52(2), Article 37. https://doi.org/10.1145/3305268</w:t>
             </w:r>
           </w:p>
           <w:p>
@@ -24308,7 +24655,7 @@
                 <w:sz w:val="19"/>
                 <w:szCs w:val="19"/>
               </w:rPr>
-              <w:t xml:space="preserve">[7]  Nespoli, P., Bernardez Molina, S., Beltrán López, P., &amp; Gómez Mármol, F. (2026). Tackling Cyberattacks Through AI-Based Reactive Systems: A Holistic Review and Future Vision. IEEE Communications Surveys &amp; Tutorials, 28, 1557–1596. https://doi.org/10.1109/COMST.2025.3583868</w:t>
+              <w:t xml:space="preserve">[8]  Shameli-Sendi, A., Louafi, H., He, W., &amp; Cheriet, M. (2018). Dynamic optimal countermeasure selection for intrusion response system. IEEE Transactions on Dependable and Secure Computing, 15(5), 755–770. https://doi.org/10.1109/TDSC.2016.2615622</w:t>
             </w:r>
           </w:p>
           <w:p>
@@ -24324,7 +24671,7 @@
                 <w:sz w:val="19"/>
                 <w:szCs w:val="19"/>
               </w:rPr>
-              <w:t xml:space="preserve">[8]  Anwar, S., et al. (2017). From intrusion detection to an intrusion response system: Fundamentals, requirements, and future directions. Algorithms, 10(2), 39. https://doi.org/10.3390/a10020039</w:t>
+              <w:t xml:space="preserve">[9]  Bozorgchenani, A., Zarakovitis, C. C., Chien, S. F., Ni, Q., Gouglidis, A., Mallouli, W., &amp; Lim, H. S. (2024). Intrusion Response Systems for the 5G Networks and Beyond: A New Joint Security-vs-QoS Optimization Approach. IEEE Transactions on Network Science and Engineering, 11(3), 3039–3052. https://doi.org/10.1109/TNSE.2024.3358170</w:t>
             </w:r>
           </w:p>
           <w:p>
@@ -24340,7 +24687,7 @@
                 <w:sz w:val="19"/>
                 <w:szCs w:val="19"/>
               </w:rPr>
-              <w:t xml:space="preserve">[9]  Marini, R., &amp; Arpe, R. (2025). Cyber Risk Scoring with QUBO: A Quantum and Hybrid Benchmark Study. arXiv:2512.18305. https://arxiv.org/abs/2512.18305</w:t>
+              <w:t xml:space="preserve">[10]  Lucas, A. (2014). Ising formulations of many NP problems. Frontiers in Physics, 2, 5. https://doi.org/10.3389/fphy.2014.00005</w:t>
             </w:r>
           </w:p>
           <w:p>
@@ -24356,7 +24703,7 @@
                 <w:sz w:val="19"/>
                 <w:szCs w:val="19"/>
               </w:rPr>
-              <w:t xml:space="preserve">[10]  Cogburn, C. V., DeCusatis, C., &amp; Spillane, E. (2026). Hardware-Aware QAOA for Honeypot Traffic Partitioning on 100+ Qubit IBM Quantum Processors. arXiv:2606.09469. https://arxiv.org/abs/2606.09469</w:t>
+              <w:t xml:space="preserve">[11]  Glover, F., Kochenberger, G., &amp; Du, Y. (2019). Quantum Bridge Analytics I: a tutorial on formulating and using QUBO models. 4OR, 17(4), 335–371. https://doi.org/10.1007/s10288-019-00424-y</w:t>
             </w:r>
           </w:p>
           <w:p>
@@ -24372,7 +24719,7 @@
                 <w:sz w:val="19"/>
                 <w:szCs w:val="19"/>
               </w:rPr>
-              <w:t xml:space="preserve">[11]  Farhi, E., Goldstone, J., &amp; Gutmann, S. (2014). A Quantum Approximate Optimization Algorithm. arXiv:1411.4028. https://arxiv.org/abs/1411.4028</w:t>
+              <w:t xml:space="preserve">[12]  Farhi, E., Goldstone, J., &amp; Gutmann, S. (2014). A Quantum Approximate Optimization Algorithm. arXiv:1411.4028. https://arxiv.org/abs/1411.4028</w:t>
             </w:r>
           </w:p>
           <w:p>
@@ -24388,7 +24735,7 @@
                 <w:sz w:val="19"/>
                 <w:szCs w:val="19"/>
               </w:rPr>
-              <w:t xml:space="preserve">[12]  Barkoutsos, P. K., Nannicini, G., Robert, A., Tavernelli, I., &amp; Woerner, S. (2020). Improving Variational Quantum Optimization using CVaR. Quantum, 4, 256. https://doi.org/10.22331/q-2020-04-20-256</w:t>
+              <w:t xml:space="preserve">[13]  Barkoutsos, P. K., Nannicini, G., Robert, A., Tavernelli, I., &amp; Woerner, S. (2020). Improving Variational Quantum Optimization using CVaR. Quantum, 4, 256. https://doi.org/10.22331/q-2020-04-20-256</w:t>
             </w:r>
           </w:p>
           <w:p>
@@ -24404,7 +24751,7 @@
                 <w:sz w:val="19"/>
                 <w:szCs w:val="19"/>
               </w:rPr>
-              <w:t xml:space="preserve">[13]  Lucas, A. (2014). Ising formulations of many NP problems. Frontiers in Physics, 2, 5. https://doi.org/10.3389/fphy.2014.00005</w:t>
+              <w:t xml:space="preserve">[14]  Marini, R., &amp; Arpe, R. (2025). Cyber Risk Scoring with QUBO: A Quantum and Hybrid Benchmark Study. arXiv:2512.18305. https://arxiv.org/abs/2512.18305</w:t>
             </w:r>
           </w:p>
           <w:p>
@@ -24420,7 +24767,7 @@
                 <w:sz w:val="19"/>
                 <w:szCs w:val="19"/>
               </w:rPr>
-              <w:t xml:space="preserve">[14]  Glover, F., Kochenberger, G., &amp; Du, Y. (2019). Quantum Bridge Analytics I: a tutorial on formulating and using QUBO models. 4OR, 17(4), 335–371. https://doi.org/10.1007/s10288-019-00424-y</w:t>
+              <w:t xml:space="preserve">[15]  Cogburn, C. V., DeCusatis, C., &amp; Spillane, E. (2026). Hardware-Aware QAOA for Honeypot Traffic Partitioning on 100+ Qubit IBM Quantum Processors. arXiv:2606.09469. https://arxiv.org/abs/2606.09469</w:t>
             </w:r>
           </w:p>
           <w:p>
@@ -24436,145 +24783,7 @@
                 <w:sz w:val="19"/>
                 <w:szCs w:val="19"/>
               </w:rPr>
-              <w:t xml:space="preserve">[15]  FIRST. (2019). Common Vulnerability Scoring System v3.1: Specification Document. https://www.first.org/cvss/v3-1/specification-document</w:t>
-            </w:r>
-          </w:p>
-          <w:p>
-            <w:pPr>
-              <w:bidi/>
-              <w:spacing w:after="50" w:line="300" w:lineRule="auto"/>
-              <w:ind w:start="520" w:hanging="520"/>
-              <w:jc w:val="start"/>
-              <w:rPr>
-                <w:rFonts w:ascii="Arial" w:hAnsi="Arial" w:cs="Arial"/>
-                <w:sz w:val="19"/>
-                <w:szCs w:val="19"/>
-                <w:rtl/>
-              </w:rPr>
-            </w:pPr>
-            <w:r>
-              <w:rPr>
-                <w:rFonts w:ascii="Arial" w:hAnsi="Arial" w:cs="Arial"/>
-                <w:sz w:val="19"/>
-                <w:szCs w:val="19"/>
-              </w:rPr>
-              <w:t xml:space="preserve">[16]</w:t>
-            </w:r>
-            <w:r>
-              <w:rPr>
-                <w:rFonts w:ascii="Arial" w:hAnsi="Arial" w:cs="Arial"/>
-                <w:sz w:val="19"/>
-                <w:szCs w:val="19"/>
-                <w:rtl/>
-              </w:rPr>
-              <w:t xml:space="preserve">  الهيئة الوطنية للأمن السيبراني. (</w:t>
-            </w:r>
-            <w:r>
-              <w:rPr>
-                <w:rFonts w:ascii="Arial" w:hAnsi="Arial" w:cs="Arial"/>
-                <w:sz w:val="19"/>
-                <w:szCs w:val="19"/>
-              </w:rPr>
-              <w:t xml:space="preserve">2024)</w:t>
-            </w:r>
-            <w:r>
-              <w:rPr>
-                <w:rFonts w:ascii="Arial" w:hAnsi="Arial" w:cs="Arial"/>
-                <w:sz w:val="19"/>
-                <w:szCs w:val="19"/>
-                <w:rtl/>
-              </w:rPr>
-              <w:t xml:space="preserve">. الضوابط الأساسية للأمن السيبراني (</w:t>
-            </w:r>
-            <w:r>
-              <w:rPr>
-                <w:rFonts w:ascii="Arial" w:hAnsi="Arial" w:cs="Arial"/>
-                <w:sz w:val="19"/>
-                <w:szCs w:val="19"/>
-              </w:rPr>
-              <w:t xml:space="preserve">ECC-2:2024). https://cdn.nca.gov.sa/api/files/public/upload/86e09090-44e4-481f-bc28-355673607654_ECC--2024-EN.pdf</w:t>
-            </w:r>
-            <w:r>
-              <w:rPr>
-                <w:rFonts w:ascii="Arial" w:hAnsi="Arial" w:cs="Arial"/>
-                <w:sz w:val="19"/>
-                <w:szCs w:val="19"/>
-                <w:rtl/>
-              </w:rPr>
-              <w:t xml:space="preserve"> ؛ ودليل التطبيق (</w:t>
-            </w:r>
-            <w:r>
-              <w:rPr>
-                <w:rFonts w:ascii="Arial" w:hAnsi="Arial" w:cs="Arial"/>
-                <w:sz w:val="19"/>
-                <w:szCs w:val="19"/>
-              </w:rPr>
-              <w:t xml:space="preserve">GECC-2:2026)</w:t>
-            </w:r>
-            <w:r>
-              <w:rPr>
-                <w:rFonts w:ascii="Arial" w:hAnsi="Arial" w:cs="Arial"/>
-                <w:sz w:val="19"/>
-                <w:szCs w:val="19"/>
-                <w:rtl/>
-              </w:rPr>
-              <w:t xml:space="preserve">.</w:t>
-            </w:r>
-          </w:p>
-          <w:p>
-            <w:pPr>
-              <w:bidi/>
-              <w:spacing w:after="50" w:line="300" w:lineRule="auto"/>
-              <w:ind w:start="520" w:hanging="520"/>
-              <w:jc w:val="start"/>
-              <w:rPr>
-                <w:rFonts w:ascii="Arial" w:hAnsi="Arial" w:cs="Arial"/>
-                <w:sz w:val="19"/>
-                <w:szCs w:val="19"/>
-                <w:rtl/>
-              </w:rPr>
-            </w:pPr>
-            <w:r>
-              <w:rPr>
-                <w:rFonts w:ascii="Arial" w:hAnsi="Arial" w:cs="Arial"/>
-                <w:sz w:val="19"/>
-                <w:szCs w:val="19"/>
-              </w:rPr>
-              <w:t xml:space="preserve">[17]</w:t>
-            </w:r>
-            <w:r>
-              <w:rPr>
-                <w:rFonts w:ascii="Arial" w:hAnsi="Arial" w:cs="Arial"/>
-                <w:sz w:val="19"/>
-                <w:szCs w:val="19"/>
-                <w:rtl/>
-              </w:rPr>
-              <w:t xml:space="preserve">  الهيئة السعودية للبيانات والذكاء الاصطناعي (سدايا). (</w:t>
-            </w:r>
-            <w:r>
-              <w:rPr>
-                <w:rFonts w:ascii="Arial" w:hAnsi="Arial" w:cs="Arial"/>
-                <w:sz w:val="19"/>
-                <w:szCs w:val="19"/>
-              </w:rPr>
-              <w:t xml:space="preserve">2023)</w:t>
-            </w:r>
-            <w:r>
-              <w:rPr>
-                <w:rFonts w:ascii="Arial" w:hAnsi="Arial" w:cs="Arial"/>
-                <w:sz w:val="19"/>
-                <w:szCs w:val="19"/>
-                <w:rtl/>
-              </w:rPr>
-              <w:t xml:space="preserve">. مبادئ أخلاقيات الذكاء الاصطناعي (الإصدار </w:t>
-            </w:r>
-            <w:r>
-              <w:rPr>
-                <w:rFonts w:ascii="Arial" w:hAnsi="Arial" w:cs="Arial"/>
-                <w:sz w:val="19"/>
-                <w:szCs w:val="19"/>
-              </w:rPr>
-              <w:t xml:space="preserve">1.0). https://sdaia.gov.sa/en/SDAIA/about/Documents/ai-principles.pdf</w:t>
+              <w:t xml:space="preserve">[16]  FIRST. (2019). Common Vulnerability Scoring System v3.1: Specification Document. https://www.first.org/cvss/v3-1/specification-document</w:t>
             </w:r>
           </w:p>
           <w:p>
@@ -24590,7 +24799,7 @@
                 <w:sz w:val="19"/>
                 <w:szCs w:val="19"/>
               </w:rPr>
-              <w:t xml:space="preserve">[18]  PwC. (2021). Conti cyber attack on the HSE: Independent post incident review. Health Service Executive (Ireland). https://www.hse.ie/eng/services/publications/conti-cyber-attack-on-the-hse-full-report.pdf</w:t>
+              <w:t xml:space="preserve">[17]  PwC. (2021). Conti cyber attack on the HSE: Independent post incident review. Health Service Executive (Ireland). https://www.hse.ie/eng/services/publications/conti-cyber-attack-on-the-hse-full-report.pdf</w:t>
             </w:r>
           </w:p>
           <w:p>
@@ -24606,7 +24815,63 @@
                 <w:sz w:val="19"/>
                 <w:szCs w:val="19"/>
               </w:rPr>
-              <w:t xml:space="preserve">[19]  MITRE Center for Threat-Informed Defense. (2024). Attack Flow (v2) and the Attack Flow corpus [Software and data]. https://github.com/center-for-threat-informed-defense/attack-flow</w:t>
+              <w:t xml:space="preserve">[18]  MITRE Center for Threat-Informed Defense. (2024). Attack Flow (v2) and the Attack Flow corpus [Software and data]. https://github.com/center-for-threat-informed-defense/attack-flow</w:t>
+            </w:r>
+          </w:p>
+          <w:p>
+            <w:pPr>
+              <w:bidi/>
+              <w:spacing w:after="50" w:line="300" w:lineRule="auto"/>
+              <w:ind w:start="520" w:hanging="520"/>
+              <w:jc w:val="start"/>
+              <w:rPr>
+                <w:rFonts w:ascii="Arial" w:hAnsi="Arial" w:cs="Arial"/>
+                <w:sz w:val="19"/>
+                <w:szCs w:val="19"/>
+                <w:rtl/>
+              </w:rPr>
+            </w:pPr>
+            <w:r>
+              <w:rPr>
+                <w:rFonts w:ascii="Arial" w:hAnsi="Arial" w:cs="Arial"/>
+                <w:sz w:val="19"/>
+                <w:szCs w:val="19"/>
+              </w:rPr>
+              <w:t xml:space="preserve">[19]</w:t>
+            </w:r>
+            <w:r>
+              <w:rPr>
+                <w:rFonts w:ascii="Arial" w:hAnsi="Arial" w:cs="Arial"/>
+                <w:sz w:val="19"/>
+                <w:szCs w:val="19"/>
+                <w:rtl/>
+              </w:rPr>
+              <w:t xml:space="preserve">  الهيئة السعودية للبيانات والذكاء الاصطناعي (سدايا). (</w:t>
+            </w:r>
+            <w:r>
+              <w:rPr>
+                <w:rFonts w:ascii="Arial" w:hAnsi="Arial" w:cs="Arial"/>
+                <w:sz w:val="19"/>
+                <w:szCs w:val="19"/>
+              </w:rPr>
+              <w:t xml:space="preserve">2023)</w:t>
+            </w:r>
+            <w:r>
+              <w:rPr>
+                <w:rFonts w:ascii="Arial" w:hAnsi="Arial" w:cs="Arial"/>
+                <w:sz w:val="19"/>
+                <w:szCs w:val="19"/>
+                <w:rtl/>
+              </w:rPr>
+              <w:t xml:space="preserve">. مبادئ أخلاقيات الذكاء الاصطناعي (الإصدار </w:t>
+            </w:r>
+            <w:r>
+              <w:rPr>
+                <w:rFonts w:ascii="Arial" w:hAnsi="Arial" w:cs="Arial"/>
+                <w:sz w:val="19"/>
+                <w:szCs w:val="19"/>
+              </w:rPr>
+              <w:t xml:space="preserve">1.0). https://sdaia.gov.sa/en/SDAIA/about/Documents/ai-principles.pdf</w:t>
             </w:r>
           </w:p>
           <w:p>

</xml_diff>

<commit_message>
Ibdaa form v12: section 8 adds the six future plans (adversarial robustness, Γ-robust QUBO, two quantum architectures incl. Aramco/Pasqal, predictive containment on CAGE 4, ACRS Box, independent verification); achievements and 3-month plan condensed to fit 300 words
Co-Authored-By: Claude Opus 5.5 <noreply@anthropic.com>
Claude-Session: https://claude.ai/code/session_013B4LPWZWgdrx1XoL9LPLxx
</commit_message>
<xml_diff>
--- a/docs/qacrs/form_drafts/IBDAA_2027_FORM_ACRS_v12.docx
+++ b/docs/qacrs/form_drafts/IBDAA_2027_FORM_ACRS_v12.docx
@@ -22574,28 +22574,14 @@
               </w:rPr>
               <w:t xml:space="preserve">ما أُنجز (قابل للتحقق في المستودع العام):</w:t>
             </w:r>
-          </w:p>
-          <w:p>
-            <w:pPr>
-              <w:bidi/>
-              <w:spacing w:after="60" w:line="300" w:lineRule="auto"/>
-              <w:ind w:start="340" w:hanging="340"/>
-              <w:jc w:val="both"/>
-              <w:rPr>
-                <w:rFonts w:ascii="Arial" w:hAnsi="Arial" w:cs="Arial"/>
-                <w:sz w:val="22"/>
-                <w:szCs w:val="22"/>
-                <w:rtl/>
-              </w:rPr>
-            </w:pPr>
-            <w:r>
-              <w:rPr>
-                <w:rFonts w:ascii="Arial" w:hAnsi="Arial" w:cs="Arial"/>
-                <w:sz w:val="22"/>
-                <w:szCs w:val="22"/>
-                <w:rtl/>
-              </w:rPr>
-              <w:t xml:space="preserve">–  النموذج الرياضي، وبوابة السلامة، وإجراء التجزئة، وثلاثة عشر إصدارًا موثقًا (</w:t>
+            <w:r>
+              <w:rPr>
+                <w:rFonts w:ascii="Arial" w:hAnsi="Arial" w:cs="Arial"/>
+                <w:sz w:val="22"/>
+                <w:szCs w:val="22"/>
+                <w:rtl/>
+              </w:rPr>
+              <w:t xml:space="preserve"> ثلاثة عشر إصدارًا (</w:t>
             </w:r>
             <w:r>
               <w:rPr>
@@ -22612,30 +22598,7 @@
                 <w:szCs w:val="22"/>
                 <w:rtl/>
               </w:rPr>
-              <w:t xml:space="preserve">، منها اثنا عشر بتسجيل مسبق.</w:t>
-            </w:r>
-          </w:p>
-          <w:p>
-            <w:pPr>
-              <w:bidi/>
-              <w:spacing w:after="60" w:line="300" w:lineRule="auto"/>
-              <w:ind w:start="340" w:hanging="340"/>
-              <w:jc w:val="both"/>
-              <w:rPr>
-                <w:rFonts w:ascii="Arial" w:hAnsi="Arial" w:cs="Arial"/>
-                <w:sz w:val="22"/>
-                <w:szCs w:val="22"/>
-                <w:rtl/>
-              </w:rPr>
-            </w:pPr>
-            <w:r>
-              <w:rPr>
-                <w:rFonts w:ascii="Arial" w:hAnsi="Arial" w:cs="Arial"/>
-                <w:sz w:val="22"/>
-                <w:szCs w:val="22"/>
-                <w:rtl/>
-              </w:rPr>
-              <w:t xml:space="preserve">–  الاختبار على أكثر من </w:t>
+              <w:t xml:space="preserve">، منها اثنا عشر بتسجيل مسبق؛ واختبار على </w:t>
             </w:r>
             <w:r>
               <w:rPr>
@@ -22652,24 +22615,24 @@
                 <w:szCs w:val="22"/>
                 <w:rtl/>
               </w:rPr>
-              <w:t xml:space="preserve"> سيناريو جديد، وتنبيهات مزوّرة، وشبكة صحية من </w:t>
-            </w:r>
-            <w:r>
-              <w:rPr>
-                <w:rFonts w:ascii="Arial" w:hAnsi="Arial" w:cs="Arial"/>
-                <w:sz w:val="22"/>
-                <w:szCs w:val="22"/>
-              </w:rPr>
-              <w:t xml:space="preserve">60</w:t>
-            </w:r>
-            <w:r>
-              <w:rPr>
-                <w:rFonts w:ascii="Arial" w:hAnsi="Arial" w:cs="Arial"/>
-                <w:sz w:val="22"/>
-                <w:szCs w:val="22"/>
-                <w:rtl/>
-              </w:rPr>
-              <w:t xml:space="preserve"> جهازًا، وجدار حماية </w:t>
+              <w:t xml:space="preserve">+ سيناريو تركيبي و</w:t>
+            </w:r>
+            <w:r>
+              <w:rPr>
+                <w:rFonts w:ascii="Arial" w:hAnsi="Arial" w:cs="Arial"/>
+                <w:sz w:val="22"/>
+                <w:szCs w:val="22"/>
+              </w:rPr>
+              <w:t xml:space="preserve">83</w:t>
+            </w:r>
+            <w:r>
+              <w:rPr>
+                <w:rFonts w:ascii="Arial" w:hAnsi="Arial" w:cs="Arial"/>
+                <w:sz w:val="22"/>
+                <w:szCs w:val="22"/>
+                <w:rtl/>
+              </w:rPr>
+              <w:t xml:space="preserve"> حادثة حقيقية، وتنبيهات مزوّرة، ونواة </w:t>
             </w:r>
             <w:r>
               <w:rPr>
@@ -22686,7 +22649,7 @@
                 <w:szCs w:val="22"/>
                 <w:rtl/>
               </w:rPr>
-              <w:t xml:space="preserve"> حقيقي، وثلاثة حواسيب </w:t>
+              <w:t xml:space="preserve">، وثلاثة حواسيب </w:t>
             </w:r>
             <w:r>
               <w:rPr>
@@ -22703,30 +22666,7 @@
                 <w:szCs w:val="22"/>
                 <w:rtl/>
               </w:rPr>
-              <w:t xml:space="preserve"> كمّية.</w:t>
-            </w:r>
-          </w:p>
-          <w:p>
-            <w:pPr>
-              <w:bidi/>
-              <w:spacing w:after="60" w:line="300" w:lineRule="auto"/>
-              <w:ind w:start="340" w:hanging="340"/>
-              <w:jc w:val="both"/>
-              <w:rPr>
-                <w:rFonts w:ascii="Arial" w:hAnsi="Arial" w:cs="Arial"/>
-                <w:sz w:val="22"/>
-                <w:szCs w:val="22"/>
-                <w:rtl/>
-              </w:rPr>
-            </w:pPr>
-            <w:r>
-              <w:rPr>
-                <w:rFonts w:ascii="Arial" w:hAnsi="Arial" w:cs="Arial"/>
-                <w:sz w:val="22"/>
-                <w:szCs w:val="22"/>
-                <w:rtl/>
-              </w:rPr>
-              <w:t xml:space="preserve">–  </w:t>
+              <w:t xml:space="preserve">؛ و</w:t>
             </w:r>
             <w:r>
               <w:rPr>
@@ -22760,38 +22700,32 @@
                 <w:szCs w:val="22"/>
                 <w:rtl/>
               </w:rPr>
-              <w:t xml:space="preserve">، وحماية النظام نفسه (توقيع الخطط ومنع إعادة إرسالها)، وشبكة مصغّرة من حاويات يطبّق القرارات فعليًا.</w:t>
-            </w:r>
-          </w:p>
-          <w:p>
-            <w:pPr>
-              <w:bidi/>
-              <w:spacing w:after="60" w:line="300" w:lineRule="auto"/>
-              <w:ind w:start="340" w:hanging="340"/>
-              <w:jc w:val="both"/>
-              <w:rPr>
-                <w:rFonts w:ascii="Arial" w:hAnsi="Arial" w:cs="Arial"/>
-                <w:sz w:val="22"/>
-                <w:szCs w:val="22"/>
-                <w:rtl/>
-              </w:rPr>
-            </w:pPr>
-            <w:r>
-              <w:rPr>
-                <w:rFonts w:ascii="Arial" w:hAnsi="Arial" w:cs="Arial"/>
-                <w:sz w:val="22"/>
-                <w:szCs w:val="22"/>
-                <w:rtl/>
-              </w:rPr>
-              <w:t xml:space="preserve">–  اختبار التعميم على مصنع وبنك وجامعة، ومقارنة الحلّالات الكلاسيكية، وربط الهجمات بـ </w:t>
-            </w:r>
-            <w:r>
-              <w:rPr>
-                <w:rFonts w:ascii="Arial" w:hAnsi="Arial" w:cs="Arial"/>
-                <w:sz w:val="22"/>
-                <w:szCs w:val="22"/>
-              </w:rPr>
-              <w:t xml:space="preserve">MITRE ATT&amp;CK (v10)</w:t>
+              <w:t xml:space="preserve">، وطرفية إنعاش، ومناعة بعد الحادثة، وتوقيع </w:t>
+            </w:r>
+            <w:r>
+              <w:rPr>
+                <w:rFonts w:ascii="Arial" w:hAnsi="Arial" w:cs="Arial"/>
+                <w:sz w:val="22"/>
+                <w:szCs w:val="22"/>
+              </w:rPr>
+              <w:t xml:space="preserve">ML-DSA</w:t>
+            </w:r>
+            <w:r>
+              <w:rPr>
+                <w:rFonts w:ascii="Arial" w:hAnsi="Arial" w:cs="Arial"/>
+                <w:sz w:val="22"/>
+                <w:szCs w:val="22"/>
+                <w:rtl/>
+              </w:rPr>
+              <w:t xml:space="preserve">؛ وعُدّة اختبار أعمى مقفلة، والتأهل لمعرض سيف </w:t>
+            </w:r>
+            <w:r>
+              <w:rPr>
+                <w:rFonts w:ascii="Arial" w:hAnsi="Arial" w:cs="Arial"/>
+                <w:sz w:val="22"/>
+                <w:szCs w:val="22"/>
+              </w:rPr>
+              <w:t xml:space="preserve">2026</w:t>
             </w:r>
             <w:r>
               <w:rPr>
@@ -22801,188 +22735,6 @@
                 <w:rtl/>
               </w:rPr>
               <w:t xml:space="preserve">.</w:t>
-            </w:r>
-          </w:p>
-          <w:p>
-            <w:pPr>
-              <w:bidi/>
-              <w:spacing w:after="60" w:line="300" w:lineRule="auto"/>
-              <w:ind w:start="340" w:hanging="340"/>
-              <w:jc w:val="both"/>
-              <w:rPr>
-                <w:rFonts w:ascii="Arial" w:hAnsi="Arial" w:cs="Arial"/>
-                <w:sz w:val="22"/>
-                <w:szCs w:val="22"/>
-                <w:rtl/>
-              </w:rPr>
-            </w:pPr>
-            <w:r>
-              <w:rPr>
-                <w:rFonts w:ascii="Arial" w:hAnsi="Arial" w:cs="Arial"/>
-                <w:sz w:val="22"/>
-                <w:szCs w:val="22"/>
-                <w:rtl/>
-              </w:rPr>
-              <w:t xml:space="preserve">–  إعادة تشغيل المحرّك على </w:t>
-            </w:r>
-            <w:r>
-              <w:rPr>
-                <w:rFonts w:ascii="Arial" w:hAnsi="Arial" w:cs="Arial"/>
-                <w:sz w:val="22"/>
-                <w:szCs w:val="22"/>
-              </w:rPr>
-              <w:t xml:space="preserve">83</w:t>
-            </w:r>
-            <w:r>
-              <w:rPr>
-                <w:rFonts w:ascii="Arial" w:hAnsi="Arial" w:cs="Arial"/>
-                <w:sz w:val="22"/>
-                <w:szCs w:val="22"/>
-                <w:rtl/>
-              </w:rPr>
-              <w:t xml:space="preserve"> حادثة حقيقية </w:t>
-            </w:r>
-            <w:r>
-              <w:rPr>
-                <w:rFonts w:ascii="Arial" w:hAnsi="Arial" w:cs="Arial"/>
-                <w:sz w:val="22"/>
-                <w:szCs w:val="22"/>
-              </w:rPr>
-              <w:t xml:space="preserve">2013–2026</w:t>
-            </w:r>
-            <w:r>
-              <w:rPr>
-                <w:rFonts w:ascii="Arial" w:hAnsi="Arial" w:cs="Arial"/>
-                <w:sz w:val="22"/>
-                <w:szCs w:val="22"/>
-                <w:rtl/>
-              </w:rPr>
-              <w:t xml:space="preserve"> من تقارير رسمية ومصادر مفتوحة، وأرضية أمان مسجّلة مسبقًا (</w:t>
-            </w:r>
-            <w:r>
-              <w:rPr>
-                <w:rFonts w:ascii="Arial" w:hAnsi="Arial" w:cs="Arial"/>
-                <w:sz w:val="22"/>
-                <w:szCs w:val="22"/>
-              </w:rPr>
-              <w:t xml:space="preserve">v12)</w:t>
-            </w:r>
-            <w:r>
-              <w:rPr>
-                <w:rFonts w:ascii="Arial" w:hAnsi="Arial" w:cs="Arial"/>
-                <w:sz w:val="22"/>
-                <w:szCs w:val="22"/>
-                <w:rtl/>
-              </w:rPr>
-              <w:t xml:space="preserve">، وطرفية إنعاش تمر أوامرها على بوابة السلامة، واختبارات «النظام لا يموت»، ومناعة بعد الحادثة (</w:t>
-            </w:r>
-            <w:r>
-              <w:rPr>
-                <w:rFonts w:ascii="Arial" w:hAnsi="Arial" w:cs="Arial"/>
-                <w:sz w:val="22"/>
-                <w:szCs w:val="22"/>
-              </w:rPr>
-              <w:t xml:space="preserve">v13)</w:t>
-            </w:r>
-            <w:r>
-              <w:rPr>
-                <w:rFonts w:ascii="Arial" w:hAnsi="Arial" w:cs="Arial"/>
-                <w:sz w:val="22"/>
-                <w:szCs w:val="22"/>
-                <w:rtl/>
-              </w:rPr>
-              <w:t xml:space="preserve">، وتوقيع </w:t>
-            </w:r>
-            <w:r>
-              <w:rPr>
-                <w:rFonts w:ascii="Arial" w:hAnsi="Arial" w:cs="Arial"/>
-                <w:sz w:val="22"/>
-                <w:szCs w:val="22"/>
-              </w:rPr>
-              <w:t xml:space="preserve">ML-DSA</w:t>
-            </w:r>
-            <w:r>
-              <w:rPr>
-                <w:rFonts w:ascii="Arial" w:hAnsi="Arial" w:cs="Arial"/>
-                <w:sz w:val="22"/>
-                <w:szCs w:val="22"/>
-                <w:rtl/>
-              </w:rPr>
-              <w:t xml:space="preserve"> ما بعد الكمّي، وتنفيذ في نواة </w:t>
-            </w:r>
-            <w:r>
-              <w:rPr>
-                <w:rFonts w:ascii="Arial" w:hAnsi="Arial" w:cs="Arial"/>
-                <w:sz w:val="22"/>
-                <w:szCs w:val="22"/>
-              </w:rPr>
-              <w:t xml:space="preserve">Linux</w:t>
-            </w:r>
-            <w:r>
-              <w:rPr>
-                <w:rFonts w:ascii="Arial" w:hAnsi="Arial" w:cs="Arial"/>
-                <w:sz w:val="22"/>
-                <w:szCs w:val="22"/>
-                <w:rtl/>
-              </w:rPr>
-              <w:t xml:space="preserve">.</w:t>
-            </w:r>
-          </w:p>
-          <w:p>
-            <w:pPr>
-              <w:bidi/>
-              <w:spacing w:after="60" w:line="300" w:lineRule="auto"/>
-              <w:ind w:start="340" w:hanging="340"/>
-              <w:jc w:val="both"/>
-              <w:rPr>
-                <w:rFonts w:ascii="Arial" w:hAnsi="Arial" w:cs="Arial"/>
-                <w:sz w:val="22"/>
-                <w:szCs w:val="22"/>
-                <w:rtl/>
-              </w:rPr>
-            </w:pPr>
-            <w:r>
-              <w:rPr>
-                <w:rFonts w:ascii="Arial" w:hAnsi="Arial" w:cs="Arial"/>
-                <w:sz w:val="22"/>
-                <w:szCs w:val="22"/>
-                <w:rtl/>
-              </w:rPr>
-              <w:t xml:space="preserve">–  عُدّة اختبار أعمى مقفلة مسبقًا، والتأهل لمعرض سيف </w:t>
-            </w:r>
-            <w:r>
-              <w:rPr>
-                <w:rFonts w:ascii="Arial" w:hAnsi="Arial" w:cs="Arial"/>
-                <w:sz w:val="22"/>
-                <w:szCs w:val="22"/>
-              </w:rPr>
-              <w:t xml:space="preserve">2026</w:t>
-            </w:r>
-            <w:r>
-              <w:rPr>
-                <w:rFonts w:ascii="Arial" w:hAnsi="Arial" w:cs="Arial"/>
-                <w:sz w:val="22"/>
-                <w:szCs w:val="22"/>
-                <w:rtl/>
-              </w:rPr>
-              <w:t xml:space="preserve"> (العرض </w:t>
-            </w:r>
-            <w:r>
-              <w:rPr>
-                <w:rFonts w:ascii="Arial" w:hAnsi="Arial" w:cs="Arial"/>
-                <w:sz w:val="22"/>
-                <w:szCs w:val="22"/>
-              </w:rPr>
-              <w:t xml:space="preserve">24–26</w:t>
-            </w:r>
-            <w:r>
-              <w:rPr>
-                <w:rFonts w:ascii="Arial" w:hAnsi="Arial" w:cs="Arial"/>
-                <w:sz w:val="22"/>
-                <w:szCs w:val="22"/>
-                <w:rtl/>
-              </w:rPr>
-              <w:t xml:space="preserve"> نوفمبر).</w:t>
             </w:r>
           </w:p>
           <w:p>
@@ -23006,13 +22758,13 @@
                 <w:szCs w:val="22"/>
                 <w:rtl/>
               </w:rPr>
-              <w:t xml:space="preserve">خطة الأشهر الثلاثة القادمة:</w:t>
+              <w:t xml:space="preserve">الأشهر الثلاثة القادمة:</w:t>
             </w:r>
           </w:p>
           <w:tbl>
             <w:tblPr>
               <w:bidiVisual/>
-              <w:tblW w:w="9299" w:type="dxa"/>
+              <w:tblW w:w="9300" w:type="dxa"/>
               <w:tblBorders>
                 <w:top w:val="single" w:sz="4" w:space="0" w:color="BFBFBF"/>
                 <w:left w:val="single" w:sz="4" w:space="0" w:color="BFBFBF"/>
@@ -23030,10 +22782,9 @@
               </w:tblCellMar>
             </w:tblPr>
             <w:tblGrid>
-              <w:gridCol w:w="2251"/>
-              <w:gridCol w:w="3720"/>
-              <w:gridCol w:w="1860"/>
-              <w:gridCol w:w="1468"/>
+              <w:gridCol w:w="2300"/>
+              <w:gridCol w:w="5000"/>
+              <w:gridCol w:w="2000"/>
             </w:tblGrid>
             <w:tr>
               <w:trPr>
@@ -23042,7 +22793,7 @@
               </w:trPr>
               <w:tc>
                 <w:tcPr>
-                  <w:tcW w:w="2251" w:type="dxa"/>
+                  <w:tcW w:w="2300" w:type="dxa"/>
                   <w:shd w:val="clear" w:color="auto" w:fill="E8EEF3"/>
                 </w:tcPr>
                 <w:p>
@@ -23066,13 +22817,13 @@
                       <w:szCs w:val="19"/>
                       <w:rtl/>
                     </w:rPr>
-                    <w:t xml:space="preserve">الفترة (تقريبية)</w:t>
+                    <w:t xml:space="preserve">الفترة</w:t>
                   </w:r>
                 </w:p>
               </w:tc>
               <w:tc>
                 <w:tcPr>
-                  <w:tcW w:w="3720" w:type="dxa"/>
+                  <w:tcW w:w="5000" w:type="dxa"/>
                   <w:shd w:val="clear" w:color="auto" w:fill="E8EEF3"/>
                 </w:tcPr>
                 <w:p>
@@ -23102,37 +22853,7 @@
               </w:tc>
               <w:tc>
                 <w:tcPr>
-                  <w:tcW w:w="1860" w:type="dxa"/>
-                  <w:shd w:val="clear" w:color="auto" w:fill="E8EEF3"/>
-                </w:tcPr>
-                <w:p>
-                  <w:pPr>
-                    <w:bidi/>
-                    <w:spacing w:after="0" w:line="300" w:lineRule="auto"/>
-                    <w:jc w:val="start"/>
-                    <w:rPr>
-                      <w:rFonts w:ascii="Arial" w:hAnsi="Arial" w:cs="Arial"/>
-                      <w:sz w:val="19"/>
-                      <w:szCs w:val="19"/>
-                      <w:rtl/>
-                    </w:rPr>
-                  </w:pPr>
-                  <w:r>
-                    <w:rPr>
-                      <w:rFonts w:ascii="Arial" w:hAnsi="Arial" w:cs="Arial"/>
-                      <w:b/>
-                      <w:bCs/>
-                      <w:sz w:val="19"/>
-                      <w:szCs w:val="19"/>
-                      <w:rtl/>
-                    </w:rPr>
-                    <w:t xml:space="preserve">المكان</w:t>
-                  </w:r>
-                </w:p>
-              </w:tc>
-              <w:tc>
-                <w:tcPr>
-                  <w:tcW w:w="1468" w:type="dxa"/>
+                  <w:tcW w:w="2000" w:type="dxa"/>
                   <w:shd w:val="clear" w:color="auto" w:fill="E8EEF3"/>
                 </w:tcPr>
                 <w:p>
@@ -23167,7 +22888,7 @@
               </w:trPr>
               <w:tc>
                 <w:tcPr>
-                  <w:tcW w:w="2251" w:type="dxa"/>
+                  <w:tcW w:w="2300" w:type="dxa"/>
                 </w:tcPr>
                 <w:p>
                   <w:pPr>
@@ -23188,7 +22909,7 @@
                       <w:szCs w:val="19"/>
                       <w:rtl/>
                     </w:rPr>
-                    <w:t xml:space="preserve">أواخر أكتوبر – منتصف نوفمبر </w:t>
+                    <w:t xml:space="preserve">أكتوبر – نوفمبر </w:t>
                   </w:r>
                   <w:r>
                     <w:rPr>
@@ -23202,7 +22923,7 @@
               </w:tc>
               <w:tc>
                 <w:tcPr>
-                  <w:tcW w:w="3720" w:type="dxa"/>
+                  <w:tcW w:w="5000" w:type="dxa"/>
                 </w:tcPr>
                 <w:p>
                   <w:pPr>
@@ -23223,7 +22944,7 @@
                       <w:szCs w:val="19"/>
                       <w:rtl/>
                     </w:rPr>
-                    <w:t xml:space="preserve">اختبار أعمى: شخص آخر يكتب سيناريوهات لم نرها، ومحوّل بشري مستقل يعيد تحويل </w:t>
+                    <w:t xml:space="preserve">اختبار أعمى، ومحوّل بشري مستقل لـ</w:t>
                   </w:r>
                   <w:r>
                     <w:rPr>
@@ -23240,13 +22961,13 @@
                       <w:szCs w:val="19"/>
                       <w:rtl/>
                     </w:rPr>
-                    <w:t xml:space="preserve"> حوادث حقيقية من مصادرها فقط (حزمة جاهزة في المستودع)، وتُشغَّل مرة واحدة بكود مقفل</w:t>
+                    <w:t xml:space="preserve"> حوادث (الحزمة جاهزة)، ومراجعة مختص للأوزان</w:t>
                   </w:r>
                 </w:p>
               </w:tc>
               <w:tc>
                 <w:tcPr>
-                  <w:tcW w:w="1860" w:type="dxa"/>
+                  <w:tcW w:w="2000" w:type="dxa"/>
                 </w:tcPr>
                 <w:p>
                   <w:pPr>
@@ -23267,34 +22988,7 @@
                       <w:szCs w:val="19"/>
                       <w:rtl/>
                     </w:rPr>
-                    <w:t xml:space="preserve">المنزل والمدرسة</w:t>
-                  </w:r>
-                </w:p>
-              </w:tc>
-              <w:tc>
-                <w:tcPr>
-                  <w:tcW w:w="1468" w:type="dxa"/>
-                </w:tcPr>
-                <w:p>
-                  <w:pPr>
-                    <w:bidi/>
-                    <w:spacing w:after="0" w:line="300" w:lineRule="auto"/>
-                    <w:jc w:val="start"/>
-                    <w:rPr>
-                      <w:rFonts w:ascii="Arial" w:hAnsi="Arial" w:cs="Arial"/>
-                      <w:sz w:val="19"/>
-                      <w:szCs w:val="19"/>
-                      <w:rtl/>
-                    </w:rPr>
-                  </w:pPr>
-                  <w:r>
-                    <w:rPr>
-                      <w:rFonts w:ascii="Arial" w:hAnsi="Arial" w:cs="Arial"/>
-                      <w:sz w:val="19"/>
-                      <w:szCs w:val="19"/>
-                      <w:rtl/>
-                    </w:rPr>
-                    <w:t xml:space="preserve">موافقة المشرف، وكاتب مستقل</w:t>
+                    <w:t xml:space="preserve">المشرف، ومتطوعان</w:t>
                   </w:r>
                 </w:p>
               </w:tc>
@@ -23305,7 +22999,7 @@
               </w:trPr>
               <w:tc>
                 <w:tcPr>
-                  <w:tcW w:w="2251" w:type="dxa"/>
+                  <w:tcW w:w="2300" w:type="dxa"/>
                 </w:tcPr>
                 <w:p>
                   <w:pPr>
@@ -23340,7 +23034,7 @@
               </w:tc>
               <w:tc>
                 <w:tcPr>
-                  <w:tcW w:w="3720" w:type="dxa"/>
+                  <w:tcW w:w="5000" w:type="dxa"/>
                 </w:tcPr>
                 <w:p>
                   <w:pPr>
@@ -23361,13 +23055,123 @@
                       <w:szCs w:val="19"/>
                       <w:rtl/>
                     </w:rPr>
-                    <w:t xml:space="preserve">مراجعة مختص أمن سيبراني لافتراضات النموذج والأوزان</w:t>
+                    <w:t xml:space="preserve">أهداف مسجلة مسبقًا: </w:t>
+                  </w:r>
+                  <w:r>
+                    <w:rPr>
+                      <w:rFonts w:ascii="Arial" w:hAnsi="Arial" w:cs="Arial"/>
+                      <w:sz w:val="19"/>
+                      <w:szCs w:val="19"/>
+                    </w:rPr>
+                    <w:t xml:space="preserve">p95</w:t>
+                  </w:r>
+                  <w:r>
+                    <w:rPr>
+                      <w:rFonts w:ascii="Arial" w:hAnsi="Arial" w:cs="Arial"/>
+                      <w:sz w:val="19"/>
+                      <w:szCs w:val="19"/>
+                      <w:rtl/>
+                    </w:rPr>
+                    <w:t xml:space="preserve"> القطع &lt; </w:t>
+                  </w:r>
+                  <w:r>
+                    <w:rPr>
+                      <w:rFonts w:ascii="Arial" w:hAnsi="Arial" w:cs="Arial"/>
+                      <w:sz w:val="19"/>
+                      <w:szCs w:val="19"/>
+                    </w:rPr>
+                    <w:t xml:space="preserve">50</w:t>
+                  </w:r>
+                  <w:r>
+                    <w:rPr>
+                      <w:rFonts w:ascii="Arial" w:hAnsi="Arial" w:cs="Arial"/>
+                      <w:sz w:val="19"/>
+                      <w:szCs w:val="19"/>
+                      <w:rtl/>
+                    </w:rPr>
+                    <w:t xml:space="preserve"> مللي ثانية (</w:t>
+                  </w:r>
+                  <w:r>
+                    <w:rPr>
+                      <w:rFonts w:ascii="Arial" w:hAnsi="Arial" w:cs="Arial"/>
+                      <w:sz w:val="19"/>
+                      <w:szCs w:val="19"/>
+                    </w:rPr>
+                    <w:t xml:space="preserve">nftables sets)</w:t>
+                  </w:r>
+                  <w:r>
+                    <w:rPr>
+                      <w:rFonts w:ascii="Arial" w:hAnsi="Arial" w:cs="Arial"/>
+                      <w:sz w:val="19"/>
+                      <w:szCs w:val="19"/>
+                      <w:rtl/>
+                    </w:rPr>
+                    <w:t xml:space="preserve">، و</w:t>
+                  </w:r>
+                  <w:r>
+                    <w:rPr>
+                      <w:rFonts w:ascii="Arial" w:hAnsi="Arial" w:cs="Arial"/>
+                      <w:sz w:val="19"/>
+                      <w:szCs w:val="19"/>
+                    </w:rPr>
+                    <w:t xml:space="preserve">ML-DSA</w:t>
+                  </w:r>
+                  <w:r>
+                    <w:rPr>
+                      <w:rFonts w:ascii="Arial" w:hAnsi="Arial" w:cs="Arial"/>
+                      <w:sz w:val="19"/>
+                      <w:szCs w:val="19"/>
+                      <w:rtl/>
+                    </w:rPr>
+                    <w:t xml:space="preserve"> بلغة </w:t>
+                  </w:r>
+                  <w:r>
+                    <w:rPr>
+                      <w:rFonts w:ascii="Arial" w:hAnsi="Arial" w:cs="Arial"/>
+                      <w:sz w:val="19"/>
+                      <w:szCs w:val="19"/>
+                    </w:rPr>
+                    <w:t xml:space="preserve">C &lt; 50</w:t>
+                  </w:r>
+                  <w:r>
+                    <w:rPr>
+                      <w:rFonts w:ascii="Arial" w:hAnsi="Arial" w:cs="Arial"/>
+                      <w:sz w:val="19"/>
+                      <w:szCs w:val="19"/>
+                      <w:rtl/>
+                    </w:rPr>
+                    <w:t xml:space="preserve">، و</w:t>
+                  </w:r>
+                  <w:r>
+                    <w:rPr>
+                      <w:rFonts w:ascii="Arial" w:hAnsi="Arial" w:cs="Arial"/>
+                      <w:sz w:val="19"/>
+                      <w:szCs w:val="19"/>
+                    </w:rPr>
+                    <w:t xml:space="preserve">v12</w:t>
+                  </w:r>
+                  <w:r>
+                    <w:rPr>
+                      <w:rFonts w:ascii="Arial" w:hAnsi="Arial" w:cs="Arial"/>
+                      <w:sz w:val="19"/>
+                      <w:szCs w:val="19"/>
+                      <w:rtl/>
+                    </w:rPr>
+                    <w:t xml:space="preserve"> على المصنع ≥ </w:t>
+                  </w:r>
+                  <w:r>
+                    <w:rPr>
+                      <w:rFonts w:ascii="Arial" w:hAnsi="Arial" w:cs="Arial"/>
+                      <w:sz w:val="19"/>
+                      <w:szCs w:val="19"/>
+                    </w:rPr>
+                    <w:t xml:space="preserve">0.80</w:t>
                   </w:r>
                 </w:p>
               </w:tc>
               <w:tc>
                 <w:tcPr>
-                  <w:tcW w:w="1860" w:type="dxa"/>
+                  <w:tcW w:w="2000" w:type="dxa"/>
                 </w:tcPr>
                 <w:p>
                   <w:pPr>
@@ -23388,34 +23192,7 @@
                       <w:szCs w:val="19"/>
                       <w:rtl/>
                     </w:rPr>
-                    <w:t xml:space="preserve">عن بُعد</w:t>
-                  </w:r>
-                </w:p>
-              </w:tc>
-              <w:tc>
-                <w:tcPr>
-                  <w:tcW w:w="1468" w:type="dxa"/>
-                </w:tcPr>
-                <w:p>
-                  <w:pPr>
-                    <w:bidi/>
-                    <w:spacing w:after="0" w:line="300" w:lineRule="auto"/>
-                    <w:jc w:val="start"/>
-                    <w:rPr>
-                      <w:rFonts w:ascii="Arial" w:hAnsi="Arial" w:cs="Arial"/>
-                      <w:sz w:val="19"/>
-                      <w:szCs w:val="19"/>
-                      <w:rtl/>
-                    </w:rPr>
-                  </w:pPr>
-                  <w:r>
-                    <w:rPr>
-                      <w:rFonts w:ascii="Arial" w:hAnsi="Arial" w:cs="Arial"/>
-                      <w:sz w:val="19"/>
-                      <w:szCs w:val="19"/>
-                      <w:rtl/>
-                    </w:rPr>
-                    <w:t xml:space="preserve">مختص متطوع</w:t>
+                    <w:t xml:space="preserve">حاسوب شخصي</w:t>
                   </w:r>
                 </w:p>
               </w:tc>
@@ -23426,7 +23203,7 @@
               </w:trPr>
               <w:tc>
                 <w:tcPr>
-                  <w:tcW w:w="2251" w:type="dxa"/>
+                  <w:tcW w:w="2300" w:type="dxa"/>
                 </w:tcPr>
                 <w:p>
                   <w:pPr>
@@ -23445,9 +23222,17 @@
                       <w:rFonts w:ascii="Arial" w:hAnsi="Arial" w:cs="Arial"/>
                       <w:sz w:val="19"/>
                       <w:szCs w:val="19"/>
-                      <w:rtl/>
-                    </w:rPr>
-                    <w:t xml:space="preserve">نوفمبر </w:t>
+                    </w:rPr>
+                    <w:t xml:space="preserve">24–26</w:t>
+                  </w:r>
+                  <w:r>
+                    <w:rPr>
+                      <w:rFonts w:ascii="Arial" w:hAnsi="Arial" w:cs="Arial"/>
+                      <w:sz w:val="19"/>
+                      <w:szCs w:val="19"/>
+                      <w:rtl/>
+                    </w:rPr>
+                    <w:t xml:space="preserve"> نوفمبر </w:t>
                   </w:r>
                   <w:r>
                     <w:rPr>
@@ -23461,7 +23246,7 @@
               </w:tc>
               <w:tc>
                 <w:tcPr>
-                  <w:tcW w:w="3720" w:type="dxa"/>
+                  <w:tcW w:w="5000" w:type="dxa"/>
                 </w:tcPr>
                 <w:p>
                   <w:pPr>
@@ -23482,140 +23267,13 @@
                       <w:szCs w:val="19"/>
                       <w:rtl/>
                     </w:rPr>
-                    <w:t xml:space="preserve">تحسينات بأهداف مسجلة مسبقًا: قواعد مجمّعة (</w:t>
-                  </w:r>
-                  <w:r>
-                    <w:rPr>
-                      <w:rFonts w:ascii="Arial" w:hAnsi="Arial" w:cs="Arial"/>
-                      <w:sz w:val="19"/>
-                      <w:szCs w:val="19"/>
-                    </w:rPr>
-                    <w:t xml:space="preserve">nftables sets)</w:t>
-                  </w:r>
-                  <w:r>
-                    <w:rPr>
-                      <w:rFonts w:ascii="Arial" w:hAnsi="Arial" w:cs="Arial"/>
-                      <w:sz w:val="19"/>
-                      <w:szCs w:val="19"/>
-                      <w:rtl/>
-                    </w:rPr>
-                    <w:t xml:space="preserve"> لخفض </w:t>
-                  </w:r>
-                  <w:r>
-                    <w:rPr>
-                      <w:rFonts w:ascii="Arial" w:hAnsi="Arial" w:cs="Arial"/>
-                      <w:sz w:val="19"/>
-                      <w:szCs w:val="19"/>
-                    </w:rPr>
-                    <w:t xml:space="preserve">p95</w:t>
-                  </w:r>
-                  <w:r>
-                    <w:rPr>
-                      <w:rFonts w:ascii="Arial" w:hAnsi="Arial" w:cs="Arial"/>
-                      <w:sz w:val="19"/>
-                      <w:szCs w:val="19"/>
-                      <w:rtl/>
-                    </w:rPr>
-                    <w:t xml:space="preserve"> القطع إلى &lt; </w:t>
-                  </w:r>
-                  <w:r>
-                    <w:rPr>
-                      <w:rFonts w:ascii="Arial" w:hAnsi="Arial" w:cs="Arial"/>
-                      <w:sz w:val="19"/>
-                      <w:szCs w:val="19"/>
-                    </w:rPr>
-                    <w:t xml:space="preserve">50</w:t>
-                  </w:r>
-                  <w:r>
-                    <w:rPr>
-                      <w:rFonts w:ascii="Arial" w:hAnsi="Arial" w:cs="Arial"/>
-                      <w:sz w:val="19"/>
-                      <w:szCs w:val="19"/>
-                      <w:rtl/>
-                    </w:rPr>
-                    <w:t xml:space="preserve"> مللي ثانية، وتطبيق </w:t>
-                  </w:r>
-                  <w:r>
-                    <w:rPr>
-                      <w:rFonts w:ascii="Arial" w:hAnsi="Arial" w:cs="Arial"/>
-                      <w:sz w:val="19"/>
-                      <w:szCs w:val="19"/>
-                    </w:rPr>
-                    <w:t xml:space="preserve">ML-DSA</w:t>
-                  </w:r>
-                  <w:r>
-                    <w:rPr>
-                      <w:rFonts w:ascii="Arial" w:hAnsi="Arial" w:cs="Arial"/>
-                      <w:sz w:val="19"/>
-                      <w:szCs w:val="19"/>
-                      <w:rtl/>
-                    </w:rPr>
-                    <w:t xml:space="preserve"> بلغة </w:t>
-                  </w:r>
-                  <w:r>
-                    <w:rPr>
-                      <w:rFonts w:ascii="Arial" w:hAnsi="Arial" w:cs="Arial"/>
-                      <w:sz w:val="19"/>
-                      <w:szCs w:val="19"/>
-                    </w:rPr>
-                    <w:t xml:space="preserve">C</w:t>
-                  </w:r>
-                  <w:r>
-                    <w:rPr>
-                      <w:rFonts w:ascii="Arial" w:hAnsi="Arial" w:cs="Arial"/>
-                      <w:sz w:val="19"/>
-                      <w:szCs w:val="19"/>
-                      <w:rtl/>
-                    </w:rPr>
-                    <w:t xml:space="preserve"> لخفضه إلى &lt; </w:t>
-                  </w:r>
-                  <w:r>
-                    <w:rPr>
-                      <w:rFonts w:ascii="Arial" w:hAnsi="Arial" w:cs="Arial"/>
-                      <w:sz w:val="19"/>
-                      <w:szCs w:val="19"/>
-                    </w:rPr>
-                    <w:t xml:space="preserve">50</w:t>
-                  </w:r>
-                  <w:r>
-                    <w:rPr>
-                      <w:rFonts w:ascii="Arial" w:hAnsi="Arial" w:cs="Arial"/>
-                      <w:sz w:val="19"/>
-                      <w:szCs w:val="19"/>
-                      <w:rtl/>
-                    </w:rPr>
-                    <w:t xml:space="preserve">، وأرضية الأمان </w:t>
-                  </w:r>
-                  <w:r>
-                    <w:rPr>
-                      <w:rFonts w:ascii="Arial" w:hAnsi="Arial" w:cs="Arial"/>
-                      <w:sz w:val="19"/>
-                      <w:szCs w:val="19"/>
-                    </w:rPr>
-                    <w:t xml:space="preserve">v12</w:t>
-                  </w:r>
-                  <w:r>
-                    <w:rPr>
-                      <w:rFonts w:ascii="Arial" w:hAnsi="Arial" w:cs="Arial"/>
-                      <w:sz w:val="19"/>
-                      <w:szCs w:val="19"/>
-                      <w:rtl/>
-                    </w:rPr>
-                    <w:t xml:space="preserve"> على شبكة المصنع لرفع الاحتواء إلى ≥ </w:t>
-                  </w:r>
-                  <w:r>
-                    <w:rPr>
-                      <w:rFonts w:ascii="Arial" w:hAnsi="Arial" w:cs="Arial"/>
-                      <w:sz w:val="19"/>
-                      <w:szCs w:val="19"/>
-                    </w:rPr>
-                    <w:t xml:space="preserve">0.80</w:t>
+                    <w:t xml:space="preserve">عرض حي في سيف (الرياض)</w:t>
                   </w:r>
                 </w:p>
               </w:tc>
               <w:tc>
                 <w:tcPr>
-                  <w:tcW w:w="1860" w:type="dxa"/>
+                  <w:tcW w:w="2000" w:type="dxa"/>
                 </w:tcPr>
                 <w:p>
                   <w:pPr>
@@ -23636,34 +23294,7 @@
                       <w:szCs w:val="19"/>
                       <w:rtl/>
                     </w:rPr>
-                    <w:t xml:space="preserve">المنزل</w:t>
-                  </w:r>
-                </w:p>
-              </w:tc>
-              <w:tc>
-                <w:tcPr>
-                  <w:tcW w:w="1468" w:type="dxa"/>
-                </w:tcPr>
-                <w:p>
-                  <w:pPr>
-                    <w:bidi/>
-                    <w:spacing w:after="0" w:line="300" w:lineRule="auto"/>
-                    <w:jc w:val="start"/>
-                    <w:rPr>
-                      <w:rFonts w:ascii="Arial" w:hAnsi="Arial" w:cs="Arial"/>
-                      <w:sz w:val="19"/>
-                      <w:szCs w:val="19"/>
-                      <w:rtl/>
-                    </w:rPr>
-                  </w:pPr>
-                  <w:r>
-                    <w:rPr>
-                      <w:rFonts w:ascii="Arial" w:hAnsi="Arial" w:cs="Arial"/>
-                      <w:sz w:val="19"/>
-                      <w:szCs w:val="19"/>
-                      <w:rtl/>
-                    </w:rPr>
-                    <w:t xml:space="preserve">حاسوب شخصي</w:t>
+                    <w:t xml:space="preserve">حاسوبان</w:t>
                   </w:r>
                 </w:p>
               </w:tc>
@@ -23674,7 +23305,7 @@
               </w:trPr>
               <w:tc>
                 <w:tcPr>
-                  <w:tcW w:w="2251" w:type="dxa"/>
+                  <w:tcW w:w="2300" w:type="dxa"/>
                 </w:tcPr>
                 <w:p>
                   <w:pPr>
@@ -23693,17 +23324,9 @@
                       <w:rFonts w:ascii="Arial" w:hAnsi="Arial" w:cs="Arial"/>
                       <w:sz w:val="19"/>
                       <w:szCs w:val="19"/>
-                    </w:rPr>
-                    <w:t xml:space="preserve">24–26</w:t>
-                  </w:r>
-                  <w:r>
-                    <w:rPr>
-                      <w:rFonts w:ascii="Arial" w:hAnsi="Arial" w:cs="Arial"/>
-                      <w:sz w:val="19"/>
-                      <w:szCs w:val="19"/>
-                      <w:rtl/>
-                    </w:rPr>
-                    <w:t xml:space="preserve"> نوفمبر </w:t>
+                      <w:rtl/>
+                    </w:rPr>
+                    <w:t xml:space="preserve">ديسمبر </w:t>
                   </w:r>
                   <w:r>
                     <w:rPr>
@@ -23712,12 +23335,29 @@
                       <w:szCs w:val="19"/>
                     </w:rPr>
                     <w:t xml:space="preserve">2026</w:t>
+                  </w:r>
+                  <w:r>
+                    <w:rPr>
+                      <w:rFonts w:ascii="Arial" w:hAnsi="Arial" w:cs="Arial"/>
+                      <w:sz w:val="19"/>
+                      <w:szCs w:val="19"/>
+                      <w:rtl/>
+                    </w:rPr>
+                    <w:t xml:space="preserve"> – يناير </w:t>
+                  </w:r>
+                  <w:r>
+                    <w:rPr>
+                      <w:rFonts w:ascii="Arial" w:hAnsi="Arial" w:cs="Arial"/>
+                      <w:sz w:val="19"/>
+                      <w:szCs w:val="19"/>
+                    </w:rPr>
+                    <w:t xml:space="preserve">2027</w:t>
                   </w:r>
                 </w:p>
               </w:tc>
               <w:tc>
                 <w:tcPr>
-                  <w:tcW w:w="3720" w:type="dxa"/>
+                  <w:tcW w:w="5000" w:type="dxa"/>
                 </w:tcPr>
                 <w:p>
                   <w:pPr>
@@ -23738,13 +23378,30 @@
                       <w:szCs w:val="19"/>
                       <w:rtl/>
                     </w:rPr>
-                    <w:t xml:space="preserve">عرض حي في معرض سيف: هجوم ← قرار ← قطع المهاجم مع بقاء الخدمات</w:t>
+                    <w:t xml:space="preserve">بيانات شبكة عامة (</w:t>
+                  </w:r>
+                  <w:r>
+                    <w:rPr>
+                      <w:rFonts w:ascii="Arial" w:hAnsi="Arial" w:cs="Arial"/>
+                      <w:sz w:val="19"/>
+                      <w:szCs w:val="19"/>
+                    </w:rPr>
+                    <w:t xml:space="preserve">CIC-IDS2017)</w:t>
+                  </w:r>
+                  <w:r>
+                    <w:rPr>
+                      <w:rFonts w:ascii="Arial" w:hAnsi="Arial" w:cs="Arial"/>
+                      <w:sz w:val="19"/>
+                      <w:szCs w:val="19"/>
+                      <w:rtl/>
+                    </w:rPr>
+                    <w:t xml:space="preserve"> وكتابة الورقة</w:t>
                   </w:r>
                 </w:p>
               </w:tc>
               <w:tc>
                 <w:tcPr>
-                  <w:tcW w:w="1860" w:type="dxa"/>
+                  <w:tcW w:w="2000" w:type="dxa"/>
                 </w:tcPr>
                 <w:p>
                   <w:pPr>
@@ -23765,189 +23422,7 @@
                       <w:szCs w:val="19"/>
                       <w:rtl/>
                     </w:rPr>
-                    <w:t xml:space="preserve">مركز الرياض الدولي للمؤتمرات والمعارض</w:t>
-                  </w:r>
-                </w:p>
-              </w:tc>
-              <w:tc>
-                <w:tcPr>
-                  <w:tcW w:w="1468" w:type="dxa"/>
-                </w:tcPr>
-                <w:p>
-                  <w:pPr>
-                    <w:bidi/>
-                    <w:spacing w:after="0" w:line="300" w:lineRule="auto"/>
-                    <w:jc w:val="start"/>
-                    <w:rPr>
-                      <w:rFonts w:ascii="Arial" w:hAnsi="Arial" w:cs="Arial"/>
-                      <w:sz w:val="19"/>
-                      <w:szCs w:val="19"/>
-                      <w:rtl/>
-                    </w:rPr>
-                  </w:pPr>
-                  <w:r>
-                    <w:rPr>
-                      <w:rFonts w:ascii="Arial" w:hAnsi="Arial" w:cs="Arial"/>
-                      <w:sz w:val="19"/>
-                      <w:szCs w:val="19"/>
-                      <w:rtl/>
-                    </w:rPr>
-                    <w:t xml:space="preserve">حاسوبان محمولان</w:t>
-                  </w:r>
-                </w:p>
-              </w:tc>
-            </w:tr>
-            <w:tr>
-              <w:trPr>
-                <w:cantSplit/>
-              </w:trPr>
-              <w:tc>
-                <w:tcPr>
-                  <w:tcW w:w="2251" w:type="dxa"/>
-                </w:tcPr>
-                <w:p>
-                  <w:pPr>
-                    <w:bidi/>
-                    <w:spacing w:after="0" w:line="300" w:lineRule="auto"/>
-                    <w:jc w:val="start"/>
-                    <w:rPr>
-                      <w:rFonts w:ascii="Arial" w:hAnsi="Arial" w:cs="Arial"/>
-                      <w:sz w:val="19"/>
-                      <w:szCs w:val="19"/>
-                      <w:rtl/>
-                    </w:rPr>
-                  </w:pPr>
-                  <w:r>
-                    <w:rPr>
-                      <w:rFonts w:ascii="Arial" w:hAnsi="Arial" w:cs="Arial"/>
-                      <w:sz w:val="19"/>
-                      <w:szCs w:val="19"/>
-                      <w:rtl/>
-                    </w:rPr>
-                    <w:t xml:space="preserve">ديسمبر </w:t>
-                  </w:r>
-                  <w:r>
-                    <w:rPr>
-                      <w:rFonts w:ascii="Arial" w:hAnsi="Arial" w:cs="Arial"/>
-                      <w:sz w:val="19"/>
-                      <w:szCs w:val="19"/>
-                    </w:rPr>
-                    <w:t xml:space="preserve">2026</w:t>
-                  </w:r>
-                  <w:r>
-                    <w:rPr>
-                      <w:rFonts w:ascii="Arial" w:hAnsi="Arial" w:cs="Arial"/>
-                      <w:sz w:val="19"/>
-                      <w:szCs w:val="19"/>
-                      <w:rtl/>
-                    </w:rPr>
-                    <w:t xml:space="preserve"> – يناير </w:t>
-                  </w:r>
-                  <w:r>
-                    <w:rPr>
-                      <w:rFonts w:ascii="Arial" w:hAnsi="Arial" w:cs="Arial"/>
-                      <w:sz w:val="19"/>
-                      <w:szCs w:val="19"/>
-                    </w:rPr>
-                    <w:t xml:space="preserve">2027</w:t>
-                  </w:r>
-                </w:p>
-              </w:tc>
-              <w:tc>
-                <w:tcPr>
-                  <w:tcW w:w="3720" w:type="dxa"/>
-                </w:tcPr>
-                <w:p>
-                  <w:pPr>
-                    <w:bidi/>
-                    <w:spacing w:after="0" w:line="300" w:lineRule="auto"/>
-                    <w:jc w:val="start"/>
-                    <w:rPr>
-                      <w:rFonts w:ascii="Arial" w:hAnsi="Arial" w:cs="Arial"/>
-                      <w:sz w:val="19"/>
-                      <w:szCs w:val="19"/>
-                      <w:rtl/>
-                    </w:rPr>
-                  </w:pPr>
-                  <w:r>
-                    <w:rPr>
-                      <w:rFonts w:ascii="Arial" w:hAnsi="Arial" w:cs="Arial"/>
-                      <w:sz w:val="19"/>
-                      <w:szCs w:val="19"/>
-                      <w:rtl/>
-                    </w:rPr>
-                    <w:t xml:space="preserve">اختبار على بيانات شبكة حقيقية عامة (مثل </w:t>
-                  </w:r>
-                  <w:r>
-                    <w:rPr>
-                      <w:rFonts w:ascii="Arial" w:hAnsi="Arial" w:cs="Arial"/>
-                      <w:sz w:val="19"/>
-                      <w:szCs w:val="19"/>
-                    </w:rPr>
-                    <w:t xml:space="preserve">CIC-IDS2017)</w:t>
-                  </w:r>
-                  <w:r>
-                    <w:rPr>
-                      <w:rFonts w:ascii="Arial" w:hAnsi="Arial" w:cs="Arial"/>
-                      <w:sz w:val="19"/>
-                      <w:szCs w:val="19"/>
-                      <w:rtl/>
-                    </w:rPr>
-                    <w:t xml:space="preserve">، وكتابة الورقة البحثية</w:t>
-                  </w:r>
-                </w:p>
-              </w:tc>
-              <w:tc>
-                <w:tcPr>
-                  <w:tcW w:w="1860" w:type="dxa"/>
-                </w:tcPr>
-                <w:p>
-                  <w:pPr>
-                    <w:bidi/>
-                    <w:spacing w:after="0" w:line="300" w:lineRule="auto"/>
-                    <w:jc w:val="start"/>
-                    <w:rPr>
-                      <w:rFonts w:ascii="Arial" w:hAnsi="Arial" w:cs="Arial"/>
-                      <w:sz w:val="19"/>
-                      <w:szCs w:val="19"/>
-                      <w:rtl/>
-                    </w:rPr>
-                  </w:pPr>
-                  <w:r>
-                    <w:rPr>
-                      <w:rFonts w:ascii="Arial" w:hAnsi="Arial" w:cs="Arial"/>
-                      <w:sz w:val="19"/>
-                      <w:szCs w:val="19"/>
-                      <w:rtl/>
-                    </w:rPr>
-                    <w:t xml:space="preserve">المنزل</w:t>
-                  </w:r>
-                </w:p>
-              </w:tc>
-              <w:tc>
-                <w:tcPr>
-                  <w:tcW w:w="1468" w:type="dxa"/>
-                </w:tcPr>
-                <w:p>
-                  <w:pPr>
-                    <w:bidi/>
-                    <w:spacing w:after="0" w:line="300" w:lineRule="auto"/>
-                    <w:jc w:val="start"/>
-                    <w:rPr>
-                      <w:rFonts w:ascii="Arial" w:hAnsi="Arial" w:cs="Arial"/>
-                      <w:sz w:val="19"/>
-                      <w:szCs w:val="19"/>
-                      <w:rtl/>
-                    </w:rPr>
-                  </w:pPr>
-                  <w:r>
-                    <w:rPr>
-                      <w:rFonts w:ascii="Arial" w:hAnsi="Arial" w:cs="Arial"/>
-                      <w:sz w:val="19"/>
-                      <w:szCs w:val="19"/>
-                      <w:rtl/>
-                    </w:rPr>
-                    <w:t xml:space="preserve">المشرف، وحاسوب شخصي</w:t>
+                    <w:t xml:space="preserve">المشرف</w:t>
                   </w:r>
                 </w:p>
               </w:tc>
@@ -23981,11 +23456,574 @@
             <w:r>
               <w:rPr>
                 <w:rFonts w:ascii="Arial" w:hAnsi="Arial" w:cs="Arial"/>
-                <w:sz w:val="22"/>
-                <w:szCs w:val="22"/>
-                <w:rtl/>
-              </w:rPr>
-              <w:t xml:space="preserve">كل هدف جديد يُسجَّل مسبقًا قبل تجربته، وتُنشر نتيجته كما هي.</w:t>
+                <w:b/>
+                <w:bCs/>
+                <w:sz w:val="22"/>
+                <w:szCs w:val="22"/>
+                <w:rtl/>
+              </w:rPr>
+              <w:t xml:space="preserve">الخطط المستقبلية (كل هدف يُسجَّل مسبقًا قبل تشغيله):</w:t>
+            </w:r>
+          </w:p>
+          <w:p>
+            <w:pPr>
+              <w:bidi/>
+              <w:spacing w:after="60" w:line="300" w:lineRule="auto"/>
+              <w:ind w:start="340" w:hanging="340"/>
+              <w:jc w:val="both"/>
+              <w:rPr>
+                <w:rFonts w:ascii="Arial" w:hAnsi="Arial" w:cs="Arial"/>
+                <w:sz w:val="22"/>
+                <w:szCs w:val="22"/>
+                <w:rtl/>
+              </w:rPr>
+            </w:pPr>
+            <w:r>
+              <w:rPr>
+                <w:rFonts w:ascii="Arial" w:hAnsi="Arial" w:cs="Arial"/>
+                <w:sz w:val="22"/>
+                <w:szCs w:val="22"/>
+                <w:rtl/>
+              </w:rPr>
+              <w:t xml:space="preserve">–  </w:t>
+            </w:r>
+            <w:r>
+              <w:rPr>
+                <w:rFonts w:ascii="Arial" w:hAnsi="Arial" w:cs="Arial"/>
+                <w:b/>
+                <w:bCs/>
+                <w:sz w:val="22"/>
+                <w:szCs w:val="22"/>
+                <w:rtl/>
+              </w:rPr>
+              <w:t xml:space="preserve">مقاومة المهاجم الذكي:</w:t>
+            </w:r>
+            <w:r>
+              <w:rPr>
+                <w:rFonts w:ascii="Arial" w:hAnsi="Arial" w:cs="Arial"/>
+                <w:sz w:val="22"/>
+                <w:szCs w:val="22"/>
+                <w:rtl/>
+              </w:rPr>
+              <w:t xml:space="preserve"> مهاجم يعرف الكود ويزوّر مصادر التنبيه لعزل أنظمة سليمة (</w:t>
+            </w:r>
+            <w:r>
+              <w:rPr>
+                <w:rFonts w:ascii="Arial" w:hAnsi="Arial" w:cs="Arial"/>
+                <w:sz w:val="22"/>
+                <w:szCs w:val="22"/>
+              </w:rPr>
+              <w:t xml:space="preserve">Weaponization)</w:t>
+            </w:r>
+            <w:r>
+              <w:rPr>
+                <w:rFonts w:ascii="Arial" w:hAnsi="Arial" w:cs="Arial"/>
+                <w:sz w:val="22"/>
+                <w:szCs w:val="22"/>
+                <w:rtl/>
+              </w:rPr>
+              <w:t xml:space="preserve"> أو إخفاء جهاز مخترق (</w:t>
+            </w:r>
+            <w:r>
+              <w:rPr>
+                <w:rFonts w:ascii="Arial" w:hAnsi="Arial" w:cs="Arial"/>
+                <w:sz w:val="22"/>
+                <w:szCs w:val="22"/>
+              </w:rPr>
+              <w:t xml:space="preserve">Hiding)</w:t>
+            </w:r>
+            <w:r>
+              <w:rPr>
+                <w:rFonts w:ascii="Arial" w:hAnsi="Arial" w:cs="Arial"/>
+                <w:sz w:val="22"/>
+                <w:szCs w:val="22"/>
+                <w:rtl/>
+              </w:rPr>
+              <w:t xml:space="preserve">؛ نقارن خمس طرق لدمج ثلاثة مصادر لكل جهاز (</w:t>
+            </w:r>
+            <w:r>
+              <w:rPr>
+                <w:rFonts w:ascii="Arial" w:hAnsi="Arial" w:cs="Arial"/>
+                <w:sz w:val="22"/>
+                <w:szCs w:val="22"/>
+              </w:rPr>
+              <w:t xml:space="preserve">Sensor Fusion)</w:t>
+            </w:r>
+            <w:r>
+              <w:rPr>
+                <w:rFonts w:ascii="Arial" w:hAnsi="Arial" w:cs="Arial"/>
+                <w:sz w:val="22"/>
+                <w:szCs w:val="22"/>
+                <w:rtl/>
+              </w:rPr>
+              <w:t xml:space="preserve">، ونحسب لكل قرار «نصف القطر المضمون»: أقل عدد مصادر يلزم المهاجم تزويرها لتغيير القرار.</w:t>
+            </w:r>
+          </w:p>
+          <w:p>
+            <w:pPr>
+              <w:bidi/>
+              <w:spacing w:after="60" w:line="300" w:lineRule="auto"/>
+              <w:ind w:start="340" w:hanging="340"/>
+              <w:jc w:val="both"/>
+              <w:rPr>
+                <w:rFonts w:ascii="Arial" w:hAnsi="Arial" w:cs="Arial"/>
+                <w:sz w:val="22"/>
+                <w:szCs w:val="22"/>
+                <w:rtl/>
+              </w:rPr>
+            </w:pPr>
+            <w:r>
+              <w:rPr>
+                <w:rFonts w:ascii="Arial" w:hAnsi="Arial" w:cs="Arial"/>
+                <w:sz w:val="22"/>
+                <w:szCs w:val="22"/>
+                <w:rtl/>
+              </w:rPr>
+              <w:t xml:space="preserve">–  </w:t>
+            </w:r>
+            <w:r>
+              <w:rPr>
+                <w:rFonts w:ascii="Arial" w:hAnsi="Arial" w:cs="Arial"/>
+                <w:b/>
+                <w:bCs/>
+                <w:sz w:val="22"/>
+                <w:szCs w:val="22"/>
+                <w:rtl/>
+              </w:rPr>
+              <w:t xml:space="preserve">صياغة Γ-</w:t>
+            </w:r>
+            <w:r>
+              <w:rPr>
+                <w:rFonts w:ascii="Arial" w:hAnsi="Arial" w:cs="Arial"/>
+                <w:b/>
+                <w:bCs/>
+                <w:sz w:val="22"/>
+                <w:szCs w:val="22"/>
+              </w:rPr>
+              <w:t xml:space="preserve">robust</w:t>
+            </w:r>
+            <w:r>
+              <w:rPr>
+                <w:rFonts w:ascii="Arial" w:hAnsi="Arial" w:cs="Arial"/>
+                <w:b/>
+                <w:bCs/>
+                <w:sz w:val="22"/>
+                <w:szCs w:val="22"/>
+                <w:rtl/>
+              </w:rPr>
+              <w:t xml:space="preserve">:</w:t>
+            </w:r>
+            <w:r>
+              <w:rPr>
+                <w:rFonts w:ascii="Arial" w:hAnsi="Arial" w:cs="Arial"/>
+                <w:sz w:val="22"/>
+                <w:szCs w:val="22"/>
+                <w:rtl/>
+              </w:rPr>
+              <w:t xml:space="preserve"> المهاجم يتحكم في قراءات عدد محدد من الأجهزة، مع خسارة ثنائية الاتجاه تمنع «أسوأ حالة» من التحول إلى عزل مفرط يخدم المهاجم.</w:t>
+            </w:r>
+          </w:p>
+          <w:p>
+            <w:pPr>
+              <w:bidi/>
+              <w:spacing w:after="60" w:line="300" w:lineRule="auto"/>
+              <w:ind w:start="340" w:hanging="340"/>
+              <w:jc w:val="both"/>
+              <w:rPr>
+                <w:rFonts w:ascii="Arial" w:hAnsi="Arial" w:cs="Arial"/>
+                <w:sz w:val="22"/>
+                <w:szCs w:val="22"/>
+                <w:rtl/>
+              </w:rPr>
+            </w:pPr>
+            <w:r>
+              <w:rPr>
+                <w:rFonts w:ascii="Arial" w:hAnsi="Arial" w:cs="Arial"/>
+                <w:sz w:val="22"/>
+                <w:szCs w:val="22"/>
+                <w:rtl/>
+              </w:rPr>
+              <w:t xml:space="preserve">–  </w:t>
+            </w:r>
+            <w:r>
+              <w:rPr>
+                <w:rFonts w:ascii="Arial" w:hAnsi="Arial" w:cs="Arial"/>
+                <w:b/>
+                <w:bCs/>
+                <w:sz w:val="22"/>
+                <w:szCs w:val="22"/>
+                <w:rtl/>
+              </w:rPr>
+              <w:t xml:space="preserve">معماريتان كمّيتان:</w:t>
+            </w:r>
+            <w:r>
+              <w:rPr>
+                <w:rFonts w:ascii="Arial" w:hAnsi="Arial" w:cs="Arial"/>
+                <w:sz w:val="22"/>
+                <w:szCs w:val="22"/>
+                <w:rtl/>
+              </w:rPr>
+              <w:t xml:space="preserve"> الشبكة كاملة على </w:t>
+            </w:r>
+            <w:r>
+              <w:rPr>
+                <w:rFonts w:ascii="Arial" w:hAnsi="Arial" w:cs="Arial"/>
+                <w:sz w:val="22"/>
+                <w:szCs w:val="22"/>
+              </w:rPr>
+              <w:t xml:space="preserve">IBM Heron</w:t>
+            </w:r>
+            <w:r>
+              <w:rPr>
+                <w:rFonts w:ascii="Arial" w:hAnsi="Arial" w:cs="Arial"/>
+                <w:sz w:val="22"/>
+                <w:szCs w:val="22"/>
+                <w:rtl/>
+              </w:rPr>
+              <w:t xml:space="preserve"> بخوارزمية </w:t>
+            </w:r>
+            <w:r>
+              <w:rPr>
+                <w:rFonts w:ascii="Arial" w:hAnsi="Arial" w:cs="Arial"/>
+                <w:sz w:val="22"/>
+                <w:szCs w:val="22"/>
+              </w:rPr>
+              <w:t xml:space="preserve">QAOA</w:t>
+            </w:r>
+            <w:r>
+              <w:rPr>
+                <w:rFonts w:ascii="Arial" w:hAnsi="Arial" w:cs="Arial"/>
+                <w:sz w:val="22"/>
+                <w:szCs w:val="22"/>
+                <w:rtl/>
+              </w:rPr>
+              <w:t xml:space="preserve"> بقيود أصلية (</w:t>
+            </w:r>
+            <w:r>
+              <w:rPr>
+                <w:rFonts w:ascii="Arial" w:hAnsi="Arial" w:cs="Arial"/>
+                <w:sz w:val="22"/>
+                <w:szCs w:val="22"/>
+              </w:rPr>
+              <w:t xml:space="preserve">Fire Opal)</w:t>
+            </w:r>
+            <w:r>
+              <w:rPr>
+                <w:rFonts w:ascii="Arial" w:hAnsi="Arial" w:cs="Arial"/>
+                <w:sz w:val="22"/>
+                <w:szCs w:val="22"/>
+                <w:rtl/>
+              </w:rPr>
+              <w:t xml:space="preserve">، وعلى الذرات المحايدة بصياغة </w:t>
+            </w:r>
+            <w:r>
+              <w:rPr>
+                <w:rFonts w:ascii="Arial" w:hAnsi="Arial" w:cs="Arial"/>
+                <w:sz w:val="22"/>
+                <w:szCs w:val="22"/>
+              </w:rPr>
+              <w:t xml:space="preserve">MWIS</w:t>
+            </w:r>
+            <w:r>
+              <w:rPr>
+                <w:rFonts w:ascii="Arial" w:hAnsi="Arial" w:cs="Arial"/>
+                <w:sz w:val="22"/>
+                <w:szCs w:val="22"/>
+                <w:rtl/>
+              </w:rPr>
+              <w:t xml:space="preserve">، مع السعي لحاسوب أرامكو/</w:t>
+            </w:r>
+            <w:r>
+              <w:rPr>
+                <w:rFonts w:ascii="Arial" w:hAnsi="Arial" w:cs="Arial"/>
+                <w:sz w:val="22"/>
+                <w:szCs w:val="22"/>
+              </w:rPr>
+              <w:t xml:space="preserve">Pasqal</w:t>
+            </w:r>
+            <w:r>
+              <w:rPr>
+                <w:rFonts w:ascii="Arial" w:hAnsi="Arial" w:cs="Arial"/>
+                <w:sz w:val="22"/>
+                <w:szCs w:val="22"/>
+                <w:rtl/>
+              </w:rPr>
+              <w:t xml:space="preserve"> في المملكة.</w:t>
+            </w:r>
+          </w:p>
+          <w:p>
+            <w:pPr>
+              <w:bidi/>
+              <w:spacing w:after="60" w:line="300" w:lineRule="auto"/>
+              <w:ind w:start="340" w:hanging="340"/>
+              <w:jc w:val="both"/>
+              <w:rPr>
+                <w:rFonts w:ascii="Arial" w:hAnsi="Arial" w:cs="Arial"/>
+                <w:sz w:val="22"/>
+                <w:szCs w:val="22"/>
+                <w:rtl/>
+              </w:rPr>
+            </w:pPr>
+            <w:r>
+              <w:rPr>
+                <w:rFonts w:ascii="Arial" w:hAnsi="Arial" w:cs="Arial"/>
+                <w:sz w:val="22"/>
+                <w:szCs w:val="22"/>
+                <w:rtl/>
+              </w:rPr>
+              <w:t xml:space="preserve">–  </w:t>
+            </w:r>
+            <w:r>
+              <w:rPr>
+                <w:rFonts w:ascii="Arial" w:hAnsi="Arial" w:cs="Arial"/>
+                <w:b/>
+                <w:bCs/>
+                <w:sz w:val="22"/>
+                <w:szCs w:val="22"/>
+                <w:rtl/>
+              </w:rPr>
+              <w:t xml:space="preserve">الاحتواء التنبؤي:</w:t>
+            </w:r>
+            <w:r>
+              <w:rPr>
+                <w:rFonts w:ascii="Arial" w:hAnsi="Arial" w:cs="Arial"/>
+                <w:sz w:val="22"/>
+                <w:szCs w:val="22"/>
+                <w:rtl/>
+              </w:rPr>
+              <w:t xml:space="preserve"> قطع مسارات الهجوم المتوقعة قبل وصول المهاجم، وتحديث القرار عبر الزمن (</w:t>
+            </w:r>
+            <w:r>
+              <w:rPr>
+                <w:rFonts w:ascii="Arial" w:hAnsi="Arial" w:cs="Arial"/>
+                <w:sz w:val="22"/>
+                <w:szCs w:val="22"/>
+              </w:rPr>
+              <w:t xml:space="preserve">QUBO-MPC)</w:t>
+            </w:r>
+            <w:r>
+              <w:rPr>
+                <w:rFonts w:ascii="Arial" w:hAnsi="Arial" w:cs="Arial"/>
+                <w:sz w:val="22"/>
+                <w:szCs w:val="22"/>
+                <w:rtl/>
+              </w:rPr>
+              <w:t xml:space="preserve">، والتقييم على بيئة </w:t>
+            </w:r>
+            <w:r>
+              <w:rPr>
+                <w:rFonts w:ascii="Arial" w:hAnsi="Arial" w:cs="Arial"/>
+                <w:sz w:val="22"/>
+                <w:szCs w:val="22"/>
+              </w:rPr>
+              <w:t xml:space="preserve">CAGE 4</w:t>
+            </w:r>
+            <w:r>
+              <w:rPr>
+                <w:rFonts w:ascii="Arial" w:hAnsi="Arial" w:cs="Arial"/>
+                <w:sz w:val="22"/>
+                <w:szCs w:val="22"/>
+                <w:rtl/>
+              </w:rPr>
+              <w:t xml:space="preserve"> مقارنةً بالحلول الفائزة.</w:t>
+            </w:r>
+          </w:p>
+          <w:p>
+            <w:pPr>
+              <w:bidi/>
+              <w:spacing w:after="60" w:line="300" w:lineRule="auto"/>
+              <w:ind w:start="340" w:hanging="340"/>
+              <w:jc w:val="both"/>
+              <w:rPr>
+                <w:rFonts w:ascii="Arial" w:hAnsi="Arial" w:cs="Arial"/>
+                <w:sz w:val="22"/>
+                <w:szCs w:val="22"/>
+                <w:rtl/>
+              </w:rPr>
+            </w:pPr>
+            <w:r>
+              <w:rPr>
+                <w:rFonts w:ascii="Arial" w:hAnsi="Arial" w:cs="Arial"/>
+                <w:sz w:val="22"/>
+                <w:szCs w:val="22"/>
+                <w:rtl/>
+              </w:rPr>
+              <w:t xml:space="preserve">–  </w:t>
+            </w:r>
+            <w:r>
+              <w:rPr>
+                <w:rFonts w:ascii="Arial" w:hAnsi="Arial" w:cs="Arial"/>
+                <w:b/>
+                <w:bCs/>
+                <w:sz w:val="22"/>
+                <w:szCs w:val="22"/>
+              </w:rPr>
+              <w:t xml:space="preserve">ACRS Box</w:t>
+            </w:r>
+            <w:r>
+              <w:rPr>
+                <w:rFonts w:ascii="Arial" w:hAnsi="Arial" w:cs="Arial"/>
+                <w:b/>
+                <w:bCs/>
+                <w:sz w:val="22"/>
+                <w:szCs w:val="22"/>
+                <w:rtl/>
+              </w:rPr>
+              <w:t xml:space="preserve">:</w:t>
+            </w:r>
+            <w:r>
+              <w:rPr>
+                <w:rFonts w:ascii="Arial" w:hAnsi="Arial" w:cs="Arial"/>
+                <w:sz w:val="22"/>
+                <w:szCs w:val="22"/>
+                <w:rtl/>
+              </w:rPr>
+              <w:t xml:space="preserve"> </w:t>
+            </w:r>
+            <w:r>
+              <w:rPr>
+                <w:rFonts w:ascii="Arial" w:hAnsi="Arial" w:cs="Arial"/>
+                <w:sz w:val="22"/>
+                <w:szCs w:val="22"/>
+              </w:rPr>
+              <w:t xml:space="preserve">Raspberry Pi 5</w:t>
+            </w:r>
+            <w:r>
+              <w:rPr>
+                <w:rFonts w:ascii="Arial" w:hAnsi="Arial" w:cs="Arial"/>
+                <w:sz w:val="22"/>
+                <w:szCs w:val="22"/>
+                <w:rtl/>
+              </w:rPr>
+              <w:t xml:space="preserve"> بشاشة لمس وجدار </w:t>
+            </w:r>
+            <w:r>
+              <w:rPr>
+                <w:rFonts w:ascii="Arial" w:hAnsi="Arial" w:cs="Arial"/>
+                <w:sz w:val="22"/>
+                <w:szCs w:val="22"/>
+              </w:rPr>
+              <w:t xml:space="preserve">nftables</w:t>
+            </w:r>
+            <w:r>
+              <w:rPr>
+                <w:rFonts w:ascii="Arial" w:hAnsi="Arial" w:cs="Arial"/>
+                <w:sz w:val="22"/>
+                <w:szCs w:val="22"/>
+                <w:rtl/>
+              </w:rPr>
+              <w:t xml:space="preserve"> حقيقي، وثلاثة أجهزة ضحية </w:t>
+            </w:r>
+            <w:r>
+              <w:rPr>
+                <w:rFonts w:ascii="Arial" w:hAnsi="Arial" w:cs="Arial"/>
+                <w:sz w:val="22"/>
+                <w:szCs w:val="22"/>
+              </w:rPr>
+              <w:t xml:space="preserve">Pico W</w:t>
+            </w:r>
+            <w:r>
+              <w:rPr>
+                <w:rFonts w:ascii="Arial" w:hAnsi="Arial" w:cs="Arial"/>
+                <w:sz w:val="22"/>
+                <w:szCs w:val="22"/>
+                <w:rtl/>
+              </w:rPr>
+              <w:t xml:space="preserve">، وتوقيع </w:t>
+            </w:r>
+            <w:r>
+              <w:rPr>
+                <w:rFonts w:ascii="Arial" w:hAnsi="Arial" w:cs="Arial"/>
+                <w:sz w:val="22"/>
+                <w:szCs w:val="22"/>
+              </w:rPr>
+              <w:t xml:space="preserve">ML-DSA-65</w:t>
+            </w:r>
+            <w:r>
+              <w:rPr>
+                <w:rFonts w:ascii="Arial" w:hAnsi="Arial" w:cs="Arial"/>
+                <w:sz w:val="22"/>
+                <w:szCs w:val="22"/>
+                <w:rtl/>
+              </w:rPr>
+              <w:t xml:space="preserve">، في غلاف مقصوص بالليزر.</w:t>
+            </w:r>
+          </w:p>
+          <w:p>
+            <w:pPr>
+              <w:bidi/>
+              <w:spacing w:after="60" w:line="300" w:lineRule="auto"/>
+              <w:ind w:start="340" w:hanging="340"/>
+              <w:jc w:val="both"/>
+              <w:rPr>
+                <w:rFonts w:ascii="Arial" w:hAnsi="Arial" w:cs="Arial"/>
+                <w:sz w:val="22"/>
+                <w:szCs w:val="22"/>
+                <w:rtl/>
+              </w:rPr>
+            </w:pPr>
+            <w:r>
+              <w:rPr>
+                <w:rFonts w:ascii="Arial" w:hAnsi="Arial" w:cs="Arial"/>
+                <w:sz w:val="22"/>
+                <w:szCs w:val="22"/>
+                <w:rtl/>
+              </w:rPr>
+              <w:t xml:space="preserve">–  </w:t>
+            </w:r>
+            <w:r>
+              <w:rPr>
+                <w:rFonts w:ascii="Arial" w:hAnsi="Arial" w:cs="Arial"/>
+                <w:b/>
+                <w:bCs/>
+                <w:sz w:val="22"/>
+                <w:szCs w:val="22"/>
+                <w:rtl/>
+              </w:rPr>
+              <w:t xml:space="preserve">التحقق المستقل والنشر:</w:t>
+            </w:r>
+            <w:r>
+              <w:rPr>
+                <w:rFonts w:ascii="Arial" w:hAnsi="Arial" w:cs="Arial"/>
+                <w:sz w:val="22"/>
+                <w:szCs w:val="22"/>
+                <w:rtl/>
+              </w:rPr>
+              <w:t xml:space="preserve"> فريق </w:t>
+            </w:r>
+            <w:r>
+              <w:rPr>
+                <w:rFonts w:ascii="Arial" w:hAnsi="Arial" w:cs="Arial"/>
+                <w:sz w:val="22"/>
+                <w:szCs w:val="22"/>
+              </w:rPr>
+              <w:t xml:space="preserve">Red Team</w:t>
+            </w:r>
+            <w:r>
+              <w:rPr>
+                <w:rFonts w:ascii="Arial" w:hAnsi="Arial" w:cs="Arial"/>
+                <w:sz w:val="22"/>
+                <w:szCs w:val="22"/>
+                <w:rtl/>
+              </w:rPr>
+              <w:t xml:space="preserve">، ومراجعة أكاديمية، ونسخة </w:t>
+            </w:r>
+            <w:r>
+              <w:rPr>
+                <w:rFonts w:ascii="Arial" w:hAnsi="Arial" w:cs="Arial"/>
+                <w:sz w:val="22"/>
+                <w:szCs w:val="22"/>
+              </w:rPr>
+              <w:t xml:space="preserve">Zenodo DOI</w:t>
+            </w:r>
+            <w:r>
+              <w:rPr>
+                <w:rFonts w:ascii="Arial" w:hAnsi="Arial" w:cs="Arial"/>
+                <w:sz w:val="22"/>
+                <w:szCs w:val="22"/>
+                <w:rtl/>
+              </w:rPr>
+              <w:t xml:space="preserve">، وورقة أولية.</w:t>
             </w:r>
           </w:p>
         </w:tc>

</xml_diff>

<commit_message>
Ibdaa form v12: AI-use disclosure trimmed (booth-app line removed; ChatGPT/Codex and form-drafting kept in one short line each; stale ref-number note removed)
Co-Authored-By: Claude Opus 5.5 <noreply@anthropic.com>
Claude-Session: https://claude.ai/code/session_013B4LPWZWgdrx1XoL9LPLxx
</commit_message>
<xml_diff>
--- a/docs/qacrs/form_drafts/IBDAA_2027_FORM_ACRS_v12.docx
+++ b/docs/qacrs/form_drafts/IBDAA_2027_FORM_ACRS_v12.docx
@@ -25157,7 +25157,87 @@
                 <w:szCs w:val="22"/>
                 <w:rtl/>
               </w:rPr>
-              <w:t xml:space="preserve">–  صياغة مسودة هذا النموذج وتدقيقها لغويًا.</w:t>
+              <w:t xml:space="preserve">–  المساعدة في صياغة هذا النموذج.</w:t>
+            </w:r>
+          </w:p>
+          <w:p>
+            <w:pPr>
+              <w:bidi/>
+              <w:spacing w:after="100" w:line="300" w:lineRule="auto"/>
+              <w:jc w:val="both"/>
+              <w:rPr>
+                <w:rFonts w:ascii="Arial" w:hAnsi="Arial" w:cs="Arial"/>
+                <w:sz w:val="22"/>
+                <w:szCs w:val="22"/>
+                <w:rtl/>
+              </w:rPr>
+            </w:pPr>
+            <w:r>
+              <w:rPr>
+                <w:rFonts w:ascii="Arial" w:hAnsi="Arial" w:cs="Arial"/>
+                <w:sz w:val="22"/>
+                <w:szCs w:val="22"/>
+                <w:rtl/>
+              </w:rPr>
+              <w:t xml:space="preserve">واستُخدم </w:t>
+            </w:r>
+            <w:r>
+              <w:rPr>
+                <w:rFonts w:ascii="Arial" w:hAnsi="Arial" w:cs="Arial"/>
+                <w:sz w:val="22"/>
+                <w:szCs w:val="22"/>
+              </w:rPr>
+              <w:t xml:space="preserve">ChatGPT/Codex</w:t>
+            </w:r>
+            <w:r>
+              <w:rPr>
+                <w:rFonts w:ascii="Arial" w:hAnsi="Arial" w:cs="Arial"/>
+                <w:sz w:val="22"/>
+                <w:szCs w:val="22"/>
+                <w:rtl/>
+              </w:rPr>
+              <w:t xml:space="preserve"> (شركة </w:t>
+            </w:r>
+            <w:r>
+              <w:rPr>
+                <w:rFonts w:ascii="Arial" w:hAnsi="Arial" w:cs="Arial"/>
+                <w:sz w:val="22"/>
+                <w:szCs w:val="22"/>
+              </w:rPr>
+              <w:t xml:space="preserve">OpenAI)</w:t>
+            </w:r>
+            <w:r>
+              <w:rPr>
+                <w:rFonts w:ascii="Arial" w:hAnsi="Arial" w:cs="Arial"/>
+                <w:sz w:val="22"/>
+                <w:szCs w:val="22"/>
+                <w:rtl/>
+              </w:rPr>
+              <w:t xml:space="preserve"> مراجعًا مستقلًا للنص والكود.</w:t>
+            </w:r>
+          </w:p>
+          <w:p>
+            <w:pPr>
+              <w:bidi/>
+              <w:spacing w:after="100" w:line="300" w:lineRule="auto"/>
+              <w:jc w:val="both"/>
+              <w:rPr>
+                <w:rFonts w:ascii="Arial" w:hAnsi="Arial" w:cs="Arial"/>
+                <w:sz w:val="22"/>
+                <w:szCs w:val="22"/>
+                <w:rtl/>
+              </w:rPr>
+            </w:pPr>
+            <w:r>
+              <w:rPr>
+                <w:rFonts w:ascii="Arial" w:hAnsi="Arial" w:cs="Arial"/>
+                <w:b/>
+                <w:bCs/>
+                <w:sz w:val="22"/>
+                <w:szCs w:val="22"/>
+                <w:rtl/>
+              </w:rPr>
+              <w:t xml:space="preserve">أما الطالب فقام بـ:</w:t>
             </w:r>
           </w:p>
           <w:p>
@@ -25180,88 +25260,15 @@
                 <w:szCs w:val="22"/>
                 <w:rtl/>
               </w:rPr>
-              <w:t xml:space="preserve">–  بناء تطبيق العرض في المعرض.</w:t>
-            </w:r>
-          </w:p>
-          <w:p>
-            <w:pPr>
-              <w:bidi/>
-              <w:spacing w:after="100" w:line="300" w:lineRule="auto"/>
-              <w:jc w:val="both"/>
-              <w:rPr>
-                <w:rFonts w:ascii="Arial" w:hAnsi="Arial" w:cs="Arial"/>
-                <w:sz w:val="22"/>
-                <w:szCs w:val="22"/>
-                <w:rtl/>
-              </w:rPr>
-            </w:pPr>
-            <w:r>
-              <w:rPr>
-                <w:rFonts w:ascii="Arial" w:hAnsi="Arial" w:cs="Arial"/>
-                <w:sz w:val="22"/>
-                <w:szCs w:val="22"/>
-                <w:rtl/>
-              </w:rPr>
-              <w:t xml:space="preserve">واستُخدم </w:t>
-            </w:r>
-            <w:r>
-              <w:rPr>
-                <w:rFonts w:ascii="Arial" w:hAnsi="Arial" w:cs="Arial"/>
-                <w:sz w:val="22"/>
-                <w:szCs w:val="22"/>
-              </w:rPr>
-              <w:t xml:space="preserve">ChatGPT/Codex</w:t>
-            </w:r>
-            <w:r>
-              <w:rPr>
-                <w:rFonts w:ascii="Arial" w:hAnsi="Arial" w:cs="Arial"/>
-                <w:sz w:val="22"/>
-                <w:szCs w:val="22"/>
-                <w:rtl/>
-              </w:rPr>
-              <w:t xml:space="preserve"> (شركة </w:t>
-            </w:r>
-            <w:r>
-              <w:rPr>
-                <w:rFonts w:ascii="Arial" w:hAnsi="Arial" w:cs="Arial"/>
-                <w:sz w:val="22"/>
-                <w:szCs w:val="22"/>
-              </w:rPr>
-              <w:t xml:space="preserve">OpenAI)</w:t>
-            </w:r>
-            <w:r>
-              <w:rPr>
-                <w:rFonts w:ascii="Arial" w:hAnsi="Arial" w:cs="Arial"/>
-                <w:sz w:val="22"/>
-                <w:szCs w:val="22"/>
-                <w:rtl/>
-              </w:rPr>
-              <w:t xml:space="preserve"> مراجعًا مستقلًا لنص النموذج والمراجع، ولمراجعة طلبات الدمج في </w:t>
-            </w:r>
-            <w:r>
-              <w:rPr>
-                <w:rFonts w:ascii="Arial" w:hAnsi="Arial" w:cs="Arial"/>
-                <w:sz w:val="22"/>
-                <w:szCs w:val="22"/>
-              </w:rPr>
-              <w:t xml:space="preserve">GitHub</w:t>
-            </w:r>
-            <w:r>
-              <w:rPr>
-                <w:rFonts w:ascii="Arial" w:hAnsi="Arial" w:cs="Arial"/>
-                <w:sz w:val="22"/>
-                <w:szCs w:val="22"/>
-                <w:rtl/>
-              </w:rPr>
-              <w:t xml:space="preserve">، ونبّه إلى تصحيح أرقام المرجع </w:t>
-            </w:r>
-            <w:r>
-              <w:rPr>
-                <w:rFonts w:ascii="Arial" w:hAnsi="Arial" w:cs="Arial"/>
-                <w:sz w:val="22"/>
-                <w:szCs w:val="22"/>
-              </w:rPr>
-              <w:t xml:space="preserve">[2]</w:t>
+              <w:t xml:space="preserve">–  فكرة المشروع، وبناء النسخة الأولى من </w:t>
+            </w:r>
+            <w:r>
+              <w:rPr>
+                <w:rFonts w:ascii="Arial" w:hAnsi="Arial" w:cs="Arial"/>
+                <w:sz w:val="22"/>
+                <w:szCs w:val="22"/>
+              </w:rPr>
+              <w:t xml:space="preserve">ACRS</w:t>
             </w:r>
             <w:r>
               <w:rPr>
@@ -25271,30 +25278,6 @@
                 <w:rtl/>
               </w:rPr>
               <w:t xml:space="preserve">.</w:t>
-            </w:r>
-          </w:p>
-          <w:p>
-            <w:pPr>
-              <w:bidi/>
-              <w:spacing w:after="100" w:line="300" w:lineRule="auto"/>
-              <w:jc w:val="both"/>
-              <w:rPr>
-                <w:rFonts w:ascii="Arial" w:hAnsi="Arial" w:cs="Arial"/>
-                <w:sz w:val="22"/>
-                <w:szCs w:val="22"/>
-                <w:rtl/>
-              </w:rPr>
-            </w:pPr>
-            <w:r>
-              <w:rPr>
-                <w:rFonts w:ascii="Arial" w:hAnsi="Arial" w:cs="Arial"/>
-                <w:b/>
-                <w:bCs/>
-                <w:sz w:val="22"/>
-                <w:szCs w:val="22"/>
-                <w:rtl/>
-              </w:rPr>
-              <w:t xml:space="preserve">أما الطالب فقام بـ:</w:t>
             </w:r>
           </w:p>
           <w:p>
@@ -25317,47 +25300,7 @@
                 <w:szCs w:val="22"/>
                 <w:rtl/>
               </w:rPr>
-              <w:t xml:space="preserve">–  فكرة المشروع، وبناء النسخة الأولى من </w:t>
-            </w:r>
-            <w:r>
-              <w:rPr>
-                <w:rFonts w:ascii="Arial" w:hAnsi="Arial" w:cs="Arial"/>
-                <w:sz w:val="22"/>
-                <w:szCs w:val="22"/>
-              </w:rPr>
-              <w:t xml:space="preserve">ACRS</w:t>
-            </w:r>
-            <w:r>
-              <w:rPr>
-                <w:rFonts w:ascii="Arial" w:hAnsi="Arial" w:cs="Arial"/>
-                <w:sz w:val="22"/>
-                <w:szCs w:val="22"/>
-                <w:rtl/>
-              </w:rPr>
-              <w:t xml:space="preserve">.</w:t>
-            </w:r>
-          </w:p>
-          <w:p>
-            <w:pPr>
-              <w:bidi/>
-              <w:spacing w:after="60" w:line="300" w:lineRule="auto"/>
-              <w:ind w:start="340" w:hanging="340"/>
-              <w:jc w:val="both"/>
-              <w:rPr>
-                <w:rFonts w:ascii="Arial" w:hAnsi="Arial" w:cs="Arial"/>
-                <w:sz w:val="22"/>
-                <w:szCs w:val="22"/>
-                <w:rtl/>
-              </w:rPr>
-            </w:pPr>
-            <w:r>
-              <w:rPr>
-                <w:rFonts w:ascii="Arial" w:hAnsi="Arial" w:cs="Arial"/>
-                <w:sz w:val="22"/>
-                <w:szCs w:val="22"/>
-                <w:rtl/>
-              </w:rPr>
-              <w:t xml:space="preserve">–  القرارات البحثية، ومنها عدم تغيير الأوزان ونشر النتائج الفاشلة كما هي.</w:t>
+              <w:t xml:space="preserve">–  القرارات البحثية، ومنها عدم تغيير الأوزان ونشر كل النتائج كما هي.</w:t>
             </w:r>
           </w:p>
           <w:p>

</xml_diff>